<commit_message>
docs: finaliza charter e data summary report do TP2
</commit_message>
<xml_diff>
--- a/docs/project_charter_solargap.docx
+++ b/docs/project_charter_solargap.docx
@@ -67,7 +67,7 @@
           <w:sz w:val="18"/>
           <w:szCs w:val="18"/>
         </w:rPr>
-        <w:t>TP1 — Inteligência Artificial Aplicada à Ciência de Dados  |  Pâmela Lima Ziliotto  |  17/08/2026</w:t>
+        <w:t>TP2 — Inteligência Artificial Aplicada à Ciência de Dados  |  Pâmela Lima Ziliotto  |  Atualizado em 22/09/2026</w:t>
       </w:r>
     </w:p>
     <w:p>
@@ -114,7 +114,7 @@
           <w:sz w:val="22"/>
           <w:szCs w:val="22"/>
         </w:rPr>
-        <w:t>A ideia do SolarGab Brasil surgiu de conversas recorrentes com um amigo que atua há anos no setor de energia solar. Um aspecto dessas conversas sempre chamou atenção: uma empresa de pequeno porte, sediada no interior do Rio Grande do Sul, atende clientes em todo o país. Esse alcance sugere que a demanda por geração solar distribuída não segue necessariamente a geografia dos grandes centros e que pode haver mercados pouco explorados em regiões que raramente aparecerem no debate.</w:t>
+        <w:t>A ideia do SolarGap Brasil surgiu de conversas recorrentes com um amigo que atua há anos no setor de energia solar. Um aspecto dessas conversas sempre chamou atenção: uma empresa de pequeno porte, sediada no interior do Rio Grande do Sul, atende clientes em todo o país. Esse alcance sugere que a demanda por geração solar distribuída não segue necessariamente a geografia dos grandes centros e que pode haver mercados pouco explorados em regiões que raramente aparecem no debate.</w:t>
       </w:r>
     </w:p>
     <w:p>
@@ -147,7 +147,7 @@
           <w:sz w:val="22"/>
           <w:szCs w:val="22"/>
         </w:rPr>
-        <w:t>O tema também se conectar ao ODS 7 (Energia Limpa e Acessível), um dos eixos propostos pela disciplina. Outra influência vem de um período vivendo na Europa, onde é comum ver propriedades fora das grandes cidades com geração solar própria. Nesse contexto, discussões como a da iniciativa Desertec, que propôs grandes usinas solares no Saara, ilustram um ponto central para este projeto: abundância de sol e viabilidade técnica não bastam. A expansão da energia limpa depende de planejamento, infraestrutura e de onde a demanda efetivamente está.</w:t>
+        <w:t>O tema também se conecta ao ODS 7 (Energia Limpa e Acessível), um dos eixos propostos pela disciplina e detalhado na seção 4. Outra influência vem de um período vivendo na Europa, onde é comum ver propriedades fora das grandes cidades com geração solar própria. Nesse contexto, discussões como a da iniciativa Desertec, que propôs grandes usinas solares no Saara, ilustram um ponto central para este projeto: abundância de sol e viabilidade técnica não bastam. A expansão da energia limpa depende de planejamento, infraestrutura e de onde a demanda efetivamente está.</w:t>
       </w:r>
     </w:p>
     <w:p>
@@ -180,7 +180,7 @@
           <w:sz w:val="22"/>
           <w:szCs w:val="22"/>
         </w:rPr>
-        <w:t>O projeto parte da premissa de que políticas públicas isoladas têm alcance limitado. A adoção em escala se sustenta quando a energia limpa também é economicamente atrativa para empresas e consumidores. Por isso o SolarGab Brasil busca identificar lacunas regionais na adoção de geração solar distribuída. Essa informação pode ajudar a direcionar incentivos governamentais e também mostrar ao mercado onde há espaço para crescer.</w:t>
+        <w:t>O projeto parte da premissa de que políticas públicas isoladas têm alcance limitado. A adoção em escala se sustenta quando a energia limpa também é economicamente atrativa para empresas e consumidores. Por isso, o SolarGap Brasil busca identificar lacunas regionais na adoção de geração solar distribuída. Essa informação pode ajudar a direcionar incentivos governamentais e também mostrar ao mercado onde há espaço para crescer.</w:t>
       </w:r>
     </w:p>
     <w:p>
@@ -261,7 +261,23 @@
           <w:sz w:val="22"/>
           <w:szCs w:val="22"/>
         </w:rPr>
-        <w:t>Até o fim do TP1, mapear a distribuição de potência instalada em geração distribuída solar nos 27 estados brasileiros, normalizada por população, identificando os 5 estados com menor taxa de adoção per capita — com atualização dos dados em base mensal ao longo do semestre.</w:t>
+        <w:t xml:space="preserve">Mapear e quantificar a disparidade regional na adoção de geração solar distribuída nos 27 estados brasileiros, normalizada por população, identificando os estados que lideram, os que ficam para trás e aqueles com potencial de mercado ainda não explorado.</w:t>
+      </w:r>
+    </w:p>
+    <w:p>
+      <w:pPr>
+        <w:pStyle w:val="Normal"/>
+        <w:spacing w:lineRule="auto" w:line="300" w:before="0" w:after="160"/>
+        <w:rPr/>
+      </w:pPr>
+      <w:r>
+        <w:rPr>
+          <w:i w:val="false"/>
+          <w:iCs w:val="false"/>
+          <w:sz w:val="22"/>
+          <w:szCs w:val="22"/>
+        </w:rPr>
+        <w:t xml:space="preserve">No TP2, esse objetivo foi atingido para o recorte estadual: o dashboard apresenta o ranking das 27 UFs em quatro métricas, com os dados tratados, corrigidos e validados contra o painel oficial da ANEEL. O pipeline é reprodutível de ponta a ponta: cada nova publicação mensal da ANEEL é incorporada executando novamente os scripts de coleta e das camadas Silver e Gold.</w:t>
       </w:r>
     </w:p>
     <w:p>
@@ -275,6 +291,1028 @@
           <w:color w:val="595959"/>
         </w:rPr>
         <w:t>Indicadores de Sucesso (KPIs)</w:t>
+      </w:r>
+    </w:p>
+    <w:tbl>
+      <w:tblPr>
+        <w:tblW w:w="9360" w:type="dxa"/>
+        <w:jc w:val="start"/>
+        <w:tblInd w:w="0" w:type="dxa"/>
+        <w:tblLayout w:type="fixed"/>
+        <w:tblCellMar>
+          <w:top w:w="100" w:type="dxa"/>
+          <w:start w:w="120" w:type="dxa"/>
+          <w:bottom w:w="100" w:type="dxa"/>
+          <w:end w:w="120" w:type="dxa"/>
+        </w:tblCellMar>
+      </w:tblPr>
+      <w:tblGrid>
+        <w:gridCol w:w="2400"/>
+        <w:gridCol w:w="4560"/>
+        <w:gridCol w:w="2400"/>
+      </w:tblGrid>
+      <w:tr>
+        <w:trPr>
+          <w:tblHeader w:val="true"/>
+          <w:cantSplit w:val="true"/>
+        </w:trPr>
+        <w:tc>
+          <w:tcPr>
+            <w:tcW w:w="2400" w:type="dxa"/>
+            <w:tcBorders>
+              <w:top w:val="single" w:sz="4" w:space="0" w:color="000000"/>
+              <w:start w:val="single" w:sz="4" w:space="0" w:color="000000"/>
+              <w:bottom w:val="single" w:sz="4" w:space="0" w:color="000000"/>
+              <w:end w:val="single" w:sz="4" w:space="0" w:color="000000"/>
+            </w:tcBorders>
+            <w:shd w:fill="2E7D32" w:val="clear"/>
+          </w:tcPr>
+          <w:p>
+            <w:pPr>
+              <w:pStyle w:val="Normal"/>
+              <w:jc w:val="start"/>
+              <w:rPr/>
+            </w:pPr>
+            <w:r>
+              <w:rPr>
+                <w:b/>
+                <w:bCs/>
+                <w:color w:val="FFFFFF"/>
+                <w:sz w:val="21"/>
+                <w:szCs w:val="21"/>
+              </w:rPr>
+              <w:t xml:space="preserve">Indicador</w:t>
+            </w:r>
+          </w:p>
+        </w:tc>
+        <w:tc>
+          <w:tcPr>
+            <w:tcW w:w="4560" w:type="dxa"/>
+            <w:tcBorders>
+              <w:top w:val="single" w:sz="4" w:space="0" w:color="000000"/>
+              <w:start w:val="single" w:sz="4" w:space="0" w:color="000000"/>
+              <w:bottom w:val="single" w:sz="4" w:space="0" w:color="000000"/>
+              <w:end w:val="single" w:sz="4" w:space="0" w:color="000000"/>
+            </w:tcBorders>
+            <w:shd w:fill="2E7D32" w:val="clear"/>
+          </w:tcPr>
+          <w:p>
+            <w:pPr>
+              <w:pStyle w:val="Normal"/>
+              <w:jc w:val="start"/>
+              <w:rPr/>
+            </w:pPr>
+            <w:r>
+              <w:rPr>
+                <w:b/>
+                <w:bCs/>
+                <w:color w:val="FFFFFF"/>
+                <w:sz w:val="21"/>
+                <w:szCs w:val="21"/>
+              </w:rPr>
+              <w:t xml:space="preserve">Definição</w:t>
+            </w:r>
+          </w:p>
+        </w:tc>
+        <w:tc>
+          <w:tcPr>
+            <w:tcW w:w="2400" w:type="dxa"/>
+            <w:tcBorders>
+              <w:top w:val="single" w:sz="4" w:space="0" w:color="000000"/>
+              <w:start w:val="single" w:sz="4" w:space="0" w:color="000000"/>
+              <w:bottom w:val="single" w:sz="4" w:space="0" w:color="000000"/>
+              <w:end w:val="single" w:sz="4" w:space="0" w:color="000000"/>
+            </w:tcBorders>
+            <w:shd w:fill="2E7D32" w:val="clear"/>
+          </w:tcPr>
+          <w:p>
+            <w:pPr>
+              <w:pStyle w:val="Normal"/>
+              <w:jc w:val="start"/>
+              <w:rPr/>
+            </w:pPr>
+            <w:r>
+              <w:rPr>
+                <w:b/>
+                <w:bCs/>
+                <w:color w:val="FFFFFF"/>
+                <w:sz w:val="21"/>
+                <w:szCs w:val="21"/>
+              </w:rPr>
+              <w:t xml:space="preserve">Situação no TP2</w:t>
+            </w:r>
+          </w:p>
+        </w:tc>
+      </w:tr>
+      <w:tr>
+        <w:trPr>
+          <w:cantSplit w:val="true"/>
+        </w:trPr>
+        <w:tc>
+          <w:tcPr>
+            <w:tcW w:w="2400" w:type="dxa"/>
+            <w:tcBorders>
+              <w:top w:val="single" w:sz="4" w:space="0" w:color="000000"/>
+              <w:start w:val="single" w:sz="4" w:space="0" w:color="000000"/>
+              <w:bottom w:val="single" w:sz="4" w:space="0" w:color="000000"/>
+              <w:end w:val="single" w:sz="4" w:space="0" w:color="000000"/>
+            </w:tcBorders>
+            <w:shd w:fill="F2F2F2" w:val="clear"/>
+          </w:tcPr>
+          <w:p>
+            <w:pPr>
+              <w:pStyle w:val="Normal"/>
+              <w:jc w:val="start"/>
+              <w:rPr/>
+            </w:pPr>
+            <w:r>
+              <w:rPr>
+                <w:b w:val="false"/>
+                <w:bCs w:val="false"/>
+                <w:color w:val="000000"/>
+                <w:sz w:val="21"/>
+                <w:szCs w:val="21"/>
+              </w:rPr>
+              <w:t xml:space="preserve">Watts por habitante</w:t>
+            </w:r>
+          </w:p>
+        </w:tc>
+        <w:tc>
+          <w:tcPr>
+            <w:tcW w:w="4560" w:type="dxa"/>
+            <w:tcBorders>
+              <w:top w:val="single" w:sz="4" w:space="0" w:color="000000"/>
+              <w:start w:val="single" w:sz="4" w:space="0" w:color="000000"/>
+              <w:bottom w:val="single" w:sz="4" w:space="0" w:color="000000"/>
+              <w:end w:val="single" w:sz="4" w:space="0" w:color="000000"/>
+            </w:tcBorders>
+            <w:shd w:fill="F2F2F2" w:val="clear"/>
+          </w:tcPr>
+          <w:p>
+            <w:pPr>
+              <w:pStyle w:val="Normal"/>
+              <w:jc w:val="start"/>
+              <w:rPr/>
+            </w:pPr>
+            <w:r>
+              <w:rPr>
+                <w:b w:val="false"/>
+                <w:bCs w:val="false"/>
+                <w:color w:val="000000"/>
+                <w:sz w:val="21"/>
+                <w:szCs w:val="21"/>
+              </w:rPr>
+              <w:t xml:space="preserve">Potência solar instalada (W) dividida pela população do Censo 2022, por estado. Métrica per capita principal.</w:t>
+            </w:r>
+          </w:p>
+        </w:tc>
+        <w:tc>
+          <w:tcPr>
+            <w:tcW w:w="2400" w:type="dxa"/>
+            <w:tcBorders>
+              <w:top w:val="single" w:sz="4" w:space="0" w:color="000000"/>
+              <w:start w:val="single" w:sz="4" w:space="0" w:color="000000"/>
+              <w:bottom w:val="single" w:sz="4" w:space="0" w:color="000000"/>
+              <w:end w:val="single" w:sz="4" w:space="0" w:color="000000"/>
+            </w:tcBorders>
+            <w:shd w:fill="F2F2F2" w:val="clear"/>
+          </w:tcPr>
+          <w:p>
+            <w:pPr>
+              <w:pStyle w:val="Normal"/>
+              <w:jc w:val="start"/>
+              <w:rPr/>
+            </w:pPr>
+            <w:r>
+              <w:rPr>
+                <w:b w:val="false"/>
+                <w:bCs w:val="false"/>
+                <w:color w:val="000000"/>
+                <w:sz w:val="21"/>
+                <w:szCs w:val="21"/>
+              </w:rPr>
+              <w:t xml:space="preserve">Implementado — aba Panorama</w:t>
+            </w:r>
+          </w:p>
+        </w:tc>
+      </w:tr>
+      <w:tr>
+        <w:trPr>
+          <w:cantSplit w:val="true"/>
+        </w:trPr>
+        <w:tc>
+          <w:tcPr>
+            <w:tcW w:w="2400" w:type="dxa"/>
+            <w:tcBorders>
+              <w:top w:val="single" w:sz="4" w:space="0" w:color="000000"/>
+              <w:start w:val="single" w:sz="4" w:space="0" w:color="000000"/>
+              <w:bottom w:val="single" w:sz="4" w:space="0" w:color="000000"/>
+              <w:end w:val="single" w:sz="4" w:space="0" w:color="000000"/>
+            </w:tcBorders>
+          </w:tcPr>
+          <w:p>
+            <w:pPr>
+              <w:pStyle w:val="Normal"/>
+              <w:jc w:val="start"/>
+              <w:rPr/>
+            </w:pPr>
+            <w:r>
+              <w:rPr>
+                <w:b w:val="false"/>
+                <w:bCs w:val="false"/>
+                <w:color w:val="000000"/>
+                <w:sz w:val="21"/>
+                <w:szCs w:val="21"/>
+              </w:rPr>
+              <w:t xml:space="preserve">Empreendimentos por 100 mil habitantes</w:t>
+            </w:r>
+          </w:p>
+        </w:tc>
+        <w:tc>
+          <w:tcPr>
+            <w:tcW w:w="4560" w:type="dxa"/>
+            <w:tcBorders>
+              <w:top w:val="single" w:sz="4" w:space="0" w:color="000000"/>
+              <w:start w:val="single" w:sz="4" w:space="0" w:color="000000"/>
+              <w:bottom w:val="single" w:sz="4" w:space="0" w:color="000000"/>
+              <w:end w:val="single" w:sz="4" w:space="0" w:color="000000"/>
+            </w:tcBorders>
+          </w:tcPr>
+          <w:p>
+            <w:pPr>
+              <w:pStyle w:val="Normal"/>
+              <w:jc w:val="start"/>
+              <w:rPr/>
+            </w:pPr>
+            <w:r>
+              <w:rPr>
+                <w:b w:val="false"/>
+                <w:bCs w:val="false"/>
+                <w:color w:val="000000"/>
+                <w:sz w:val="21"/>
+                <w:szCs w:val="21"/>
+              </w:rPr>
+              <w:t xml:space="preserve">Sistemas conectados por 100 mil habitantes. Mede difusão; a potência mede volume investido.</w:t>
+            </w:r>
+          </w:p>
+        </w:tc>
+        <w:tc>
+          <w:tcPr>
+            <w:tcW w:w="2400" w:type="dxa"/>
+            <w:tcBorders>
+              <w:top w:val="single" w:sz="4" w:space="0" w:color="000000"/>
+              <w:start w:val="single" w:sz="4" w:space="0" w:color="000000"/>
+              <w:bottom w:val="single" w:sz="4" w:space="0" w:color="000000"/>
+              <w:end w:val="single" w:sz="4" w:space="0" w:color="000000"/>
+            </w:tcBorders>
+          </w:tcPr>
+          <w:p>
+            <w:pPr>
+              <w:pStyle w:val="Normal"/>
+              <w:jc w:val="start"/>
+              <w:rPr/>
+            </w:pPr>
+            <w:r>
+              <w:rPr>
+                <w:b w:val="false"/>
+                <w:bCs w:val="false"/>
+                <w:color w:val="000000"/>
+                <w:sz w:val="21"/>
+                <w:szCs w:val="21"/>
+              </w:rPr>
+              <w:t xml:space="preserve">Implementado — aba Panorama</w:t>
+            </w:r>
+          </w:p>
+        </w:tc>
+      </w:tr>
+      <w:tr>
+        <w:trPr>
+          <w:cantSplit w:val="true"/>
+        </w:trPr>
+        <w:tc>
+          <w:tcPr>
+            <w:tcW w:w="2400" w:type="dxa"/>
+            <w:tcBorders>
+              <w:top w:val="single" w:sz="4" w:space="0" w:color="000000"/>
+              <w:start w:val="single" w:sz="4" w:space="0" w:color="000000"/>
+              <w:bottom w:val="single" w:sz="4" w:space="0" w:color="000000"/>
+              <w:end w:val="single" w:sz="4" w:space="0" w:color="000000"/>
+            </w:tcBorders>
+            <w:shd w:fill="F2F2F2" w:val="clear"/>
+          </w:tcPr>
+          <w:p>
+            <w:pPr>
+              <w:pStyle w:val="Normal"/>
+              <w:jc w:val="start"/>
+              <w:rPr/>
+            </w:pPr>
+            <w:r>
+              <w:rPr>
+                <w:b w:val="false"/>
+                <w:bCs w:val="false"/>
+                <w:color w:val="000000"/>
+                <w:sz w:val="21"/>
+                <w:szCs w:val="21"/>
+              </w:rPr>
+              <w:t xml:space="preserve">Ranking de disparidade</w:t>
+            </w:r>
+          </w:p>
+        </w:tc>
+        <w:tc>
+          <w:tcPr>
+            <w:tcW w:w="4560" w:type="dxa"/>
+            <w:tcBorders>
+              <w:top w:val="single" w:sz="4" w:space="0" w:color="000000"/>
+              <w:start w:val="single" w:sz="4" w:space="0" w:color="000000"/>
+              <w:bottom w:val="single" w:sz="4" w:space="0" w:color="000000"/>
+              <w:end w:val="single" w:sz="4" w:space="0" w:color="000000"/>
+            </w:tcBorders>
+            <w:shd w:fill="F2F2F2" w:val="clear"/>
+          </w:tcPr>
+          <w:p>
+            <w:pPr>
+              <w:pStyle w:val="Normal"/>
+              <w:jc w:val="start"/>
+              <w:rPr/>
+            </w:pPr>
+            <w:r>
+              <w:rPr>
+                <w:b w:val="false"/>
+                <w:bCs w:val="false"/>
+                <w:color w:val="000000"/>
+                <w:sz w:val="21"/>
+                <w:szCs w:val="21"/>
+              </w:rPr>
+              <w:t xml:space="preserve">Posição das 27 UFs em cada métrica, com a média nacional como referência e destaque de uma UF escolhida pelo usuário.</w:t>
+            </w:r>
+          </w:p>
+        </w:tc>
+        <w:tc>
+          <w:tcPr>
+            <w:tcW w:w="2400" w:type="dxa"/>
+            <w:tcBorders>
+              <w:top w:val="single" w:sz="4" w:space="0" w:color="000000"/>
+              <w:start w:val="single" w:sz="4" w:space="0" w:color="000000"/>
+              <w:bottom w:val="single" w:sz="4" w:space="0" w:color="000000"/>
+              <w:end w:val="single" w:sz="4" w:space="0" w:color="000000"/>
+            </w:tcBorders>
+            <w:shd w:fill="F2F2F2" w:val="clear"/>
+          </w:tcPr>
+          <w:p>
+            <w:pPr>
+              <w:pStyle w:val="Normal"/>
+              <w:jc w:val="start"/>
+              <w:rPr/>
+            </w:pPr>
+            <w:r>
+              <w:rPr>
+                <w:b w:val="false"/>
+                <w:bCs w:val="false"/>
+                <w:color w:val="000000"/>
+                <w:sz w:val="21"/>
+                <w:szCs w:val="21"/>
+              </w:rPr>
+              <w:t xml:space="preserve">Implementado — aba Panorama</w:t>
+            </w:r>
+          </w:p>
+        </w:tc>
+      </w:tr>
+      <w:tr>
+        <w:trPr>
+          <w:cantSplit w:val="true"/>
+        </w:trPr>
+        <w:tc>
+          <w:tcPr>
+            <w:tcW w:w="2400" w:type="dxa"/>
+            <w:tcBorders>
+              <w:top w:val="single" w:sz="4" w:space="0" w:color="000000"/>
+              <w:start w:val="single" w:sz="4" w:space="0" w:color="000000"/>
+              <w:bottom w:val="single" w:sz="4" w:space="0" w:color="000000"/>
+              <w:end w:val="single" w:sz="4" w:space="0" w:color="000000"/>
+            </w:tcBorders>
+          </w:tcPr>
+          <w:p>
+            <w:pPr>
+              <w:pStyle w:val="Normal"/>
+              <w:jc w:val="start"/>
+              <w:rPr/>
+            </w:pPr>
+            <w:r>
+              <w:rPr>
+                <w:b w:val="false"/>
+                <w:bCs w:val="false"/>
+                <w:color w:val="000000"/>
+                <w:sz w:val="21"/>
+                <w:szCs w:val="21"/>
+              </w:rPr>
+              <w:t xml:space="preserve">Taxa de crescimento anual</w:t>
+            </w:r>
+          </w:p>
+        </w:tc>
+        <w:tc>
+          <w:tcPr>
+            <w:tcW w:w="4560" w:type="dxa"/>
+            <w:tcBorders>
+              <w:top w:val="single" w:sz="4" w:space="0" w:color="000000"/>
+              <w:start w:val="single" w:sz="4" w:space="0" w:color="000000"/>
+              <w:bottom w:val="single" w:sz="4" w:space="0" w:color="000000"/>
+              <w:end w:val="single" w:sz="4" w:space="0" w:color="000000"/>
+            </w:tcBorders>
+          </w:tcPr>
+          <w:p>
+            <w:pPr>
+              <w:pStyle w:val="Normal"/>
+              <w:jc w:val="start"/>
+              <w:rPr/>
+            </w:pPr>
+            <w:r>
+              <w:rPr>
+                <w:b w:val="false"/>
+                <w:bCs w:val="false"/>
+                <w:color w:val="000000"/>
+                <w:sz w:val="21"/>
+                <w:szCs w:val="21"/>
+              </w:rPr>
+              <w:t xml:space="preserve">Variação percentual ano a ano da potência instalada, por estado.</w:t>
+            </w:r>
+          </w:p>
+        </w:tc>
+        <w:tc>
+          <w:tcPr>
+            <w:tcW w:w="2400" w:type="dxa"/>
+            <w:tcBorders>
+              <w:top w:val="single" w:sz="4" w:space="0" w:color="000000"/>
+              <w:start w:val="single" w:sz="4" w:space="0" w:color="000000"/>
+              <w:bottom w:val="single" w:sz="4" w:space="0" w:color="000000"/>
+              <w:end w:val="single" w:sz="4" w:space="0" w:color="000000"/>
+            </w:tcBorders>
+          </w:tcPr>
+          <w:p>
+            <w:pPr>
+              <w:pStyle w:val="Normal"/>
+              <w:jc w:val="start"/>
+              <w:rPr/>
+            </w:pPr>
+            <w:r>
+              <w:rPr>
+                <w:b w:val="false"/>
+                <w:bCs w:val="false"/>
+                <w:color w:val="000000"/>
+                <w:sz w:val="21"/>
+                <w:szCs w:val="21"/>
+              </w:rPr>
+              <w:t xml:space="preserve">Parcial — série anual na aba Evolução; cálculo da variação previsto para o TP3</w:t>
+            </w:r>
+          </w:p>
+        </w:tc>
+      </w:tr>
+    </w:tbl>
+    <w:p>
+      <w:pPr>
+        <w:pStyle w:val="Normal"/>
+        <w:spacing w:lineRule="auto" w:line="300" w:before="160" w:after="80"/>
+        <w:rPr/>
+      </w:pPr>
+      <w:r>
+        <w:rPr>
+          <w:i w:val="false"/>
+          <w:iCs w:val="false"/>
+          <w:sz w:val="22"/>
+          <w:szCs w:val="22"/>
+        </w:rPr>
+        <w:t xml:space="preserve">A métrica definida no TP1 (MW por 100 mil habitantes) foi substituída por watts por habitante. É a mesma razão em outra escala (1 MW por 100 mil habitantes equivale a 10 W por habitante), com ordem de grandeza mais legível e unidade usual no setor.</w:t>
+      </w:r>
+    </w:p>
+    <w:p>
+      <w:pPr>
+        <w:pStyle w:val="Heading1"/>
+        <w:pBdr>
+          <w:bottom w:val="single" w:sz="6" w:space="4" w:color="2E7D32"/>
+        </w:pBdr>
+        <w:spacing w:before="320" w:after="160"/>
+        <w:rPr/>
+      </w:pPr>
+      <w:r>
+        <w:rPr>
+          <w:color w:val="2E7D32"/>
+        </w:rPr>
+        <w:t>3. Escopo</w:t>
+      </w:r>
+    </w:p>
+    <w:p>
+      <w:pPr>
+        <w:pStyle w:val="Normal"/>
+        <w:spacing w:lineRule="auto" w:line="300" w:before="0" w:after="160"/>
+        <w:rPr/>
+      </w:pPr>
+      <w:r>
+        <w:rPr>
+          <w:i w:val="false"/>
+          <w:iCs w:val="false"/>
+          <w:sz w:val="22"/>
+          <w:szCs w:val="22"/>
+        </w:rPr>
+        <w:t>Dashboard interativo em Streamlit exibindo a distribuição estadual de potência instalada em geração solar distribuída, normalizada por população, com identificação de disparidades regionais. Ao longo do curso, o projeto evolui incorporando web scraping (contexto qualitativo de notícias e incentivos estaduais), uma API própria em FastAPI, processamento de linguagem natural com um modelo de IA local, e, na etapa final, um agente inteligente de recomendação.</w:t>
+      </w:r>
+    </w:p>
+    <w:p>
+      <w:pPr>
+        <w:pStyle w:val="Heading2"/>
+        <w:spacing w:before="240" w:after="120"/>
+        <w:rPr/>
+      </w:pPr>
+      <w:r>
+        <w:rPr>
+          <w:color w:val="595959"/>
+        </w:rPr>
+        <w:t>Entregas do TP2</w:t>
+      </w:r>
+    </w:p>
+    <w:p>
+      <w:pPr>
+        <w:pStyle w:val="Normal"/>
+        <w:spacing w:lineRule="auto" w:line="300" w:before="0" w:after="160"/>
+        <w:rPr/>
+      </w:pPr>
+      <w:r>
+        <w:rPr>
+          <w:i w:val="false"/>
+          <w:iCs w:val="false"/>
+          <w:sz w:val="22"/>
+          <w:szCs w:val="22"/>
+        </w:rPr>
+        <w:t xml:space="preserve">Camadas Silver e Gold implementadas, com critérios de exclusão, correções documentadas e validação contra o painel oficial da ANEEL. Coleta de 114 notícias da Agência Brasil por web scraping com BeautifulSoup. Dashboard com quatro abas (Panorama, Evolução, Notícias e Dados), filtros por visão dos dados, métrica, período e classe de consumo, cache, estado de sessão e serviço de upload e download de CSV.</w:t>
+      </w:r>
+    </w:p>
+    <w:p>
+      <w:pPr>
+        <w:pStyle w:val="Heading2"/>
+        <w:spacing w:before="240" w:after="120"/>
+        <w:rPr/>
+      </w:pPr>
+      <w:r>
+        <w:rPr>
+          <w:color w:val="595959"/>
+        </w:rPr>
+        <w:t>Ajustes de escopo</w:t>
+      </w:r>
+    </w:p>
+    <w:p>
+      <w:pPr>
+        <w:pStyle w:val="Normal"/>
+        <w:spacing w:lineRule="auto" w:line="300" w:before="0" w:after="160"/>
+        <w:rPr/>
+      </w:pPr>
+      <w:r>
+        <w:rPr>
+          <w:i w:val="false"/>
+          <w:iCs w:val="false"/>
+          <w:sz w:val="22"/>
+          <w:szCs w:val="22"/>
+        </w:rPr>
+        <w:t xml:space="preserve">A coleta da adesão estadual ao Convênio ICMS 16/2015 (CONFAZ), inicialmente considerada para o TP2, foi transferida para o TP3, etapa em que a revisão das fontes de dados faz parte do enunciado. A camada Gold já está preparada para receber essa informação sem alteração de esquema.</w:t>
+      </w:r>
+    </w:p>
+    <w:p>
+      <w:pPr>
+        <w:pStyle w:val="Heading2"/>
+        <w:spacing w:before="240" w:after="120"/>
+        <w:rPr/>
+      </w:pPr>
+      <w:r>
+        <w:rPr>
+          <w:color w:val="595959"/>
+        </w:rPr>
+        <w:t>Fora do escopo</w:t>
+      </w:r>
+    </w:p>
+    <w:p>
+      <w:pPr>
+        <w:pStyle w:val="Normal"/>
+        <w:spacing w:lineRule="auto" w:line="300" w:before="0" w:after="160"/>
+        <w:rPr/>
+      </w:pPr>
+      <w:r>
+        <w:rPr>
+          <w:i w:val="false"/>
+          <w:iCs w:val="false"/>
+          <w:sz w:val="22"/>
+          <w:szCs w:val="22"/>
+        </w:rPr>
+        <w:t xml:space="preserve">Previsão de adoção futura, análise de viabilidade financeira de projetos individuais e dados de geração centralizada (grandes usinas conectadas ao Sistema Interligado Nacional).</w:t>
+      </w:r>
+    </w:p>
+    <w:p>
+      <w:pPr>
+        <w:pStyle w:val="Heading1"/>
+        <w:pBdr>
+          <w:bottom w:val="single" w:sz="6" w:space="4" w:color="2E7D32"/>
+        </w:pBdr>
+        <w:spacing w:before="320" w:after="160"/>
+        <w:rPr/>
+      </w:pPr>
+      <w:r>
+        <w:rPr>
+          <w:color w:val="2E7D32"/>
+        </w:rPr>
+        <w:t>4. Objetivos de Desenvolvimento Sustentável (ODS)</w:t>
+      </w:r>
+    </w:p>
+    <w:tbl>
+      <w:tblPr>
+        <w:tblW w:w="9360" w:type="dxa"/>
+        <w:jc w:val="start"/>
+        <w:tblInd w:w="0" w:type="dxa"/>
+        <w:tblLayout w:type="fixed"/>
+        <w:tblCellMar>
+          <w:top w:w="100" w:type="dxa"/>
+          <w:start w:w="120" w:type="dxa"/>
+          <w:bottom w:w="100" w:type="dxa"/>
+          <w:end w:w="120" w:type="dxa"/>
+        </w:tblCellMar>
+      </w:tblPr>
+      <w:tblGrid>
+        <w:gridCol w:w="2600"/>
+        <w:gridCol w:w="1400"/>
+        <w:gridCol w:w="5360"/>
+      </w:tblGrid>
+      <w:tr>
+        <w:trPr>
+          <w:tblHeader w:val="true"/>
+          <w:cantSplit w:val="true"/>
+        </w:trPr>
+        <w:tc>
+          <w:tcPr>
+            <w:tcW w:w="2600" w:type="dxa"/>
+            <w:tcBorders>
+              <w:top w:val="single" w:sz="4" w:space="0" w:color="000000"/>
+              <w:start w:val="single" w:sz="4" w:space="0" w:color="000000"/>
+              <w:bottom w:val="single" w:sz="4" w:space="0" w:color="000000"/>
+              <w:end w:val="single" w:sz="4" w:space="0" w:color="000000"/>
+            </w:tcBorders>
+            <w:shd w:fill="2E7D32" w:val="clear"/>
+          </w:tcPr>
+          <w:p>
+            <w:pPr>
+              <w:pStyle w:val="Normal"/>
+              <w:jc w:val="start"/>
+              <w:rPr/>
+            </w:pPr>
+            <w:r>
+              <w:rPr>
+                <w:b/>
+                <w:bCs/>
+                <w:color w:val="FFFFFF"/>
+                <w:sz w:val="21"/>
+                <w:szCs w:val="21"/>
+              </w:rPr>
+              <w:t>ODS</w:t>
+            </w:r>
+          </w:p>
+        </w:tc>
+        <w:tc>
+          <w:tcPr>
+            <w:tcW w:w="1400" w:type="dxa"/>
+            <w:tcBorders>
+              <w:top w:val="single" w:sz="4" w:space="0" w:color="000000"/>
+              <w:start w:val="single" w:sz="4" w:space="0" w:color="000000"/>
+              <w:bottom w:val="single" w:sz="4" w:space="0" w:color="000000"/>
+              <w:end w:val="single" w:sz="4" w:space="0" w:color="000000"/>
+            </w:tcBorders>
+            <w:shd w:fill="2E7D32" w:val="clear"/>
+          </w:tcPr>
+          <w:p>
+            <w:pPr>
+              <w:pStyle w:val="Normal"/>
+              <w:jc w:val="start"/>
+              <w:rPr/>
+            </w:pPr>
+            <w:r>
+              <w:rPr>
+                <w:b/>
+                <w:bCs/>
+                <w:color w:val="FFFFFF"/>
+                <w:sz w:val="21"/>
+                <w:szCs w:val="21"/>
+              </w:rPr>
+              <w:t>Papel</w:t>
+            </w:r>
+          </w:p>
+        </w:tc>
+        <w:tc>
+          <w:tcPr>
+            <w:tcW w:w="5360" w:type="dxa"/>
+            <w:tcBorders>
+              <w:top w:val="single" w:sz="4" w:space="0" w:color="000000"/>
+              <w:start w:val="single" w:sz="4" w:space="0" w:color="000000"/>
+              <w:bottom w:val="single" w:sz="4" w:space="0" w:color="000000"/>
+              <w:end w:val="single" w:sz="4" w:space="0" w:color="000000"/>
+            </w:tcBorders>
+            <w:shd w:fill="2E7D32" w:val="clear"/>
+          </w:tcPr>
+          <w:p>
+            <w:pPr>
+              <w:pStyle w:val="Normal"/>
+              <w:jc w:val="start"/>
+              <w:rPr/>
+            </w:pPr>
+            <w:r>
+              <w:rPr>
+                <w:b/>
+                <w:bCs/>
+                <w:color w:val="FFFFFF"/>
+                <w:sz w:val="21"/>
+                <w:szCs w:val="21"/>
+              </w:rPr>
+              <w:t>Justificativa</w:t>
+            </w:r>
+          </w:p>
+        </w:tc>
+      </w:tr>
+      <w:tr>
+        <w:trPr>
+          <w:cantSplit w:val="true"/>
+        </w:trPr>
+        <w:tc>
+          <w:tcPr>
+            <w:tcW w:w="2600" w:type="dxa"/>
+            <w:tcBorders>
+              <w:top w:val="single" w:sz="4" w:space="0" w:color="000000"/>
+              <w:start w:val="single" w:sz="4" w:space="0" w:color="000000"/>
+              <w:bottom w:val="single" w:sz="4" w:space="0" w:color="000000"/>
+              <w:end w:val="single" w:sz="4" w:space="0" w:color="000000"/>
+            </w:tcBorders>
+            <w:shd w:fill="F2F2F2" w:val="clear"/>
+          </w:tcPr>
+          <w:p>
+            <w:pPr>
+              <w:pStyle w:val="Normal"/>
+              <w:jc w:val="start"/>
+              <w:rPr/>
+            </w:pPr>
+            <w:r>
+              <w:rPr>
+                <w:b w:val="false"/>
+                <w:bCs w:val="false"/>
+                <w:color w:val="000000"/>
+                <w:sz w:val="21"/>
+                <w:szCs w:val="21"/>
+              </w:rPr>
+              <w:t>ODS 7 — Energia Limpa e Acessível</w:t>
+            </w:r>
+          </w:p>
+        </w:tc>
+        <w:tc>
+          <w:tcPr>
+            <w:tcW w:w="1400" w:type="dxa"/>
+            <w:tcBorders>
+              <w:top w:val="single" w:sz="4" w:space="0" w:color="000000"/>
+              <w:start w:val="single" w:sz="4" w:space="0" w:color="000000"/>
+              <w:bottom w:val="single" w:sz="4" w:space="0" w:color="000000"/>
+              <w:end w:val="single" w:sz="4" w:space="0" w:color="000000"/>
+            </w:tcBorders>
+            <w:shd w:fill="F2F2F2" w:val="clear"/>
+          </w:tcPr>
+          <w:p>
+            <w:pPr>
+              <w:pStyle w:val="Normal"/>
+              <w:jc w:val="start"/>
+              <w:rPr/>
+            </w:pPr>
+            <w:r>
+              <w:rPr>
+                <w:b w:val="false"/>
+                <w:bCs w:val="false"/>
+                <w:color w:val="000000"/>
+                <w:sz w:val="21"/>
+                <w:szCs w:val="21"/>
+              </w:rPr>
+              <w:t>Principal</w:t>
+            </w:r>
+          </w:p>
+        </w:tc>
+        <w:tc>
+          <w:tcPr>
+            <w:tcW w:w="5360" w:type="dxa"/>
+            <w:tcBorders>
+              <w:top w:val="single" w:sz="4" w:space="0" w:color="000000"/>
+              <w:start w:val="single" w:sz="4" w:space="0" w:color="000000"/>
+              <w:bottom w:val="single" w:sz="4" w:space="0" w:color="000000"/>
+              <w:end w:val="single" w:sz="4" w:space="0" w:color="000000"/>
+            </w:tcBorders>
+            <w:shd w:fill="F2F2F2" w:val="clear"/>
+          </w:tcPr>
+          <w:p>
+            <w:pPr>
+              <w:pStyle w:val="Normal"/>
+              <w:jc w:val="start"/>
+              <w:rPr/>
+            </w:pPr>
+            <w:r>
+              <w:rPr>
+                <w:b w:val="false"/>
+                <w:bCs w:val="false"/>
+                <w:color w:val="000000"/>
+                <w:sz w:val="21"/>
+                <w:szCs w:val="21"/>
+              </w:rPr>
+              <w:t>O projeto trata diretamente da meta 7.2 (ampliar a participação de renováveis na matriz energética) e 7.b (expandir e modernizar infraestrutura de energia sustentável).</w:t>
+            </w:r>
+          </w:p>
+        </w:tc>
+      </w:tr>
+      <w:tr>
+        <w:trPr>
+          <w:cantSplit w:val="true"/>
+        </w:trPr>
+        <w:tc>
+          <w:tcPr>
+            <w:tcW w:w="2600" w:type="dxa"/>
+            <w:tcBorders>
+              <w:top w:val="single" w:sz="4" w:space="0" w:color="000000"/>
+              <w:start w:val="single" w:sz="4" w:space="0" w:color="000000"/>
+              <w:bottom w:val="single" w:sz="4" w:space="0" w:color="000000"/>
+              <w:end w:val="single" w:sz="4" w:space="0" w:color="000000"/>
+            </w:tcBorders>
+          </w:tcPr>
+          <w:p>
+            <w:pPr>
+              <w:pStyle w:val="Normal"/>
+              <w:jc w:val="start"/>
+              <w:rPr/>
+            </w:pPr>
+            <w:r>
+              <w:rPr>
+                <w:b w:val="false"/>
+                <w:bCs w:val="false"/>
+                <w:color w:val="000000"/>
+                <w:sz w:val="21"/>
+                <w:szCs w:val="21"/>
+              </w:rPr>
+              <w:t>ODS 10 — Redução das Desigualdades</w:t>
+            </w:r>
+          </w:p>
+        </w:tc>
+        <w:tc>
+          <w:tcPr>
+            <w:tcW w:w="1400" w:type="dxa"/>
+            <w:tcBorders>
+              <w:top w:val="single" w:sz="4" w:space="0" w:color="000000"/>
+              <w:start w:val="single" w:sz="4" w:space="0" w:color="000000"/>
+              <w:bottom w:val="single" w:sz="4" w:space="0" w:color="000000"/>
+              <w:end w:val="single" w:sz="4" w:space="0" w:color="000000"/>
+            </w:tcBorders>
+          </w:tcPr>
+          <w:p>
+            <w:pPr>
+              <w:pStyle w:val="Normal"/>
+              <w:jc w:val="start"/>
+              <w:rPr/>
+            </w:pPr>
+            <w:r>
+              <w:rPr>
+                <w:b w:val="false"/>
+                <w:bCs w:val="false"/>
+                <w:color w:val="000000"/>
+                <w:sz w:val="21"/>
+                <w:szCs w:val="21"/>
+              </w:rPr>
+              <w:t>Secundário</w:t>
+            </w:r>
+          </w:p>
+        </w:tc>
+        <w:tc>
+          <w:tcPr>
+            <w:tcW w:w="5360" w:type="dxa"/>
+            <w:tcBorders>
+              <w:top w:val="single" w:sz="4" w:space="0" w:color="000000"/>
+              <w:start w:val="single" w:sz="4" w:space="0" w:color="000000"/>
+              <w:bottom w:val="single" w:sz="4" w:space="0" w:color="000000"/>
+              <w:end w:val="single" w:sz="4" w:space="0" w:color="000000"/>
+            </w:tcBorders>
+          </w:tcPr>
+          <w:p>
+            <w:pPr>
+              <w:pStyle w:val="Normal"/>
+              <w:jc w:val="start"/>
+              <w:rPr/>
+            </w:pPr>
+            <w:r>
+              <w:rPr>
+                <w:b w:val="false"/>
+                <w:bCs w:val="false"/>
+                <w:color w:val="000000"/>
+                <w:sz w:val="21"/>
+                <w:szCs w:val="21"/>
+              </w:rPr>
+              <w:t>O recorte central do projeto é a disparidade regional de adoção, dialogando com a meta 10.2 (promover inclusão socioeconômica independentemente da localização geográfica).</w:t>
+            </w:r>
+          </w:p>
+        </w:tc>
+      </w:tr>
+    </w:tbl>
+    <w:p>
+      <w:pPr>
+        <w:pStyle w:val="Heading1"/>
+        <w:pBdr>
+          <w:bottom w:val="single" w:sz="6" w:space="4" w:color="2E7D32"/>
+        </w:pBdr>
+        <w:spacing w:before="320" w:after="160"/>
+        <w:rPr/>
+      </w:pPr>
+      <w:r>
+        <w:rPr>
+          <w:color w:val="2E7D32"/>
+        </w:rPr>
+        <w:t>5. Público-Alvo</w:t>
+      </w:r>
+    </w:p>
+    <w:p>
+      <w:pPr>
+        <w:pStyle w:val="ListParagraph"/>
+        <w:numPr>
+          <w:ilvl w:val="0"/>
+          <w:numId w:val="1"/>
+        </w:numPr>
+        <w:spacing w:before="0" w:after="80"/>
+        <w:rPr/>
+      </w:pPr>
+      <w:r>
+        <w:rPr>
+          <w:sz w:val="22"/>
+          <w:szCs w:val="22"/>
+        </w:rPr>
+        <w:t>Formuladores de política energética estadual (secretarias de energia e meio ambiente)</w:t>
+      </w:r>
+    </w:p>
+    <w:p>
+      <w:pPr>
+        <w:pStyle w:val="ListParagraph"/>
+        <w:numPr>
+          <w:ilvl w:val="0"/>
+          <w:numId w:val="1"/>
+        </w:numPr>
+        <w:spacing w:before="0" w:after="80"/>
+        <w:rPr/>
+      </w:pPr>
+      <w:r>
+        <w:rPr>
+          <w:sz w:val="22"/>
+          <w:szCs w:val="22"/>
+        </w:rPr>
+        <w:t>Empresas do setor solar avaliando onde expandir operação</w:t>
+      </w:r>
+    </w:p>
+    <w:p>
+      <w:pPr>
+        <w:pStyle w:val="ListParagraph"/>
+        <w:numPr>
+          <w:ilvl w:val="0"/>
+          <w:numId w:val="1"/>
+        </w:numPr>
+        <w:spacing w:before="0" w:after="80"/>
+        <w:rPr/>
+      </w:pPr>
+      <w:r>
+        <w:rPr>
+          <w:sz w:val="22"/>
+          <w:szCs w:val="22"/>
+        </w:rPr>
+        <w:t>ONGs de justiça e transição energética</w:t>
+      </w:r>
+    </w:p>
+    <w:p>
+      <w:pPr>
+        <w:pStyle w:val="ListParagraph"/>
+        <w:numPr>
+          <w:ilvl w:val="0"/>
+          <w:numId w:val="1"/>
+        </w:numPr>
+        <w:spacing w:before="0" w:after="80"/>
+        <w:rPr/>
+      </w:pPr>
+      <w:r>
+        <w:rPr>
+          <w:sz w:val="22"/>
+          <w:szCs w:val="22"/>
+        </w:rPr>
+        <w:t>Pesquisadores e jornalistas de dados cobrindo o tema</w:t>
+      </w:r>
+    </w:p>
+    <w:p>
+      <w:pPr>
+        <w:pStyle w:val="Heading1"/>
+        <w:pBdr>
+          <w:bottom w:val="single" w:sz="6" w:space="4" w:color="2E7D32"/>
+        </w:pBdr>
+        <w:spacing w:before="320" w:after="160"/>
+        <w:rPr/>
+      </w:pPr>
+      <w:r>
+        <w:rPr>
+          <w:color w:val="2E7D32"/>
+        </w:rPr>
+        <w:t>6. Stakeholders do Projeto</w:t>
       </w:r>
     </w:p>
     <w:tbl>
@@ -324,7 +1362,7 @@
                 <w:sz w:val="21"/>
                 <w:szCs w:val="21"/>
               </w:rPr>
-              <w:t>Indicador</w:t>
+              <w:t>Stakeholder</w:t>
             </w:r>
           </w:p>
         </w:tc>
@@ -353,7 +1391,7 @@
                 <w:sz w:val="21"/>
                 <w:szCs w:val="21"/>
               </w:rPr>
-              <w:t>Definição</w:t>
+              <w:t>Papel no Projeto</w:t>
             </w:r>
           </w:p>
         </w:tc>
@@ -387,7 +1425,7 @@
                 <w:sz w:val="21"/>
                 <w:szCs w:val="21"/>
               </w:rPr>
-              <w:t>Potência instalada per capita</w:t>
+              <w:t>Professor / avaliador do curso</w:t>
             </w:r>
           </w:p>
         </w:tc>
@@ -416,7 +1454,7 @@
                 <w:sz w:val="21"/>
                 <w:szCs w:val="21"/>
               </w:rPr>
-              <w:t>MW de MMGD instalados por 100 mil habitantes, por estado</w:t>
+              <w:t>Avalia entregas técnicas e documentação em cada TP</w:t>
             </w:r>
           </w:p>
         </w:tc>
@@ -449,7 +1487,7 @@
                 <w:sz w:val="21"/>
                 <w:szCs w:val="21"/>
               </w:rPr>
-              <w:t>Taxa de crescimento anual</w:t>
+              <w:t>Pâmela Lima Ziliotto</w:t>
             </w:r>
           </w:p>
         </w:tc>
@@ -477,7 +1515,7 @@
                 <w:sz w:val="21"/>
                 <w:szCs w:val="21"/>
               </w:rPr>
-              <w:t>Variação percentual ano a ano da potência instalada, por estado</w:t>
+              <w:t>Desenvolvedora e responsável pelo projeto</w:t>
             </w:r>
           </w:p>
         </w:tc>
@@ -511,7 +1549,7 @@
                 <w:sz w:val="21"/>
                 <w:szCs w:val="21"/>
               </w:rPr>
-              <w:t>Ranking de disparidade</w:t>
+              <w:t>Usuário final (políticas públicas / setor solar)</w:t>
             </w:r>
           </w:p>
         </w:tc>
@@ -540,7 +1578,7 @@
                 <w:sz w:val="21"/>
                 <w:szCs w:val="21"/>
               </w:rPr>
-              <w:t>Os 5 estados com maior e os 5 com menor adoção per capita</w:t>
+              <w:t>Consome os insights do dashboard para decisão</w:t>
             </w:r>
           </w:p>
         </w:tc>
@@ -559,39 +1597,7 @@
         <w:rPr>
           <w:color w:val="2E7D32"/>
         </w:rPr>
-        <w:t>3. Escopo</w:t>
-      </w:r>
-    </w:p>
-    <w:p>
-      <w:pPr>
-        <w:pStyle w:val="Normal"/>
-        <w:spacing w:lineRule="auto" w:line="300" w:before="0" w:after="160"/>
-        <w:rPr/>
-      </w:pPr>
-      <w:r>
-        <w:rPr>
-          <w:i w:val="false"/>
-          <w:iCs w:val="false"/>
-          <w:sz w:val="22"/>
-          <w:szCs w:val="22"/>
-        </w:rPr>
-        <w:t>Dashboard interativo em Streamlit exibindo a distribuição estadual de potência instalada em geração solar distribuída, normalizada por população, com identificação de disparidades regionais. Ao longo do curso, o projeto evolui incorporando web scraping (contexto qualitativo de notícias e incentivos estaduais), uma API própria em FastAPI, processamento de linguagem natural com um modelo de IA local, e, na etapa final, um agente inteligente de recomendação.</w:t>
-      </w:r>
-    </w:p>
-    <w:p>
-      <w:pPr>
-        <w:pStyle w:val="Heading1"/>
-        <w:pBdr>
-          <w:bottom w:val="single" w:sz="6" w:space="4" w:color="2E7D32"/>
-        </w:pBdr>
-        <w:spacing w:before="320" w:after="160"/>
-        <w:rPr/>
-      </w:pPr>
-      <w:r>
-        <w:rPr>
-          <w:color w:val="2E7D32"/>
-        </w:rPr>
-        <w:t>4. Objetivos de Desenvolvimento Sustentável (ODS)</w:t>
+        <w:t>7. Cronograma Macro (TDSP)</w:t>
       </w:r>
     </w:p>
     <w:tbl>
@@ -608,9 +1614,9 @@
         </w:tblCellMar>
       </w:tblPr>
       <w:tblGrid>
-        <w:gridCol w:w="3120"/>
-        <w:gridCol w:w="3120"/>
-        <w:gridCol w:w="3120"/>
+        <w:gridCol w:w="1200"/>
+        <w:gridCol w:w="6060"/>
+        <w:gridCol w:w="2100"/>
       </w:tblGrid>
       <w:tr>
         <w:trPr>
@@ -619,7 +1625,7 @@
         </w:trPr>
         <w:tc>
           <w:tcPr>
-            <w:tcW w:w="3120" w:type="dxa"/>
+            <w:tcW w:w="1200" w:type="dxa"/>
             <w:tcBorders>
               <w:top w:val="single" w:sz="4" w:space="0" w:color="000000"/>
               <w:start w:val="single" w:sz="4" w:space="0" w:color="000000"/>
@@ -642,13 +1648,13 @@
                 <w:sz w:val="21"/>
                 <w:szCs w:val="21"/>
               </w:rPr>
-              <w:t>ODS</w:t>
-            </w:r>
-          </w:p>
-        </w:tc>
-        <w:tc>
-          <w:tcPr>
-            <w:tcW w:w="3120" w:type="dxa"/>
+              <w:t xml:space="preserve">Etapa</w:t>
+            </w:r>
+          </w:p>
+        </w:tc>
+        <w:tc>
+          <w:tcPr>
+            <w:tcW w:w="6060" w:type="dxa"/>
             <w:tcBorders>
               <w:top w:val="single" w:sz="4" w:space="0" w:color="000000"/>
               <w:start w:val="single" w:sz="4" w:space="0" w:color="000000"/>
@@ -671,13 +1677,13 @@
                 <w:sz w:val="21"/>
                 <w:szCs w:val="21"/>
               </w:rPr>
-              <w:t>Papel</w:t>
-            </w:r>
-          </w:p>
-        </w:tc>
-        <w:tc>
-          <w:tcPr>
-            <w:tcW w:w="3120" w:type="dxa"/>
+              <w:t xml:space="preserve">Foco Principal</w:t>
+            </w:r>
+          </w:p>
+        </w:tc>
+        <w:tc>
+          <w:tcPr>
+            <w:tcW w:w="2100" w:type="dxa"/>
             <w:tcBorders>
               <w:top w:val="single" w:sz="4" w:space="0" w:color="000000"/>
               <w:start w:val="single" w:sz="4" w:space="0" w:color="000000"/>
@@ -700,7 +1706,7 @@
                 <w:sz w:val="21"/>
                 <w:szCs w:val="21"/>
               </w:rPr>
-              <w:t>Justificativa</w:t>
+              <w:t xml:space="preserve">Situação</w:t>
             </w:r>
           </w:p>
         </w:tc>
@@ -711,7 +1717,7 @@
         </w:trPr>
         <w:tc>
           <w:tcPr>
-            <w:tcW w:w="3120" w:type="dxa"/>
+            <w:tcW w:w="1200" w:type="dxa"/>
             <w:tcBorders>
               <w:top w:val="single" w:sz="4" w:space="0" w:color="000000"/>
               <w:start w:val="single" w:sz="4" w:space="0" w:color="000000"/>
@@ -734,13 +1740,13 @@
                 <w:sz w:val="21"/>
                 <w:szCs w:val="21"/>
               </w:rPr>
-              <w:t>ODS 7 — Energia Limpa e Acessível</w:t>
-            </w:r>
-          </w:p>
-        </w:tc>
-        <w:tc>
-          <w:tcPr>
-            <w:tcW w:w="3120" w:type="dxa"/>
+              <w:t xml:space="preserve">TP1</w:t>
+            </w:r>
+          </w:p>
+        </w:tc>
+        <w:tc>
+          <w:tcPr>
+            <w:tcW w:w="6060" w:type="dxa"/>
             <w:tcBorders>
               <w:top w:val="single" w:sz="4" w:space="0" w:color="000000"/>
               <w:start w:val="single" w:sz="4" w:space="0" w:color="000000"/>
@@ -763,13 +1769,13 @@
                 <w:sz w:val="21"/>
                 <w:szCs w:val="21"/>
               </w:rPr>
-              <w:t>Principal</w:t>
-            </w:r>
-          </w:p>
-        </w:tc>
-        <w:tc>
-          <w:tcPr>
-            <w:tcW w:w="3120" w:type="dxa"/>
+              <w:t xml:space="preserve">Fundação: problema de negócio, dados ANEEL/IBGE, demo Streamlit</w:t>
+            </w:r>
+          </w:p>
+        </w:tc>
+        <w:tc>
+          <w:tcPr>
+            <w:tcW w:w="2100" w:type="dxa"/>
             <w:tcBorders>
               <w:top w:val="single" w:sz="4" w:space="0" w:color="000000"/>
               <w:start w:val="single" w:sz="4" w:space="0" w:color="000000"/>
@@ -792,7 +1798,7 @@
                 <w:sz w:val="21"/>
                 <w:szCs w:val="21"/>
               </w:rPr>
-              <w:t>O projeto trata diretamente da meta 7.2 (ampliar a participação de renováveis na matriz energética) e 7.b (expandir e modernizar infraestrutura de energia sustentável).</w:t>
+              <w:t xml:space="preserve">Concluído</w:t>
             </w:r>
           </w:p>
         </w:tc>
@@ -803,85 +1809,358 @@
         </w:trPr>
         <w:tc>
           <w:tcPr>
-            <w:tcW w:w="3120" w:type="dxa"/>
-            <w:tcBorders>
-              <w:top w:val="single" w:sz="4" w:space="0" w:color="000000"/>
-              <w:start w:val="single" w:sz="4" w:space="0" w:color="000000"/>
-              <w:bottom w:val="single" w:sz="4" w:space="0" w:color="000000"/>
-              <w:end w:val="single" w:sz="4" w:space="0" w:color="000000"/>
-            </w:tcBorders>
-          </w:tcPr>
-          <w:p>
-            <w:pPr>
-              <w:pStyle w:val="Normal"/>
-              <w:jc w:val="start"/>
-              <w:rPr/>
-            </w:pPr>
-            <w:r>
-              <w:rPr>
-                <w:b w:val="false"/>
-                <w:bCs w:val="false"/>
-                <w:color w:val="000000"/>
-                <w:sz w:val="21"/>
-                <w:szCs w:val="21"/>
-              </w:rPr>
-              <w:t>ODS 10 — Redução das Desigualdades</w:t>
-            </w:r>
-          </w:p>
-        </w:tc>
-        <w:tc>
-          <w:tcPr>
-            <w:tcW w:w="3120" w:type="dxa"/>
-            <w:tcBorders>
-              <w:top w:val="single" w:sz="4" w:space="0" w:color="000000"/>
-              <w:start w:val="single" w:sz="4" w:space="0" w:color="000000"/>
-              <w:bottom w:val="single" w:sz="4" w:space="0" w:color="000000"/>
-              <w:end w:val="single" w:sz="4" w:space="0" w:color="000000"/>
-            </w:tcBorders>
-          </w:tcPr>
-          <w:p>
-            <w:pPr>
-              <w:pStyle w:val="Normal"/>
-              <w:jc w:val="start"/>
-              <w:rPr/>
-            </w:pPr>
-            <w:r>
-              <w:rPr>
-                <w:b w:val="false"/>
-                <w:bCs w:val="false"/>
-                <w:color w:val="000000"/>
-                <w:sz w:val="21"/>
-                <w:szCs w:val="21"/>
-              </w:rPr>
-              <w:t>Secundário</w:t>
-            </w:r>
-          </w:p>
-        </w:tc>
-        <w:tc>
-          <w:tcPr>
-            <w:tcW w:w="3120" w:type="dxa"/>
-            <w:tcBorders>
-              <w:top w:val="single" w:sz="4" w:space="0" w:color="000000"/>
-              <w:start w:val="single" w:sz="4" w:space="0" w:color="000000"/>
-              <w:bottom w:val="single" w:sz="4" w:space="0" w:color="000000"/>
-              <w:end w:val="single" w:sz="4" w:space="0" w:color="000000"/>
-            </w:tcBorders>
-          </w:tcPr>
-          <w:p>
-            <w:pPr>
-              <w:pStyle w:val="Normal"/>
-              <w:jc w:val="start"/>
-              <w:rPr/>
-            </w:pPr>
-            <w:r>
-              <w:rPr>
-                <w:b w:val="false"/>
-                <w:bCs w:val="false"/>
-                <w:color w:val="000000"/>
-                <w:sz w:val="21"/>
-                <w:szCs w:val="21"/>
-              </w:rPr>
-              <w:t>O recorte central do projeto é a disparidade regional de adoção, dialogando com a meta 10.2 (promover inclusão socioeconômica independentemente da localização geográfica).</w:t>
+            <w:tcW w:w="1200" w:type="dxa"/>
+            <w:tcBorders>
+              <w:top w:val="single" w:sz="4" w:space="0" w:color="000000"/>
+              <w:start w:val="single" w:sz="4" w:space="0" w:color="000000"/>
+              <w:bottom w:val="single" w:sz="4" w:space="0" w:color="000000"/>
+              <w:end w:val="single" w:sz="4" w:space="0" w:color="000000"/>
+            </w:tcBorders>
+          </w:tcPr>
+          <w:p>
+            <w:pPr>
+              <w:pStyle w:val="Normal"/>
+              <w:jc w:val="start"/>
+              <w:rPr/>
+            </w:pPr>
+            <w:r>
+              <w:rPr>
+                <w:b w:val="false"/>
+                <w:bCs w:val="false"/>
+                <w:color w:val="000000"/>
+                <w:sz w:val="21"/>
+                <w:szCs w:val="21"/>
+              </w:rPr>
+              <w:t xml:space="preserve">TP2</w:t>
+            </w:r>
+          </w:p>
+        </w:tc>
+        <w:tc>
+          <w:tcPr>
+            <w:tcW w:w="6060" w:type="dxa"/>
+            <w:tcBorders>
+              <w:top w:val="single" w:sz="4" w:space="0" w:color="000000"/>
+              <w:start w:val="single" w:sz="4" w:space="0" w:color="000000"/>
+              <w:bottom w:val="single" w:sz="4" w:space="0" w:color="000000"/>
+              <w:end w:val="single" w:sz="4" w:space="0" w:color="000000"/>
+            </w:tcBorders>
+          </w:tcPr>
+          <w:p>
+            <w:pPr>
+              <w:pStyle w:val="Normal"/>
+              <w:jc w:val="start"/>
+              <w:rPr/>
+            </w:pPr>
+            <w:r>
+              <w:rPr>
+                <w:b w:val="false"/>
+                <w:bCs w:val="false"/>
+                <w:color w:val="000000"/>
+                <w:sz w:val="21"/>
+                <w:szCs w:val="21"/>
+              </w:rPr>
+              <w:t xml:space="preserve">Camadas Silver e Gold, web scraping (BeautifulSoup), dashboard interativo com cache, estado de sessão e upload/download</w:t>
+            </w:r>
+          </w:p>
+        </w:tc>
+        <w:tc>
+          <w:tcPr>
+            <w:tcW w:w="2100" w:type="dxa"/>
+            <w:tcBorders>
+              <w:top w:val="single" w:sz="4" w:space="0" w:color="000000"/>
+              <w:start w:val="single" w:sz="4" w:space="0" w:color="000000"/>
+              <w:bottom w:val="single" w:sz="4" w:space="0" w:color="000000"/>
+              <w:end w:val="single" w:sz="4" w:space="0" w:color="000000"/>
+            </w:tcBorders>
+          </w:tcPr>
+          <w:p>
+            <w:pPr>
+              <w:pStyle w:val="Normal"/>
+              <w:jc w:val="start"/>
+              <w:rPr/>
+            </w:pPr>
+            <w:r>
+              <w:rPr>
+                <w:b w:val="false"/>
+                <w:bCs w:val="false"/>
+                <w:color w:val="000000"/>
+                <w:sz w:val="21"/>
+                <w:szCs w:val="21"/>
+              </w:rPr>
+              <w:t xml:space="preserve">Concluído</w:t>
+            </w:r>
+          </w:p>
+        </w:tc>
+      </w:tr>
+      <w:tr>
+        <w:trPr>
+          <w:cantSplit w:val="true"/>
+        </w:trPr>
+        <w:tc>
+          <w:tcPr>
+            <w:tcW w:w="1200" w:type="dxa"/>
+            <w:tcBorders>
+              <w:top w:val="single" w:sz="4" w:space="0" w:color="000000"/>
+              <w:start w:val="single" w:sz="4" w:space="0" w:color="000000"/>
+              <w:bottom w:val="single" w:sz="4" w:space="0" w:color="000000"/>
+              <w:end w:val="single" w:sz="4" w:space="0" w:color="000000"/>
+            </w:tcBorders>
+            <w:shd w:fill="F2F2F2" w:val="clear"/>
+          </w:tcPr>
+          <w:p>
+            <w:pPr>
+              <w:pStyle w:val="Normal"/>
+              <w:jc w:val="start"/>
+              <w:rPr/>
+            </w:pPr>
+            <w:r>
+              <w:rPr>
+                <w:b w:val="false"/>
+                <w:bCs w:val="false"/>
+                <w:color w:val="000000"/>
+                <w:sz w:val="21"/>
+                <w:szCs w:val="21"/>
+              </w:rPr>
+              <w:t xml:space="preserve">TP3</w:t>
+            </w:r>
+          </w:p>
+        </w:tc>
+        <w:tc>
+          <w:tcPr>
+            <w:tcW w:w="6060" w:type="dxa"/>
+            <w:tcBorders>
+              <w:top w:val="single" w:sz="4" w:space="0" w:color="000000"/>
+              <w:start w:val="single" w:sz="4" w:space="0" w:color="000000"/>
+              <w:bottom w:val="single" w:sz="4" w:space="0" w:color="000000"/>
+              <w:end w:val="single" w:sz="4" w:space="0" w:color="000000"/>
+            </w:tcBorders>
+            <w:shd w:fill="F2F2F2" w:val="clear"/>
+          </w:tcPr>
+          <w:p>
+            <w:pPr>
+              <w:pStyle w:val="Normal"/>
+              <w:jc w:val="start"/>
+              <w:rPr/>
+            </w:pPr>
+            <w:r>
+              <w:rPr>
+                <w:b w:val="false"/>
+                <w:bCs w:val="false"/>
+                <w:color w:val="000000"/>
+                <w:sz w:val="21"/>
+                <w:szCs w:val="21"/>
+              </w:rPr>
+              <w:t xml:space="preserve">Múltiplas páginas, adesão ao ICMS (CONFAZ), scraping dinâmico se necessário (Selenium), API própria (FastAPI)</w:t>
+            </w:r>
+          </w:p>
+        </w:tc>
+        <w:tc>
+          <w:tcPr>
+            <w:tcW w:w="2100" w:type="dxa"/>
+            <w:tcBorders>
+              <w:top w:val="single" w:sz="4" w:space="0" w:color="000000"/>
+              <w:start w:val="single" w:sz="4" w:space="0" w:color="000000"/>
+              <w:bottom w:val="single" w:sz="4" w:space="0" w:color="000000"/>
+              <w:end w:val="single" w:sz="4" w:space="0" w:color="000000"/>
+            </w:tcBorders>
+            <w:shd w:fill="F2F2F2" w:val="clear"/>
+          </w:tcPr>
+          <w:p>
+            <w:pPr>
+              <w:pStyle w:val="Normal"/>
+              <w:jc w:val="start"/>
+              <w:rPr/>
+            </w:pPr>
+            <w:r>
+              <w:rPr>
+                <w:b w:val="false"/>
+                <w:bCs w:val="false"/>
+                <w:color w:val="000000"/>
+                <w:sz w:val="21"/>
+                <w:szCs w:val="21"/>
+              </w:rPr>
+              <w:t xml:space="preserve">Planejado</w:t>
+            </w:r>
+          </w:p>
+        </w:tc>
+      </w:tr>
+      <w:tr>
+        <w:trPr>
+          <w:cantSplit w:val="true"/>
+        </w:trPr>
+        <w:tc>
+          <w:tcPr>
+            <w:tcW w:w="1200" w:type="dxa"/>
+            <w:tcBorders>
+              <w:top w:val="single" w:sz="4" w:space="0" w:color="000000"/>
+              <w:start w:val="single" w:sz="4" w:space="0" w:color="000000"/>
+              <w:bottom w:val="single" w:sz="4" w:space="0" w:color="000000"/>
+              <w:end w:val="single" w:sz="4" w:space="0" w:color="000000"/>
+            </w:tcBorders>
+          </w:tcPr>
+          <w:p>
+            <w:pPr>
+              <w:pStyle w:val="Normal"/>
+              <w:jc w:val="start"/>
+              <w:rPr/>
+            </w:pPr>
+            <w:r>
+              <w:rPr>
+                <w:b w:val="false"/>
+                <w:bCs w:val="false"/>
+                <w:color w:val="000000"/>
+                <w:sz w:val="21"/>
+                <w:szCs w:val="21"/>
+              </w:rPr>
+              <w:t xml:space="preserve">TP4</w:t>
+            </w:r>
+          </w:p>
+        </w:tc>
+        <w:tc>
+          <w:tcPr>
+            <w:tcW w:w="6060" w:type="dxa"/>
+            <w:tcBorders>
+              <w:top w:val="single" w:sz="4" w:space="0" w:color="000000"/>
+              <w:start w:val="single" w:sz="4" w:space="0" w:color="000000"/>
+              <w:bottom w:val="single" w:sz="4" w:space="0" w:color="000000"/>
+              <w:end w:val="single" w:sz="4" w:space="0" w:color="000000"/>
+            </w:tcBorders>
+          </w:tcPr>
+          <w:p>
+            <w:pPr>
+              <w:pStyle w:val="Normal"/>
+              <w:jc w:val="start"/>
+              <w:rPr/>
+            </w:pPr>
+            <w:r>
+              <w:rPr>
+                <w:b w:val="false"/>
+                <w:bCs w:val="false"/>
+                <w:color w:val="000000"/>
+                <w:sz w:val="21"/>
+                <w:szCs w:val="21"/>
+              </w:rPr>
+              <w:t xml:space="preserve">LLM local via HuggingFace/Transformers: resumo e sentimento do corpus de notícias</w:t>
+            </w:r>
+          </w:p>
+        </w:tc>
+        <w:tc>
+          <w:tcPr>
+            <w:tcW w:w="2100" w:type="dxa"/>
+            <w:tcBorders>
+              <w:top w:val="single" w:sz="4" w:space="0" w:color="000000"/>
+              <w:start w:val="single" w:sz="4" w:space="0" w:color="000000"/>
+              <w:bottom w:val="single" w:sz="4" w:space="0" w:color="000000"/>
+              <w:end w:val="single" w:sz="4" w:space="0" w:color="000000"/>
+            </w:tcBorders>
+          </w:tcPr>
+          <w:p>
+            <w:pPr>
+              <w:pStyle w:val="Normal"/>
+              <w:jc w:val="start"/>
+              <w:rPr/>
+            </w:pPr>
+            <w:r>
+              <w:rPr>
+                <w:b w:val="false"/>
+                <w:bCs w:val="false"/>
+                <w:color w:val="000000"/>
+                <w:sz w:val="21"/>
+                <w:szCs w:val="21"/>
+              </w:rPr>
+              <w:t xml:space="preserve">Planejado</w:t>
+            </w:r>
+          </w:p>
+        </w:tc>
+      </w:tr>
+      <w:tr>
+        <w:trPr>
+          <w:cantSplit w:val="true"/>
+        </w:trPr>
+        <w:tc>
+          <w:tcPr>
+            <w:tcW w:w="1200" w:type="dxa"/>
+            <w:tcBorders>
+              <w:top w:val="single" w:sz="4" w:space="0" w:color="000000"/>
+              <w:start w:val="single" w:sz="4" w:space="0" w:color="000000"/>
+              <w:bottom w:val="single" w:sz="4" w:space="0" w:color="000000"/>
+              <w:end w:val="single" w:sz="4" w:space="0" w:color="000000"/>
+            </w:tcBorders>
+            <w:shd w:fill="F2F2F2" w:val="clear"/>
+          </w:tcPr>
+          <w:p>
+            <w:pPr>
+              <w:pStyle w:val="Normal"/>
+              <w:jc w:val="start"/>
+              <w:rPr/>
+            </w:pPr>
+            <w:r>
+              <w:rPr>
+                <w:b w:val="false"/>
+                <w:bCs w:val="false"/>
+                <w:color w:val="000000"/>
+                <w:sz w:val="21"/>
+                <w:szCs w:val="21"/>
+              </w:rPr>
+              <w:t xml:space="preserve">TP5</w:t>
+            </w:r>
+          </w:p>
+        </w:tc>
+        <w:tc>
+          <w:tcPr>
+            <w:tcW w:w="6060" w:type="dxa"/>
+            <w:tcBorders>
+              <w:top w:val="single" w:sz="4" w:space="0" w:color="000000"/>
+              <w:start w:val="single" w:sz="4" w:space="0" w:color="000000"/>
+              <w:bottom w:val="single" w:sz="4" w:space="0" w:color="000000"/>
+              <w:end w:val="single" w:sz="4" w:space="0" w:color="000000"/>
+            </w:tcBorders>
+            <w:shd w:fill="F2F2F2" w:val="clear"/>
+          </w:tcPr>
+          <w:p>
+            <w:pPr>
+              <w:pStyle w:val="Normal"/>
+              <w:jc w:val="start"/>
+              <w:rPr/>
+            </w:pPr>
+            <w:r>
+              <w:rPr>
+                <w:b w:val="false"/>
+                <w:bCs w:val="false"/>
+                <w:color w:val="000000"/>
+                <w:sz w:val="21"/>
+                <w:szCs w:val="21"/>
+              </w:rPr>
+              <w:t xml:space="preserve">Agente inteligente de recomendação + dashboard final consolidado</w:t>
+            </w:r>
+          </w:p>
+        </w:tc>
+        <w:tc>
+          <w:tcPr>
+            <w:tcW w:w="2100" w:type="dxa"/>
+            <w:tcBorders>
+              <w:top w:val="single" w:sz="4" w:space="0" w:color="000000"/>
+              <w:start w:val="single" w:sz="4" w:space="0" w:color="000000"/>
+              <w:bottom w:val="single" w:sz="4" w:space="0" w:color="000000"/>
+              <w:end w:val="single" w:sz="4" w:space="0" w:color="000000"/>
+            </w:tcBorders>
+            <w:shd w:fill="F2F2F2" w:val="clear"/>
+          </w:tcPr>
+          <w:p>
+            <w:pPr>
+              <w:pStyle w:val="Normal"/>
+              <w:jc w:val="start"/>
+              <w:rPr/>
+            </w:pPr>
+            <w:r>
+              <w:rPr>
+                <w:b w:val="false"/>
+                <w:bCs w:val="false"/>
+                <w:color w:val="000000"/>
+                <w:sz w:val="21"/>
+                <w:szCs w:val="21"/>
+              </w:rPr>
+              <w:t xml:space="preserve">Planejado</w:t>
             </w:r>
           </w:p>
         </w:tc>
@@ -900,95 +2179,7 @@
         <w:rPr>
           <w:color w:val="2E7D32"/>
         </w:rPr>
-        <w:t>5. Público-Alvo</w:t>
-      </w:r>
-    </w:p>
-    <w:p>
-      <w:pPr>
-        <w:pStyle w:val="ListParagraph"/>
-        <w:numPr>
-          <w:ilvl w:val="0"/>
-          <w:numId w:val="3"/>
-        </w:numPr>
-        <w:spacing w:before="0" w:after="80"/>
-        <w:rPr/>
-      </w:pPr>
-      <w:r>
-        <w:rPr>
-          <w:sz w:val="22"/>
-          <w:szCs w:val="22"/>
-        </w:rPr>
-        <w:t>Formuladores de política energética estadual (secretarias de energia e meio ambiente)</w:t>
-      </w:r>
-    </w:p>
-    <w:p>
-      <w:pPr>
-        <w:pStyle w:val="ListParagraph"/>
-        <w:numPr>
-          <w:ilvl w:val="0"/>
-          <w:numId w:val="1"/>
-        </w:numPr>
-        <w:spacing w:before="0" w:after="80"/>
-        <w:rPr/>
-      </w:pPr>
-      <w:r>
-        <w:rPr>
-          <w:sz w:val="22"/>
-          <w:szCs w:val="22"/>
-        </w:rPr>
-        <w:t>Empresas do setor solar avaliando onde expandir operação</w:t>
-      </w:r>
-    </w:p>
-    <w:p>
-      <w:pPr>
-        <w:pStyle w:val="ListParagraph"/>
-        <w:numPr>
-          <w:ilvl w:val="0"/>
-          <w:numId w:val="1"/>
-        </w:numPr>
-        <w:spacing w:before="0" w:after="80"/>
-        <w:rPr/>
-      </w:pPr>
-      <w:r>
-        <w:rPr>
-          <w:sz w:val="22"/>
-          <w:szCs w:val="22"/>
-        </w:rPr>
-        <w:t>ONGs de justiça e transição energética</w:t>
-      </w:r>
-    </w:p>
-    <w:p>
-      <w:pPr>
-        <w:pStyle w:val="ListParagraph"/>
-        <w:numPr>
-          <w:ilvl w:val="0"/>
-          <w:numId w:val="1"/>
-        </w:numPr>
-        <w:spacing w:before="0" w:after="80"/>
-        <w:rPr/>
-      </w:pPr>
-      <w:r>
-        <w:rPr>
-          <w:sz w:val="22"/>
-          <w:szCs w:val="22"/>
-        </w:rPr>
-        <w:t>Pesquisadores e jornalistas de dados cobrindo o tema</w:t>
-      </w:r>
-    </w:p>
-    <w:p>
-      <w:pPr>
-        <w:pStyle w:val="Heading1"/>
-        <w:pBdr>
-          <w:bottom w:val="single" w:sz="6" w:space="4" w:color="2E7D32"/>
-        </w:pBdr>
-        <w:spacing w:before="320" w:after="160"/>
-        <w:rPr/>
-      </w:pPr>
-      <w:r>
-        <w:rPr>
-          <w:color w:val="2E7D32"/>
-        </w:rPr>
-        <w:t>6. Stakeholders do Projeto</w:t>
+        <w:t>8. Principais Decisões e Riscos</w:t>
       </w:r>
     </w:p>
     <w:tbl>
@@ -1005,8 +2196,9 @@
         </w:tblCellMar>
       </w:tblPr>
       <w:tblGrid>
-        <w:gridCol w:w="4680"/>
-        <w:gridCol w:w="4680"/>
+        <w:gridCol w:w="2800"/>
+        <w:gridCol w:w="1400"/>
+        <w:gridCol w:w="5160"/>
       </w:tblGrid>
       <w:tr>
         <w:trPr>
@@ -1015,7 +2207,7 @@
         </w:trPr>
         <w:tc>
           <w:tcPr>
-            <w:tcW w:w="4680" w:type="dxa"/>
+            <w:tcW w:w="2800" w:type="dxa"/>
             <w:tcBorders>
               <w:top w:val="single" w:sz="4" w:space="0" w:color="000000"/>
               <w:start w:val="single" w:sz="4" w:space="0" w:color="000000"/>
@@ -1038,13 +2230,13 @@
                 <w:sz w:val="21"/>
                 <w:szCs w:val="21"/>
               </w:rPr>
-              <w:t>Stakeholder</w:t>
-            </w:r>
-          </w:p>
-        </w:tc>
-        <w:tc>
-          <w:tcPr>
-            <w:tcW w:w="4680" w:type="dxa"/>
+              <w:t xml:space="preserve">Item</w:t>
+            </w:r>
+          </w:p>
+        </w:tc>
+        <w:tc>
+          <w:tcPr>
+            <w:tcW w:w="1400" w:type="dxa"/>
             <w:tcBorders>
               <w:top w:val="single" w:sz="4" w:space="0" w:color="000000"/>
               <w:start w:val="single" w:sz="4" w:space="0" w:color="000000"/>
@@ -1067,7 +2259,36 @@
                 <w:sz w:val="21"/>
                 <w:szCs w:val="21"/>
               </w:rPr>
-              <w:t>Papel no Projeto</w:t>
+              <w:t xml:space="preserve">Tipo</w:t>
+            </w:r>
+          </w:p>
+        </w:tc>
+        <w:tc>
+          <w:tcPr>
+            <w:tcW w:w="5160" w:type="dxa"/>
+            <w:tcBorders>
+              <w:top w:val="single" w:sz="4" w:space="0" w:color="000000"/>
+              <w:start w:val="single" w:sz="4" w:space="0" w:color="000000"/>
+              <w:bottom w:val="single" w:sz="4" w:space="0" w:color="000000"/>
+              <w:end w:val="single" w:sz="4" w:space="0" w:color="000000"/>
+            </w:tcBorders>
+            <w:shd w:fill="2E7D32" w:val="clear"/>
+          </w:tcPr>
+          <w:p>
+            <w:pPr>
+              <w:pStyle w:val="Normal"/>
+              <w:jc w:val="start"/>
+              <w:rPr/>
+            </w:pPr>
+            <w:r>
+              <w:rPr>
+                <w:b/>
+                <w:bCs/>
+                <w:color w:val="FFFFFF"/>
+                <w:sz w:val="21"/>
+                <w:szCs w:val="21"/>
+              </w:rPr>
+              <w:t xml:space="preserve">Tratamento</w:t>
             </w:r>
           </w:p>
         </w:tc>
@@ -1078,7 +2299,7 @@
         </w:trPr>
         <w:tc>
           <w:tcPr>
-            <w:tcW w:w="4680" w:type="dxa"/>
+            <w:tcW w:w="2800" w:type="dxa"/>
             <w:tcBorders>
               <w:top w:val="single" w:sz="4" w:space="0" w:color="000000"/>
               <w:start w:val="single" w:sz="4" w:space="0" w:color="000000"/>
@@ -1101,13 +2322,13 @@
                 <w:sz w:val="21"/>
                 <w:szCs w:val="21"/>
               </w:rPr>
-              <w:t>Professor / avaliador do curso</w:t>
-            </w:r>
-          </w:p>
-        </w:tc>
-        <w:tc>
-          <w:tcPr>
-            <w:tcW w:w="4680" w:type="dxa"/>
+              <w:t xml:space="preserve">Registros do Maranhão sem fonte de geração (73 mil)</w:t>
+            </w:r>
+          </w:p>
+        </w:tc>
+        <w:tc>
+          <w:tcPr>
+            <w:tcW w:w="1400" w:type="dxa"/>
             <w:tcBorders>
               <w:top w:val="single" w:sz="4" w:space="0" w:color="000000"/>
               <w:start w:val="single" w:sz="4" w:space="0" w:color="000000"/>
@@ -1130,7 +2351,36 @@
                 <w:sz w:val="21"/>
                 <w:szCs w:val="21"/>
               </w:rPr>
-              <w:t>Avalia entregas técnicas e documentação em cada TP</w:t>
+              <w:t xml:space="preserve">Decisão</w:t>
+            </w:r>
+          </w:p>
+        </w:tc>
+        <w:tc>
+          <w:tcPr>
+            <w:tcW w:w="5160" w:type="dxa"/>
+            <w:tcBorders>
+              <w:top w:val="single" w:sz="4" w:space="0" w:color="000000"/>
+              <w:start w:val="single" w:sz="4" w:space="0" w:color="000000"/>
+              <w:bottom w:val="single" w:sz="4" w:space="0" w:color="000000"/>
+              <w:end w:val="single" w:sz="4" w:space="0" w:color="000000"/>
+            </w:tcBorders>
+            <w:shd w:fill="F2F2F2" w:val="clear"/>
+          </w:tcPr>
+          <w:p>
+            <w:pPr>
+              <w:pStyle w:val="Normal"/>
+              <w:jc w:val="start"/>
+              <w:rPr/>
+            </w:pPr>
+            <w:r>
+              <w:rPr>
+                <w:b w:val="false"/>
+                <w:bCs w:val="false"/>
+                <w:color w:val="000000"/>
+                <w:sz w:val="21"/>
+                <w:szCs w:val="21"/>
+              </w:rPr>
+              <w:t xml:space="preserve">Imputados como solares, com marcação. O dashboard alterna entre a visão corrigida e o critério ANEEL (Data Summary Report, seções 3.4 e 3.6).</w:t>
             </w:r>
           </w:p>
         </w:tc>
@@ -1141,57 +2391,85 @@
         </w:trPr>
         <w:tc>
           <w:tcPr>
-            <w:tcW w:w="4680" w:type="dxa"/>
-            <w:tcBorders>
-              <w:top w:val="single" w:sz="4" w:space="0" w:color="000000"/>
-              <w:start w:val="single" w:sz="4" w:space="0" w:color="000000"/>
-              <w:bottom w:val="single" w:sz="4" w:space="0" w:color="000000"/>
-              <w:end w:val="single" w:sz="4" w:space="0" w:color="000000"/>
-            </w:tcBorders>
-          </w:tcPr>
-          <w:p>
-            <w:pPr>
-              <w:pStyle w:val="Normal"/>
-              <w:jc w:val="start"/>
-              <w:rPr/>
-            </w:pPr>
-            <w:r>
-              <w:rPr>
-                <w:b w:val="false"/>
-                <w:bCs w:val="false"/>
-                <w:color w:val="000000"/>
-                <w:sz w:val="21"/>
-                <w:szCs w:val="21"/>
-              </w:rPr>
-              <w:t>Pâmela Lima Ziliotto</w:t>
-            </w:r>
-          </w:p>
-        </w:tc>
-        <w:tc>
-          <w:tcPr>
-            <w:tcW w:w="4680" w:type="dxa"/>
-            <w:tcBorders>
-              <w:top w:val="single" w:sz="4" w:space="0" w:color="000000"/>
-              <w:start w:val="single" w:sz="4" w:space="0" w:color="000000"/>
-              <w:bottom w:val="single" w:sz="4" w:space="0" w:color="000000"/>
-              <w:end w:val="single" w:sz="4" w:space="0" w:color="000000"/>
-            </w:tcBorders>
-          </w:tcPr>
-          <w:p>
-            <w:pPr>
-              <w:pStyle w:val="Normal"/>
-              <w:jc w:val="start"/>
-              <w:rPr/>
-            </w:pPr>
-            <w:r>
-              <w:rPr>
-                <w:b w:val="false"/>
-                <w:bCs w:val="false"/>
-                <w:color w:val="000000"/>
-                <w:sz w:val="21"/>
-                <w:szCs w:val="21"/>
-              </w:rPr>
-              <w:t>Desenvolvedora e responsável pelo projeto</w:t>
+            <w:tcW w:w="2800" w:type="dxa"/>
+            <w:tcBorders>
+              <w:top w:val="single" w:sz="4" w:space="0" w:color="000000"/>
+              <w:start w:val="single" w:sz="4" w:space="0" w:color="000000"/>
+              <w:bottom w:val="single" w:sz="4" w:space="0" w:color="000000"/>
+              <w:end w:val="single" w:sz="4" w:space="0" w:color="000000"/>
+            </w:tcBorders>
+          </w:tcPr>
+          <w:p>
+            <w:pPr>
+              <w:pStyle w:val="Normal"/>
+              <w:jc w:val="start"/>
+              <w:rPr/>
+            </w:pPr>
+            <w:r>
+              <w:rPr>
+                <w:b w:val="false"/>
+                <w:bCs w:val="false"/>
+                <w:color w:val="000000"/>
+                <w:sz w:val="21"/>
+                <w:szCs w:val="21"/>
+              </w:rPr>
+              <w:t xml:space="preserve">Divergência de potência com o painel oficial (6,3%)</w:t>
+            </w:r>
+          </w:p>
+        </w:tc>
+        <w:tc>
+          <w:tcPr>
+            <w:tcW w:w="1400" w:type="dxa"/>
+            <w:tcBorders>
+              <w:top w:val="single" w:sz="4" w:space="0" w:color="000000"/>
+              <w:start w:val="single" w:sz="4" w:space="0" w:color="000000"/>
+              <w:bottom w:val="single" w:sz="4" w:space="0" w:color="000000"/>
+              <w:end w:val="single" w:sz="4" w:space="0" w:color="000000"/>
+            </w:tcBorders>
+          </w:tcPr>
+          <w:p>
+            <w:pPr>
+              <w:pStyle w:val="Normal"/>
+              <w:jc w:val="start"/>
+              <w:rPr/>
+            </w:pPr>
+            <w:r>
+              <w:rPr>
+                <w:b w:val="false"/>
+                <w:bCs w:val="false"/>
+                <w:color w:val="000000"/>
+                <w:sz w:val="21"/>
+                <w:szCs w:val="21"/>
+              </w:rPr>
+              <w:t xml:space="preserve">Risco</w:t>
+            </w:r>
+          </w:p>
+        </w:tc>
+        <w:tc>
+          <w:tcPr>
+            <w:tcW w:w="5160" w:type="dxa"/>
+            <w:tcBorders>
+              <w:top w:val="single" w:sz="4" w:space="0" w:color="000000"/>
+              <w:start w:val="single" w:sz="4" w:space="0" w:color="000000"/>
+              <w:bottom w:val="single" w:sz="4" w:space="0" w:color="000000"/>
+              <w:end w:val="single" w:sz="4" w:space="0" w:color="000000"/>
+            </w:tcBorders>
+          </w:tcPr>
+          <w:p>
+            <w:pPr>
+              <w:pStyle w:val="Normal"/>
+              <w:jc w:val="start"/>
+              <w:rPr/>
+            </w:pPr>
+            <w:r>
+              <w:rPr>
+                <w:b w:val="false"/>
+                <w:bCs w:val="false"/>
+                <w:color w:val="000000"/>
+                <w:sz w:val="21"/>
+                <w:szCs w:val="21"/>
+              </w:rPr>
+              <w:t xml:space="preserve">Registrada como pendência. A contagem de empreendimentos, com diferença de 1,2%, valida o pipeline.</w:t>
             </w:r>
           </w:p>
         </w:tc>
@@ -1202,7 +2480,7 @@
         </w:trPr>
         <w:tc>
           <w:tcPr>
-            <w:tcW w:w="4680" w:type="dxa"/>
+            <w:tcW w:w="2800" w:type="dxa"/>
             <w:tcBorders>
               <w:top w:val="single" w:sz="4" w:space="0" w:color="000000"/>
               <w:start w:val="single" w:sz="4" w:space="0" w:color="000000"/>
@@ -1225,13 +2503,13 @@
                 <w:sz w:val="21"/>
                 <w:szCs w:val="21"/>
               </w:rPr>
-              <w:t>Usuário final (políticas públicas / setor solar)</w:t>
-            </w:r>
-          </w:p>
-        </w:tc>
-        <w:tc>
-          <w:tcPr>
-            <w:tcW w:w="4680" w:type="dxa"/>
+              <w:t xml:space="preserve">Bloqueio geográfico do portal da ANEEL</w:t>
+            </w:r>
+          </w:p>
+        </w:tc>
+        <w:tc>
+          <w:tcPr>
+            <w:tcW w:w="1400" w:type="dxa"/>
             <w:tcBorders>
               <w:top w:val="single" w:sz="4" w:space="0" w:color="000000"/>
               <w:start w:val="single" w:sz="4" w:space="0" w:color="000000"/>
@@ -1254,7 +2532,217 @@
                 <w:sz w:val="21"/>
                 <w:szCs w:val="21"/>
               </w:rPr>
-              <w:t>Consome os insights do dashboard para decisão</w:t>
+              <w:t xml:space="preserve">Risco</w:t>
+            </w:r>
+          </w:p>
+        </w:tc>
+        <w:tc>
+          <w:tcPr>
+            <w:tcW w:w="5160" w:type="dxa"/>
+            <w:tcBorders>
+              <w:top w:val="single" w:sz="4" w:space="0" w:color="000000"/>
+              <w:start w:val="single" w:sz="4" w:space="0" w:color="000000"/>
+              <w:bottom w:val="single" w:sz="4" w:space="0" w:color="000000"/>
+              <w:end w:val="single" w:sz="4" w:space="0" w:color="000000"/>
+            </w:tcBorders>
+            <w:shd w:fill="F2F2F2" w:val="clear"/>
+          </w:tcPr>
+          <w:p>
+            <w:pPr>
+              <w:pStyle w:val="Normal"/>
+              <w:jc w:val="start"/>
+              <w:rPr/>
+            </w:pPr>
+            <w:r>
+              <w:rPr>
+                <w:b w:val="false"/>
+                <w:bCs w:val="false"/>
+                <w:color w:val="000000"/>
+                <w:sz w:val="21"/>
+                <w:szCs w:val="21"/>
+              </w:rPr>
+              <w:t xml:space="preserve">Camada Gold versionada: o dashboard roda sem a base completa.</w:t>
+            </w:r>
+          </w:p>
+        </w:tc>
+      </w:tr>
+      <w:tr>
+        <w:trPr>
+          <w:cantSplit w:val="true"/>
+        </w:trPr>
+        <w:tc>
+          <w:tcPr>
+            <w:tcW w:w="2800" w:type="dxa"/>
+            <w:tcBorders>
+              <w:top w:val="single" w:sz="4" w:space="0" w:color="000000"/>
+              <w:start w:val="single" w:sz="4" w:space="0" w:color="000000"/>
+              <w:bottom w:val="single" w:sz="4" w:space="0" w:color="000000"/>
+              <w:end w:val="single" w:sz="4" w:space="0" w:color="000000"/>
+            </w:tcBorders>
+          </w:tcPr>
+          <w:p>
+            <w:pPr>
+              <w:pStyle w:val="Normal"/>
+              <w:jc w:val="start"/>
+              <w:rPr/>
+            </w:pPr>
+            <w:r>
+              <w:rPr>
+                <w:b w:val="false"/>
+                <w:bCs w:val="false"/>
+                <w:color w:val="000000"/>
+                <w:sz w:val="21"/>
+                <w:szCs w:val="21"/>
+              </w:rPr>
+              <w:t xml:space="preserve">Dependência de site externo no web scraping</w:t>
+            </w:r>
+          </w:p>
+        </w:tc>
+        <w:tc>
+          <w:tcPr>
+            <w:tcW w:w="1400" w:type="dxa"/>
+            <w:tcBorders>
+              <w:top w:val="single" w:sz="4" w:space="0" w:color="000000"/>
+              <w:start w:val="single" w:sz="4" w:space="0" w:color="000000"/>
+              <w:bottom w:val="single" w:sz="4" w:space="0" w:color="000000"/>
+              <w:end w:val="single" w:sz="4" w:space="0" w:color="000000"/>
+            </w:tcBorders>
+          </w:tcPr>
+          <w:p>
+            <w:pPr>
+              <w:pStyle w:val="Normal"/>
+              <w:jc w:val="start"/>
+              <w:rPr/>
+            </w:pPr>
+            <w:r>
+              <w:rPr>
+                <w:b w:val="false"/>
+                <w:bCs w:val="false"/>
+                <w:color w:val="000000"/>
+                <w:sz w:val="21"/>
+                <w:szCs w:val="21"/>
+              </w:rPr>
+              <w:t xml:space="preserve">Risco</w:t>
+            </w:r>
+          </w:p>
+        </w:tc>
+        <w:tc>
+          <w:tcPr>
+            <w:tcW w:w="5160" w:type="dxa"/>
+            <w:tcBorders>
+              <w:top w:val="single" w:sz="4" w:space="0" w:color="000000"/>
+              <w:start w:val="single" w:sz="4" w:space="0" w:color="000000"/>
+              <w:bottom w:val="single" w:sz="4" w:space="0" w:color="000000"/>
+              <w:end w:val="single" w:sz="4" w:space="0" w:color="000000"/>
+            </w:tcBorders>
+          </w:tcPr>
+          <w:p>
+            <w:pPr>
+              <w:pStyle w:val="Normal"/>
+              <w:jc w:val="start"/>
+              <w:rPr/>
+            </w:pPr>
+            <w:r>
+              <w:rPr>
+                <w:b w:val="false"/>
+                <w:bCs w:val="false"/>
+                <w:color w:val="000000"/>
+                <w:sz w:val="21"/>
+                <w:szCs w:val="21"/>
+              </w:rPr>
+              <w:t xml:space="preserve">HTML salvo em cache local e extração independente das classes CSS do site.</w:t>
+            </w:r>
+          </w:p>
+        </w:tc>
+      </w:tr>
+      <w:tr>
+        <w:trPr>
+          <w:cantSplit w:val="true"/>
+        </w:trPr>
+        <w:tc>
+          <w:tcPr>
+            <w:tcW w:w="2800" w:type="dxa"/>
+            <w:tcBorders>
+              <w:top w:val="single" w:sz="4" w:space="0" w:color="000000"/>
+              <w:start w:val="single" w:sz="4" w:space="0" w:color="000000"/>
+              <w:bottom w:val="single" w:sz="4" w:space="0" w:color="000000"/>
+              <w:end w:val="single" w:sz="4" w:space="0" w:color="000000"/>
+            </w:tcBorders>
+            <w:shd w:fill="F2F2F2" w:val="clear"/>
+          </w:tcPr>
+          <w:p>
+            <w:pPr>
+              <w:pStyle w:val="Normal"/>
+              <w:jc w:val="start"/>
+              <w:rPr/>
+            </w:pPr>
+            <w:r>
+              <w:rPr>
+                <w:b w:val="false"/>
+                <w:bCs w:val="false"/>
+                <w:color w:val="000000"/>
+                <w:sz w:val="21"/>
+                <w:szCs w:val="21"/>
+              </w:rPr>
+              <w:t xml:space="preserve">Dados pessoais na base da ANEEL</w:t>
+            </w:r>
+          </w:p>
+        </w:tc>
+        <w:tc>
+          <w:tcPr>
+            <w:tcW w:w="1400" w:type="dxa"/>
+            <w:tcBorders>
+              <w:top w:val="single" w:sz="4" w:space="0" w:color="000000"/>
+              <w:start w:val="single" w:sz="4" w:space="0" w:color="000000"/>
+              <w:bottom w:val="single" w:sz="4" w:space="0" w:color="000000"/>
+              <w:end w:val="single" w:sz="4" w:space="0" w:color="000000"/>
+            </w:tcBorders>
+            <w:shd w:fill="F2F2F2" w:val="clear"/>
+          </w:tcPr>
+          <w:p>
+            <w:pPr>
+              <w:pStyle w:val="Normal"/>
+              <w:jc w:val="start"/>
+              <w:rPr/>
+            </w:pPr>
+            <w:r>
+              <w:rPr>
+                <w:b w:val="false"/>
+                <w:bCs w:val="false"/>
+                <w:color w:val="000000"/>
+                <w:sz w:val="21"/>
+                <w:szCs w:val="21"/>
+              </w:rPr>
+              <w:t xml:space="preserve">Governança</w:t>
+            </w:r>
+          </w:p>
+        </w:tc>
+        <w:tc>
+          <w:tcPr>
+            <w:tcW w:w="5160" w:type="dxa"/>
+            <w:tcBorders>
+              <w:top w:val="single" w:sz="4" w:space="0" w:color="000000"/>
+              <w:start w:val="single" w:sz="4" w:space="0" w:color="000000"/>
+              <w:bottom w:val="single" w:sz="4" w:space="0" w:color="000000"/>
+              <w:end w:val="single" w:sz="4" w:space="0" w:color="000000"/>
+            </w:tcBorders>
+            <w:shd w:fill="F2F2F2" w:val="clear"/>
+          </w:tcPr>
+          <w:p>
+            <w:pPr>
+              <w:pStyle w:val="Normal"/>
+              <w:jc w:val="start"/>
+              <w:rPr/>
+            </w:pPr>
+            <w:r>
+              <w:rPr>
+                <w:b w:val="false"/>
+                <w:bCs w:val="false"/>
+                <w:color w:val="000000"/>
+                <w:sz w:val="21"/>
+                <w:szCs w:val="21"/>
+              </w:rPr>
+              <w:t xml:space="preserve">CPF/CNPJ e nome do titular excluídos na leitura; nunca carregados em memória.</w:t>
             </w:r>
           </w:p>
         </w:tc>
@@ -1273,416 +2761,7 @@
         <w:rPr>
           <w:color w:val="2E7D32"/>
         </w:rPr>
-        <w:t>7. Cronograma Macro (TDSP)</w:t>
-      </w:r>
-    </w:p>
-    <w:tbl>
-      <w:tblPr>
-        <w:tblW w:w="9360" w:type="dxa"/>
-        <w:jc w:val="start"/>
-        <w:tblInd w:w="0" w:type="dxa"/>
-        <w:tblLayout w:type="fixed"/>
-        <w:tblCellMar>
-          <w:top w:w="100" w:type="dxa"/>
-          <w:start w:w="120" w:type="dxa"/>
-          <w:bottom w:w="100" w:type="dxa"/>
-          <w:end w:w="120" w:type="dxa"/>
-        </w:tblCellMar>
-      </w:tblPr>
-      <w:tblGrid>
-        <w:gridCol w:w="4680"/>
-        <w:gridCol w:w="4680"/>
-      </w:tblGrid>
-      <w:tr>
-        <w:trPr>
-          <w:tblHeader w:val="true"/>
-          <w:cantSplit w:val="true"/>
-        </w:trPr>
-        <w:tc>
-          <w:tcPr>
-            <w:tcW w:w="4680" w:type="dxa"/>
-            <w:tcBorders>
-              <w:top w:val="single" w:sz="4" w:space="0" w:color="000000"/>
-              <w:start w:val="single" w:sz="4" w:space="0" w:color="000000"/>
-              <w:bottom w:val="single" w:sz="4" w:space="0" w:color="000000"/>
-              <w:end w:val="single" w:sz="4" w:space="0" w:color="000000"/>
-            </w:tcBorders>
-            <w:shd w:fill="2E7D32" w:val="clear"/>
-          </w:tcPr>
-          <w:p>
-            <w:pPr>
-              <w:pStyle w:val="Normal"/>
-              <w:jc w:val="start"/>
-              <w:rPr/>
-            </w:pPr>
-            <w:r>
-              <w:rPr>
-                <w:b/>
-                <w:bCs/>
-                <w:color w:val="FFFFFF"/>
-                <w:sz w:val="21"/>
-                <w:szCs w:val="21"/>
-              </w:rPr>
-              <w:t>Etapa</w:t>
-            </w:r>
-          </w:p>
-        </w:tc>
-        <w:tc>
-          <w:tcPr>
-            <w:tcW w:w="4680" w:type="dxa"/>
-            <w:tcBorders>
-              <w:top w:val="single" w:sz="4" w:space="0" w:color="000000"/>
-              <w:start w:val="single" w:sz="4" w:space="0" w:color="000000"/>
-              <w:bottom w:val="single" w:sz="4" w:space="0" w:color="000000"/>
-              <w:end w:val="single" w:sz="4" w:space="0" w:color="000000"/>
-            </w:tcBorders>
-            <w:shd w:fill="2E7D32" w:val="clear"/>
-          </w:tcPr>
-          <w:p>
-            <w:pPr>
-              <w:pStyle w:val="Normal"/>
-              <w:jc w:val="start"/>
-              <w:rPr/>
-            </w:pPr>
-            <w:r>
-              <w:rPr>
-                <w:b/>
-                <w:bCs/>
-                <w:color w:val="FFFFFF"/>
-                <w:sz w:val="21"/>
-                <w:szCs w:val="21"/>
-              </w:rPr>
-              <w:t>Foco Principal</w:t>
-            </w:r>
-          </w:p>
-        </w:tc>
-      </w:tr>
-      <w:tr>
-        <w:trPr>
-          <w:cantSplit w:val="true"/>
-        </w:trPr>
-        <w:tc>
-          <w:tcPr>
-            <w:tcW w:w="4680" w:type="dxa"/>
-            <w:tcBorders>
-              <w:top w:val="single" w:sz="4" w:space="0" w:color="000000"/>
-              <w:start w:val="single" w:sz="4" w:space="0" w:color="000000"/>
-              <w:bottom w:val="single" w:sz="4" w:space="0" w:color="000000"/>
-              <w:end w:val="single" w:sz="4" w:space="0" w:color="000000"/>
-            </w:tcBorders>
-            <w:shd w:fill="F2F2F2" w:val="clear"/>
-          </w:tcPr>
-          <w:p>
-            <w:pPr>
-              <w:pStyle w:val="Normal"/>
-              <w:jc w:val="start"/>
-              <w:rPr/>
-            </w:pPr>
-            <w:r>
-              <w:rPr>
-                <w:b w:val="false"/>
-                <w:bCs w:val="false"/>
-                <w:color w:val="000000"/>
-                <w:sz w:val="21"/>
-                <w:szCs w:val="21"/>
-              </w:rPr>
-              <w:t>TP1</w:t>
-            </w:r>
-          </w:p>
-        </w:tc>
-        <w:tc>
-          <w:tcPr>
-            <w:tcW w:w="4680" w:type="dxa"/>
-            <w:tcBorders>
-              <w:top w:val="single" w:sz="4" w:space="0" w:color="000000"/>
-              <w:start w:val="single" w:sz="4" w:space="0" w:color="000000"/>
-              <w:bottom w:val="single" w:sz="4" w:space="0" w:color="000000"/>
-              <w:end w:val="single" w:sz="4" w:space="0" w:color="000000"/>
-            </w:tcBorders>
-            <w:shd w:fill="F2F2F2" w:val="clear"/>
-          </w:tcPr>
-          <w:p>
-            <w:pPr>
-              <w:pStyle w:val="Normal"/>
-              <w:jc w:val="start"/>
-              <w:rPr/>
-            </w:pPr>
-            <w:r>
-              <w:rPr>
-                <w:b w:val="false"/>
-                <w:bCs w:val="false"/>
-                <w:color w:val="000000"/>
-                <w:sz w:val="21"/>
-                <w:szCs w:val="21"/>
-              </w:rPr>
-              <w:t>Fundação: problema de negócio, dados ANEEL/IBGE, demo Streamlit</w:t>
-            </w:r>
-          </w:p>
-        </w:tc>
-      </w:tr>
-      <w:tr>
-        <w:trPr>
-          <w:cantSplit w:val="true"/>
-        </w:trPr>
-        <w:tc>
-          <w:tcPr>
-            <w:tcW w:w="4680" w:type="dxa"/>
-            <w:tcBorders>
-              <w:top w:val="single" w:sz="4" w:space="0" w:color="000000"/>
-              <w:start w:val="single" w:sz="4" w:space="0" w:color="000000"/>
-              <w:bottom w:val="single" w:sz="4" w:space="0" w:color="000000"/>
-              <w:end w:val="single" w:sz="4" w:space="0" w:color="000000"/>
-            </w:tcBorders>
-          </w:tcPr>
-          <w:p>
-            <w:pPr>
-              <w:pStyle w:val="Normal"/>
-              <w:jc w:val="start"/>
-              <w:rPr/>
-            </w:pPr>
-            <w:r>
-              <w:rPr>
-                <w:b w:val="false"/>
-                <w:bCs w:val="false"/>
-                <w:color w:val="000000"/>
-                <w:sz w:val="21"/>
-                <w:szCs w:val="21"/>
-              </w:rPr>
-              <w:t>TP2</w:t>
-            </w:r>
-          </w:p>
-        </w:tc>
-        <w:tc>
-          <w:tcPr>
-            <w:tcW w:w="4680" w:type="dxa"/>
-            <w:tcBorders>
-              <w:top w:val="single" w:sz="4" w:space="0" w:color="000000"/>
-              <w:start w:val="single" w:sz="4" w:space="0" w:color="000000"/>
-              <w:bottom w:val="single" w:sz="4" w:space="0" w:color="000000"/>
-              <w:end w:val="single" w:sz="4" w:space="0" w:color="000000"/>
-            </w:tcBorders>
-          </w:tcPr>
-          <w:p>
-            <w:pPr>
-              <w:pStyle w:val="Normal"/>
-              <w:jc w:val="start"/>
-              <w:rPr/>
-            </w:pPr>
-            <w:r>
-              <w:rPr>
-                <w:b w:val="false"/>
-                <w:bCs w:val="false"/>
-                <w:color w:val="000000"/>
-                <w:sz w:val="21"/>
-                <w:szCs w:val="21"/>
-              </w:rPr>
-              <w:t>Interatividade, web scraping (BeautifulSoup), cache e upload de dados</w:t>
-            </w:r>
-          </w:p>
-        </w:tc>
-      </w:tr>
-      <w:tr>
-        <w:trPr>
-          <w:cantSplit w:val="true"/>
-        </w:trPr>
-        <w:tc>
-          <w:tcPr>
-            <w:tcW w:w="4680" w:type="dxa"/>
-            <w:tcBorders>
-              <w:top w:val="single" w:sz="4" w:space="0" w:color="000000"/>
-              <w:start w:val="single" w:sz="4" w:space="0" w:color="000000"/>
-              <w:bottom w:val="single" w:sz="4" w:space="0" w:color="000000"/>
-              <w:end w:val="single" w:sz="4" w:space="0" w:color="000000"/>
-            </w:tcBorders>
-            <w:shd w:fill="F2F2F2" w:val="clear"/>
-          </w:tcPr>
-          <w:p>
-            <w:pPr>
-              <w:pStyle w:val="Normal"/>
-              <w:jc w:val="start"/>
-              <w:rPr/>
-            </w:pPr>
-            <w:r>
-              <w:rPr>
-                <w:b w:val="false"/>
-                <w:bCs w:val="false"/>
-                <w:color w:val="000000"/>
-                <w:sz w:val="21"/>
-                <w:szCs w:val="21"/>
-              </w:rPr>
-              <w:t>TP3</w:t>
-            </w:r>
-          </w:p>
-        </w:tc>
-        <w:tc>
-          <w:tcPr>
-            <w:tcW w:w="4680" w:type="dxa"/>
-            <w:tcBorders>
-              <w:top w:val="single" w:sz="4" w:space="0" w:color="000000"/>
-              <w:start w:val="single" w:sz="4" w:space="0" w:color="000000"/>
-              <w:bottom w:val="single" w:sz="4" w:space="0" w:color="000000"/>
-              <w:end w:val="single" w:sz="4" w:space="0" w:color="000000"/>
-            </w:tcBorders>
-            <w:shd w:fill="F2F2F2" w:val="clear"/>
-          </w:tcPr>
-          <w:p>
-            <w:pPr>
-              <w:pStyle w:val="Normal"/>
-              <w:jc w:val="start"/>
-              <w:rPr/>
-            </w:pPr>
-            <w:r>
-              <w:rPr>
-                <w:b w:val="false"/>
-                <w:bCs w:val="false"/>
-                <w:color w:val="000000"/>
-                <w:sz w:val="21"/>
-                <w:szCs w:val="21"/>
-              </w:rPr>
-              <w:t>Múltiplas páginas, scraping dinâmico (Selenium), API própria (FastAPI)</w:t>
-            </w:r>
-          </w:p>
-        </w:tc>
-      </w:tr>
-      <w:tr>
-        <w:trPr>
-          <w:cantSplit w:val="true"/>
-        </w:trPr>
-        <w:tc>
-          <w:tcPr>
-            <w:tcW w:w="4680" w:type="dxa"/>
-            <w:tcBorders>
-              <w:top w:val="single" w:sz="4" w:space="0" w:color="000000"/>
-              <w:start w:val="single" w:sz="4" w:space="0" w:color="000000"/>
-              <w:bottom w:val="single" w:sz="4" w:space="0" w:color="000000"/>
-              <w:end w:val="single" w:sz="4" w:space="0" w:color="000000"/>
-            </w:tcBorders>
-          </w:tcPr>
-          <w:p>
-            <w:pPr>
-              <w:pStyle w:val="Normal"/>
-              <w:jc w:val="start"/>
-              <w:rPr/>
-            </w:pPr>
-            <w:r>
-              <w:rPr>
-                <w:b w:val="false"/>
-                <w:bCs w:val="false"/>
-                <w:color w:val="000000"/>
-                <w:sz w:val="21"/>
-                <w:szCs w:val="21"/>
-              </w:rPr>
-              <w:t>TP4</w:t>
-            </w:r>
-          </w:p>
-        </w:tc>
-        <w:tc>
-          <w:tcPr>
-            <w:tcW w:w="4680" w:type="dxa"/>
-            <w:tcBorders>
-              <w:top w:val="single" w:sz="4" w:space="0" w:color="000000"/>
-              <w:start w:val="single" w:sz="4" w:space="0" w:color="000000"/>
-              <w:bottom w:val="single" w:sz="4" w:space="0" w:color="000000"/>
-              <w:end w:val="single" w:sz="4" w:space="0" w:color="000000"/>
-            </w:tcBorders>
-          </w:tcPr>
-          <w:p>
-            <w:pPr>
-              <w:pStyle w:val="Normal"/>
-              <w:jc w:val="start"/>
-              <w:rPr/>
-            </w:pPr>
-            <w:r>
-              <w:rPr>
-                <w:b w:val="false"/>
-                <w:bCs w:val="false"/>
-                <w:color w:val="000000"/>
-                <w:sz w:val="21"/>
-                <w:szCs w:val="21"/>
-              </w:rPr>
-              <w:t>Integração de LLM local via HuggingFace/Transformers</w:t>
-            </w:r>
-          </w:p>
-        </w:tc>
-      </w:tr>
-      <w:tr>
-        <w:trPr>
-          <w:cantSplit w:val="true"/>
-        </w:trPr>
-        <w:tc>
-          <w:tcPr>
-            <w:tcW w:w="4680" w:type="dxa"/>
-            <w:tcBorders>
-              <w:top w:val="single" w:sz="4" w:space="0" w:color="000000"/>
-              <w:start w:val="single" w:sz="4" w:space="0" w:color="000000"/>
-              <w:bottom w:val="single" w:sz="4" w:space="0" w:color="000000"/>
-              <w:end w:val="single" w:sz="4" w:space="0" w:color="000000"/>
-            </w:tcBorders>
-            <w:shd w:fill="F2F2F2" w:val="clear"/>
-          </w:tcPr>
-          <w:p>
-            <w:pPr>
-              <w:pStyle w:val="Normal"/>
-              <w:jc w:val="start"/>
-              <w:rPr/>
-            </w:pPr>
-            <w:r>
-              <w:rPr>
-                <w:b w:val="false"/>
-                <w:bCs w:val="false"/>
-                <w:color w:val="000000"/>
-                <w:sz w:val="21"/>
-                <w:szCs w:val="21"/>
-              </w:rPr>
-              <w:t>TP5</w:t>
-            </w:r>
-          </w:p>
-        </w:tc>
-        <w:tc>
-          <w:tcPr>
-            <w:tcW w:w="4680" w:type="dxa"/>
-            <w:tcBorders>
-              <w:top w:val="single" w:sz="4" w:space="0" w:color="000000"/>
-              <w:start w:val="single" w:sz="4" w:space="0" w:color="000000"/>
-              <w:bottom w:val="single" w:sz="4" w:space="0" w:color="000000"/>
-              <w:end w:val="single" w:sz="4" w:space="0" w:color="000000"/>
-            </w:tcBorders>
-            <w:shd w:fill="F2F2F2" w:val="clear"/>
-          </w:tcPr>
-          <w:p>
-            <w:pPr>
-              <w:pStyle w:val="Normal"/>
-              <w:jc w:val="start"/>
-              <w:rPr/>
-            </w:pPr>
-            <w:r>
-              <w:rPr>
-                <w:b w:val="false"/>
-                <w:bCs w:val="false"/>
-                <w:color w:val="000000"/>
-                <w:sz w:val="21"/>
-                <w:szCs w:val="21"/>
-              </w:rPr>
-              <w:t>Agente inteligente de recomendação + dashboard final consolidado</w:t>
-            </w:r>
-          </w:p>
-        </w:tc>
-      </w:tr>
-    </w:tbl>
-    <w:p>
-      <w:pPr>
-        <w:pStyle w:val="Heading1"/>
-        <w:pBdr>
-          <w:bottom w:val="single" w:sz="6" w:space="4" w:color="2E7D32"/>
-        </w:pBdr>
-        <w:spacing w:before="320" w:after="160"/>
-        <w:rPr/>
-      </w:pPr>
-      <w:r>
-        <w:rPr>
-          <w:color w:val="2E7D32"/>
-        </w:rPr>
-        <w:t>8. Fontes de Dados</w:t>
+        <w:t>9. Fontes de Dados</w:t>
       </w:r>
     </w:p>
     <w:p>
@@ -1698,7 +2777,7 @@
           <w:sz w:val="22"/>
           <w:szCs w:val="22"/>
         </w:rPr>
-        <w:t>Detalhamento completo das fontes, formatos e finalidade de uso disponível no Data Summary Report que acompanha este documento.</w:t>
+        <w:t xml:space="preserve">ANEEL — Relação de Empreendimentos de Micro e Minigeração Distribuída; IBGE — Censo Demográfico 2022 (população por UF e por município); Agência Brasil — notícias sobre energia solar e geração distribuída, coletadas por web scraping. O detalhamento de formatos, tratamentos, validações e licenças está no Data Summary Report que acompanha este documento.</w:t>
       </w:r>
     </w:p>
     <w:sectPr>

</xml_diff>

<commit_message>
docs: Project Charter, Data Summary Report e README do TP3
</commit_message>
<xml_diff>
--- a/docs/project_charter_solargap.docx
+++ b/docs/project_charter_solargap.docx
@@ -67,7 +67,7 @@
           <w:sz w:val="18"/>
           <w:szCs w:val="18"/>
         </w:rPr>
-        <w:t>TP2 — Inteligência Artificial Aplicada à Ciência de Dados  |  Pâmela Lima Ziliotto  |  Atualizado em 22/09/2026</w:t>
+        <w:t>TP3 — Inteligência Artificial Aplicada à Ciência de Dados  |  Pâmela Lima Ziliotto  |  Atualizado em 21/10/2026</w:t>
       </w:r>
     </w:p>
     <w:p>
@@ -122,15 +122,16 @@
         <w:pStyle w:val="Normal"/>
         <w:spacing w:lineRule="auto" w:line="300"/>
         <w:rPr>
-          <w:sz w:val="6"/>
-          <w:szCs w:val="6"/>
-        </w:rPr>
-      </w:pPr>
-      <w:r>
-        <w:rPr>
-          <w:sz w:val="6"/>
-          <w:szCs w:val="6"/>
-        </w:rPr>
+          <w:sz w:val="22"/>
+          <w:szCs w:val="22"/>
+        </w:rPr>
+      </w:pPr>
+      <w:r>
+        <w:rPr>
+          <w:sz w:val="22"/>
+          <w:szCs w:val="22"/>
+        </w:rPr>
+        <w:t>O tema também se conecta ao ODS 7 (Energia Limpa e Acessível), um dos eixos propostos pela disciplina e detalhado na seção 4. Outra influência vem de um período vivendo na Europa, onde é comum ver propriedades fora das grandes cidades com geração solar própria. Nesse contexto, discussões como a da iniciativa Desertec, que propôs grandes usinas solares no Saara, ilustram um ponto central para este projeto: abundância de sol e viabilidade técnica não bastam. A expansão da energia limpa depende de planejamento, infraestrutura e de onde a demanda efetivamente está.</w:t>
       </w:r>
     </w:p>
     <w:p>
@@ -147,46 +148,15 @@
           <w:sz w:val="22"/>
           <w:szCs w:val="22"/>
         </w:rPr>
-        <w:t>O tema também se conecta ao ODS 7 (Energia Limpa e Acessível), um dos eixos propostos pela disciplina e detalhado na seção 4. Outra influência vem de um período vivendo na Europa, onde é comum ver propriedades fora das grandes cidades com geração solar própria. Nesse contexto, discussões como a da iniciativa Desertec, que propôs grandes usinas solares no Saara, ilustram um ponto central para este projeto: abundância de sol e viabilidade técnica não bastam. A expansão da energia limpa depende de planejamento, infraestrutura e de onde a demanda efetivamente está.</w:t>
-      </w:r>
-    </w:p>
-    <w:p>
-      <w:pPr>
-        <w:pStyle w:val="Normal"/>
-        <w:spacing w:lineRule="auto" w:line="300"/>
-        <w:rPr>
-          <w:sz w:val="10"/>
-          <w:szCs w:val="10"/>
-        </w:rPr>
-      </w:pPr>
-      <w:r>
-        <w:rPr>
-          <w:sz w:val="10"/>
-          <w:szCs w:val="10"/>
-        </w:rPr>
-      </w:r>
-    </w:p>
-    <w:p>
-      <w:pPr>
-        <w:pStyle w:val="Normal"/>
-        <w:spacing w:lineRule="auto" w:line="300"/>
-        <w:rPr>
-          <w:sz w:val="22"/>
-          <w:szCs w:val="22"/>
-        </w:rPr>
-      </w:pPr>
-      <w:r>
-        <w:rPr>
-          <w:sz w:val="22"/>
-          <w:szCs w:val="22"/>
-        </w:rPr>
         <w:t>O projeto parte da premissa de que políticas públicas isoladas têm alcance limitado. A adoção em escala se sustenta quando a energia limpa também é economicamente atrativa para empresas e consumidores. Por isso, o SolarGap Brasil busca identificar lacunas regionais na adoção de geração solar distribuída. Essa informação pode ajudar a direcionar incentivos governamentais e também mostrar ao mercado onde há espaço para crescer.</w:t>
       </w:r>
     </w:p>
     <w:p>
       <w:pPr>
         <w:pStyle w:val="Heading3"/>
-        <w:rPr/>
+        <w:rPr>
+          <w:color w:val="2E7D32"/>
+        </w:rPr>
       </w:pPr>
       <w:r>
         <w:rPr>
@@ -230,6 +200,89 @@
           <w:szCs w:val="22"/>
         </w:rPr>
         <w:t>O SolarGap Brasil propõe mapear e quantificar essa disparidade, transformando dados públicos da ANEEL e do IBGE em um painel interativo capaz de identificar quais estados estão liderando e quais estão ficando para trás na adoção de energia solar distribuída — revelando, ao mesmo tempo, onde estão as oportunidades ainda não exploradas pelo mercado solar.</w:t>
+      </w:r>
+    </w:p>
+    <w:p>
+      <w:pPr>
+        <w:pStyle w:val="Heading3"/>
+        <w:rPr>
+          <w:color w:val="2E7D32"/>
+        </w:rPr>
+      </w:pPr>
+      <w:r>
+        <w:rPr>
+          <w:color w:val="2E7D32"/>
+        </w:rPr>
+        <w:t>1.3 Revisão do problema no TP3</w:t>
+      </w:r>
+    </w:p>
+    <w:p>
+      <w:pPr>
+        <w:pStyle w:val="Normal"/>
+        <w:spacing w:lineRule="auto" w:line="300"/>
+        <w:rPr>
+          <w:sz w:val="22"/>
+          <w:szCs w:val="22"/>
+        </w:rPr>
+      </w:pPr>
+      <w:r>
+        <w:rPr>
+          <w:sz w:val="22"/>
+          <w:szCs w:val="22"/>
+        </w:rPr>
+        <w:t xml:space="preserve">O enunciado do TP3 pede que o problema de negócio seja reavaliado à luz das novas ferramentas. O problema permanece o mesmo: a adoção de geração solar distribuída é desigual entre os estados. O que mudou foi a capacidade de responder à pergunta do projeto de forma acionável.</w:t>
+      </w:r>
+    </w:p>
+    <w:p>
+      <w:pPr>
+        <w:pStyle w:val="Normal"/>
+        <w:spacing w:lineRule="auto" w:line="300"/>
+        <w:rPr>
+          <w:sz w:val="22"/>
+          <w:szCs w:val="22"/>
+        </w:rPr>
+      </w:pPr>
+      <w:r>
+        <w:rPr>
+          <w:b/>
+          <w:bCs/>
+          <w:sz w:val="22"/>
+          <w:szCs w:val="22"/>
+        </w:rPr>
+        <w:t xml:space="preserve">Do descritivo ao acionável. </w:t>
+      </w:r>
+      <w:r>
+        <w:rPr>
+          <w:sz w:val="22"/>
+          <w:szCs w:val="22"/>
+        </w:rPr>
+        <w:t xml:space="preserve">Até o TP2, o painel descrevia quem adota mais e quem adota menos. No TP3, o cruzamento da adoção com o crescimento do parque classifica cada estado em um de quatro quadrantes. Os mercados emergentes respondem à pergunta comercial (onde está o próximo mercado solar?) e as lacunas persistentes, à pergunta de política pública (quem está ficando para trás?). A adesão estadual à isenção de ICMS foi incorporada como variável de política.</w:t>
+      </w:r>
+    </w:p>
+    <w:p>
+      <w:pPr>
+        <w:pStyle w:val="Normal"/>
+        <w:spacing w:lineRule="auto" w:line="300"/>
+        <w:rPr>
+          <w:sz w:val="22"/>
+          <w:szCs w:val="22"/>
+        </w:rPr>
+      </w:pPr>
+      <w:r>
+        <w:rPr>
+          <w:b/>
+          <w:bCs/>
+          <w:sz w:val="22"/>
+          <w:szCs w:val="22"/>
+        </w:rPr>
+        <w:t xml:space="preserve">Novas ferramentas. </w:t>
+      </w:r>
+      <w:r>
+        <w:rPr>
+          <w:sz w:val="22"/>
+          <w:szCs w:val="22"/>
+        </w:rPr>
+        <w:t xml:space="preserve">A FastAPI transforma a análise em serviço. Uma empresa do setor pode, por exemplo, enviar sua carteira de clientes por estado e receber a comparação com a adoção, sem abrir o painel. A mesma API será a camada de ferramentas do agente inteligente do TP5. O Selenium foi avaliado e descartado, porque nenhuma fonte viável exige renderização por JavaScript.</w:t>
       </w:r>
     </w:p>
     <w:p>
@@ -267,17 +320,18 @@
     <w:p>
       <w:pPr>
         <w:pStyle w:val="Normal"/>
-        <w:spacing w:lineRule="auto" w:line="300" w:before="0" w:after="160"/>
-        <w:rPr/>
-      </w:pPr>
-      <w:r>
-        <w:rPr>
-          <w:i w:val="false"/>
-          <w:iCs w:val="false"/>
-          <w:sz w:val="22"/>
-          <w:szCs w:val="22"/>
-        </w:rPr>
-        <w:t xml:space="preserve">No TP2, esse objetivo foi atingido para o recorte estadual: o dashboard apresenta o ranking das 27 UFs em quatro métricas, com os dados tratados, corrigidos e validados contra o painel oficial da ANEEL. O pipeline é reprodutível de ponta a ponta: cada nova publicação mensal da ANEEL é incorporada executando novamente os scripts de coleta e das camadas Silver e Gold.</w:t>
+        <w:spacing w:lineRule="auto" w:line="300"/>
+        <w:rPr>
+          <w:sz w:val="22"/>
+          <w:szCs w:val="22"/>
+        </w:rPr>
+      </w:pPr>
+      <w:r>
+        <w:rPr>
+          <w:sz w:val="22"/>
+          <w:szCs w:val="22"/>
+        </w:rPr>
+        <w:t xml:space="preserve">No TP3, o objetivo foi atingido para o recorte estadual e ampliado. Os quatro indicadores estão implementados no painel e na API. O parque solar distribuído cresceu 37,5% ao ano entre 2022 e 2025. Dez estados foram identificados como mercados emergentes (RR, AL, AC, BA, PA, AM, CE, PE, SP e SE) e três como lacunas persistentes (RJ, DF e PB). O momento de adesão à isenção de ICMS não apresentou relação com a adoção (correlação de Spearman de −0,06).</w:t>
       </w:r>
     </w:p>
     <w:p>
@@ -399,7 +453,7 @@
                 <w:sz w:val="21"/>
                 <w:szCs w:val="21"/>
               </w:rPr>
-              <w:t xml:space="preserve">Situação no TP2</w:t>
+              <w:t xml:space="preserve">Situação no TP3</w:t>
             </w:r>
           </w:p>
         </w:tc>
@@ -491,7 +545,7 @@
                 <w:sz w:val="21"/>
                 <w:szCs w:val="21"/>
               </w:rPr>
-              <w:t xml:space="preserve">Implementado — aba Panorama</w:t>
+              <w:t xml:space="preserve">Implementado — páginas Panorama e Oportunidades; rotas /ranking e /ufs</w:t>
             </w:r>
           </w:p>
         </w:tc>
@@ -509,6 +563,7 @@
               <w:bottom w:val="single" w:sz="4" w:space="0" w:color="000000"/>
               <w:end w:val="single" w:sz="4" w:space="0" w:color="000000"/>
             </w:tcBorders>
+            <w:shd w:fill="FFFFFF" w:val="clear"/>
           </w:tcPr>
           <w:p>
             <w:pPr>
@@ -537,6 +592,7 @@
               <w:bottom w:val="single" w:sz="4" w:space="0" w:color="000000"/>
               <w:end w:val="single" w:sz="4" w:space="0" w:color="000000"/>
             </w:tcBorders>
+            <w:shd w:fill="FFFFFF" w:val="clear"/>
           </w:tcPr>
           <w:p>
             <w:pPr>
@@ -565,22 +621,23 @@
               <w:bottom w:val="single" w:sz="4" w:space="0" w:color="000000"/>
               <w:end w:val="single" w:sz="4" w:space="0" w:color="000000"/>
             </w:tcBorders>
-          </w:tcPr>
-          <w:p>
-            <w:pPr>
-              <w:pStyle w:val="Normal"/>
-              <w:jc w:val="start"/>
-              <w:rPr/>
-            </w:pPr>
-            <w:r>
-              <w:rPr>
-                <w:b w:val="false"/>
-                <w:bCs w:val="false"/>
-                <w:color w:val="000000"/>
-                <w:sz w:val="21"/>
-                <w:szCs w:val="21"/>
-              </w:rPr>
-              <w:t xml:space="preserve">Implementado — aba Panorama</w:t>
+            <w:shd w:fill="FFFFFF" w:val="clear"/>
+          </w:tcPr>
+          <w:p>
+            <w:pPr>
+              <w:pStyle w:val="Normal"/>
+              <w:jc w:val="start"/>
+              <w:rPr/>
+            </w:pPr>
+            <w:r>
+              <w:rPr>
+                <w:b w:val="false"/>
+                <w:bCs w:val="false"/>
+                <w:color w:val="000000"/>
+                <w:sz w:val="21"/>
+                <w:szCs w:val="21"/>
+              </w:rPr>
+              <w:t xml:space="preserve">Implementado — página Panorama; rota /ranking</w:t>
             </w:r>
           </w:p>
         </w:tc>
@@ -643,7 +700,7 @@
                 <w:sz w:val="21"/>
                 <w:szCs w:val="21"/>
               </w:rPr>
-              <w:t xml:space="preserve">Posição das 27 UFs em cada métrica, com a média nacional como referência e destaque de uma UF escolhida pelo usuário.</w:t>
+              <w:t xml:space="preserve">Posição das 27 UFs em cada métrica, com a média nacional como referência.</w:t>
             </w:r>
           </w:p>
         </w:tc>
@@ -672,7 +729,7 @@
                 <w:sz w:val="21"/>
                 <w:szCs w:val="21"/>
               </w:rPr>
-              <w:t xml:space="preserve">Implementado — aba Panorama</w:t>
+              <w:t xml:space="preserve">Implementado — página Panorama; rotas /ranking e /ufs/{sigla}</w:t>
             </w:r>
           </w:p>
         </w:tc>
@@ -690,6 +747,7 @@
               <w:bottom w:val="single" w:sz="4" w:space="0" w:color="000000"/>
               <w:end w:val="single" w:sz="4" w:space="0" w:color="000000"/>
             </w:tcBorders>
+            <w:shd w:fill="FFFFFF" w:val="clear"/>
           </w:tcPr>
           <w:p>
             <w:pPr>
@@ -718,22 +776,23 @@
               <w:bottom w:val="single" w:sz="4" w:space="0" w:color="000000"/>
               <w:end w:val="single" w:sz="4" w:space="0" w:color="000000"/>
             </w:tcBorders>
-          </w:tcPr>
-          <w:p>
-            <w:pPr>
-              <w:pStyle w:val="Normal"/>
-              <w:jc w:val="start"/>
-              <w:rPr/>
-            </w:pPr>
-            <w:r>
-              <w:rPr>
-                <w:b w:val="false"/>
-                <w:bCs w:val="false"/>
-                <w:color w:val="000000"/>
-                <w:sz w:val="21"/>
-                <w:szCs w:val="21"/>
-              </w:rPr>
-              <w:t xml:space="preserve">Variação percentual ano a ano da potência instalada, por estado.</w:t>
+            <w:shd w:fill="FFFFFF" w:val="clear"/>
+          </w:tcPr>
+          <w:p>
+            <w:pPr>
+              <w:pStyle w:val="Normal"/>
+              <w:jc w:val="start"/>
+              <w:rPr/>
+            </w:pPr>
+            <w:r>
+              <w:rPr>
+                <w:b w:val="false"/>
+                <w:bCs w:val="false"/>
+                <w:color w:val="000000"/>
+                <w:sz w:val="21"/>
+                <w:szCs w:val="21"/>
+              </w:rPr>
+              <w:t xml:space="preserve">Crescimento do parque instalado (potência acumulada) ano a ano e CAGR por UF. Janela padrão: 2022–2025.</w:t>
             </w:r>
           </w:p>
         </w:tc>
@@ -746,22 +805,115 @@
               <w:bottom w:val="single" w:sz="4" w:space="0" w:color="000000"/>
               <w:end w:val="single" w:sz="4" w:space="0" w:color="000000"/>
             </w:tcBorders>
-          </w:tcPr>
-          <w:p>
-            <w:pPr>
-              <w:pStyle w:val="Normal"/>
-              <w:jc w:val="start"/>
-              <w:rPr/>
-            </w:pPr>
-            <w:r>
-              <w:rPr>
-                <w:b w:val="false"/>
-                <w:bCs w:val="false"/>
-                <w:color w:val="000000"/>
-                <w:sz w:val="21"/>
-                <w:szCs w:val="21"/>
-              </w:rPr>
-              <w:t xml:space="preserve">Parcial — série anual na aba Evolução; cálculo da variação previsto para o TP3</w:t>
+            <w:shd w:fill="FFFFFF" w:val="clear"/>
+          </w:tcPr>
+          <w:p>
+            <w:pPr>
+              <w:pStyle w:val="Normal"/>
+              <w:jc w:val="start"/>
+              <w:rPr/>
+            </w:pPr>
+            <w:r>
+              <w:rPr>
+                <w:b w:val="false"/>
+                <w:bCs w:val="false"/>
+                <w:color w:val="000000"/>
+                <w:sz w:val="21"/>
+                <w:szCs w:val="21"/>
+              </w:rPr>
+              <w:t xml:space="preserve">Concluído no TP3 — página Evolução e crescimento; rotas /series e /oportunidades</w:t>
+            </w:r>
+          </w:p>
+        </w:tc>
+      </w:tr>
+      <w:tr>
+        <w:trPr>
+          <w:cantSplit w:val="true"/>
+        </w:trPr>
+        <w:tc>
+          <w:tcPr>
+            <w:tcW w:w="2400" w:type="dxa"/>
+            <w:tcBorders>
+              <w:top w:val="single" w:sz="4" w:space="0" w:color="000000"/>
+              <w:start w:val="single" w:sz="4" w:space="0" w:color="000000"/>
+              <w:bottom w:val="single" w:sz="4" w:space="0" w:color="000000"/>
+              <w:end w:val="single" w:sz="4" w:space="0" w:color="000000"/>
+            </w:tcBorders>
+            <w:shd w:fill="F2F2F2" w:val="clear"/>
+          </w:tcPr>
+          <w:p>
+            <w:pPr>
+              <w:pStyle w:val="Normal"/>
+              <w:jc w:val="start"/>
+              <w:rPr/>
+            </w:pPr>
+            <w:r>
+              <w:rPr>
+                <w:b w:val="false"/>
+                <w:bCs w:val="false"/>
+                <w:color w:val="000000"/>
+                <w:sz w:val="21"/>
+                <w:szCs w:val="21"/>
+              </w:rPr>
+              <w:t xml:space="preserve">Matriz de oportunidade</w:t>
+            </w:r>
+          </w:p>
+        </w:tc>
+        <w:tc>
+          <w:tcPr>
+            <w:tcW w:w="4560" w:type="dxa"/>
+            <w:tcBorders>
+              <w:top w:val="single" w:sz="4" w:space="0" w:color="000000"/>
+              <w:start w:val="single" w:sz="4" w:space="0" w:color="000000"/>
+              <w:bottom w:val="single" w:sz="4" w:space="0" w:color="000000"/>
+              <w:end w:val="single" w:sz="4" w:space="0" w:color="000000"/>
+            </w:tcBorders>
+            <w:shd w:fill="F2F2F2" w:val="clear"/>
+          </w:tcPr>
+          <w:p>
+            <w:pPr>
+              <w:pStyle w:val="Normal"/>
+              <w:jc w:val="start"/>
+              <w:rPr/>
+            </w:pPr>
+            <w:r>
+              <w:rPr>
+                <w:b w:val="false"/>
+                <w:bCs w:val="false"/>
+                <w:color w:val="000000"/>
+                <w:sz w:val="21"/>
+                <w:szCs w:val="21"/>
+              </w:rPr>
+              <w:t xml:space="preserve">Quadrante de cada UF: adoção per capita x crescimento do parque, com referências nacionais.</w:t>
+            </w:r>
+          </w:p>
+        </w:tc>
+        <w:tc>
+          <w:tcPr>
+            <w:tcW w:w="2400" w:type="dxa"/>
+            <w:tcBorders>
+              <w:top w:val="single" w:sz="4" w:space="0" w:color="000000"/>
+              <w:start w:val="single" w:sz="4" w:space="0" w:color="000000"/>
+              <w:bottom w:val="single" w:sz="4" w:space="0" w:color="000000"/>
+              <w:end w:val="single" w:sz="4" w:space="0" w:color="000000"/>
+            </w:tcBorders>
+            <w:shd w:fill="F2F2F2" w:val="clear"/>
+          </w:tcPr>
+          <w:p>
+            <w:pPr>
+              <w:pStyle w:val="Normal"/>
+              <w:jc w:val="start"/>
+              <w:rPr/>
+            </w:pPr>
+            <w:r>
+              <w:rPr>
+                <w:b w:val="false"/>
+                <w:bCs w:val="false"/>
+                <w:color w:val="000000"/>
+                <w:sz w:val="21"/>
+                <w:szCs w:val="21"/>
+              </w:rPr>
+              <w:t xml:space="preserve">Novo no TP3 — página Oportunidades; rota /oportunidades</w:t>
             </w:r>
           </w:p>
         </w:tc>
@@ -770,17 +922,25 @@
     <w:p>
       <w:pPr>
         <w:pStyle w:val="Normal"/>
-        <w:spacing w:lineRule="auto" w:line="300" w:before="160" w:after="80"/>
+        <w:spacing w:before="0" w:after="120"/>
         <w:rPr/>
       </w:pPr>
-      <w:r>
-        <w:rPr>
-          <w:i w:val="false"/>
-          <w:iCs w:val="false"/>
-          <w:sz w:val="22"/>
-          <w:szCs w:val="22"/>
-        </w:rPr>
-        <w:t xml:space="preserve">A métrica definida no TP1 (MW por 100 mil habitantes) foi substituída por watts por habitante. É a mesma razão em outra escala (1 MW por 100 mil habitantes equivale a 10 W por habitante), com ordem de grandeza mais legível e unidade usual no setor.</w:t>
+    </w:p>
+    <w:p>
+      <w:pPr>
+        <w:pStyle w:val="Normal"/>
+        <w:spacing w:lineRule="auto" w:line="300"/>
+        <w:rPr>
+          <w:sz w:val="22"/>
+          <w:szCs w:val="22"/>
+        </w:rPr>
+      </w:pPr>
+      <w:r>
+        <w:rPr>
+          <w:sz w:val="22"/>
+          <w:szCs w:val="22"/>
+        </w:rPr>
+        <w:t xml:space="preserve">A métrica definida no TP1 (MW por 100 mil habitantes) foi substituída no TP2 por watts por habitante. É a mesma razão em outra escala (1 MW por 100 mil habitantes equivale a 10 W por habitante), com ordem de grandeza mais legível e unidade usual no setor. O crescimento é medido sobre o parque acumulado, e não sobre as conexões de cada ano: em 2023 entraram menos sistemas que em 2022, mas o parque continuou crescendo.</w:t>
       </w:r>
     </w:p>
     <w:p>
@@ -802,17 +962,18 @@
     <w:p>
       <w:pPr>
         <w:pStyle w:val="Normal"/>
-        <w:spacing w:lineRule="auto" w:line="300" w:before="0" w:after="160"/>
-        <w:rPr/>
-      </w:pPr>
-      <w:r>
-        <w:rPr>
-          <w:i w:val="false"/>
-          <w:iCs w:val="false"/>
-          <w:sz w:val="22"/>
-          <w:szCs w:val="22"/>
-        </w:rPr>
-        <w:t>Dashboard interativo em Streamlit exibindo a distribuição estadual de potência instalada em geração solar distribuída, normalizada por população, com identificação de disparidades regionais. Ao longo do curso, o projeto evolui incorporando web scraping (contexto qualitativo de notícias e incentivos estaduais), uma API própria em FastAPI, processamento de linguagem natural com um modelo de IA local, e, na etapa final, um agente inteligente de recomendação.</w:t>
+        <w:spacing w:lineRule="auto" w:line="300"/>
+        <w:rPr>
+          <w:sz w:val="22"/>
+          <w:szCs w:val="22"/>
+        </w:rPr>
+      </w:pPr>
+      <w:r>
+        <w:rPr>
+          <w:sz w:val="22"/>
+          <w:szCs w:val="22"/>
+        </w:rPr>
+        <w:t xml:space="preserve">Dashboard interativo em Streamlit e API em FastAPI com a distribuição estadual da potência instalada em geração solar distribuída, normalizada por população, com identificação de disparidades e oportunidades regionais. Ao longo do curso, o projeto incorpora web scraping, uma API própria, processamento de linguagem natural com um modelo de IA local e, na etapa final, um agente inteligente de recomendação.</w:t>
       </w:r>
     </w:p>
     <w:p>
@@ -825,23 +986,169 @@
         <w:rPr>
           <w:color w:val="595959"/>
         </w:rPr>
-        <w:t>Entregas do TP2</w:t>
-      </w:r>
-    </w:p>
-    <w:p>
-      <w:pPr>
-        <w:pStyle w:val="Normal"/>
-        <w:spacing w:lineRule="auto" w:line="300" w:before="0" w:after="160"/>
+        <w:t>Entregas do TP3</w:t>
+      </w:r>
+    </w:p>
+    <w:p>
+      <w:pPr>
+        <w:pStyle w:val="ListParagraph"/>
+        <w:numPr>
+          <w:ilvl w:val="0"/>
+          <w:numId w:val="1"/>
+        </w:numPr>
+        <w:spacing w:before="0" w:after="80"/>
         <w:rPr/>
       </w:pPr>
       <w:r>
         <w:rPr>
-          <w:i w:val="false"/>
-          <w:iCs w:val="false"/>
-          <w:sz w:val="22"/>
-          <w:szCs w:val="22"/>
-        </w:rPr>
-        <w:t xml:space="preserve">Camadas Silver e Gold implementadas, com critérios de exclusão, correções documentadas e validação contra o painel oficial da ANEEL. Coleta de 114 notícias da Agência Brasil por web scraping com BeautifulSoup. Dashboard com quatro abas (Panorama, Evolução, Notícias e Dados), filtros por visão dos dados, métrica, período e classe de consumo, cache, estado de sessão e serviço de upload e download de CSV.</w:t>
+          <w:b/>
+          <w:bCs/>
+          <w:sz w:val="22"/>
+          <w:szCs w:val="22"/>
+        </w:rPr>
+        <w:t xml:space="preserve">Dashboard multipáginas: </w:t>
+      </w:r>
+      <w:r>
+        <w:rPr>
+          <w:sz w:val="22"/>
+          <w:szCs w:val="22"/>
+        </w:rPr>
+        <w:t xml:space="preserve">sete páginas com menu de navegação em seções (Início, Panorama, Evolução e crescimento, Oportunidades, Notícias, Dados e API), com filtros que persistem entre páginas.</w:t>
+      </w:r>
+    </w:p>
+    <w:p>
+      <w:pPr>
+        <w:pStyle w:val="ListParagraph"/>
+        <w:numPr>
+          <w:ilvl w:val="0"/>
+          <w:numId w:val="1"/>
+        </w:numPr>
+        <w:spacing w:before="0" w:after="80"/>
+        <w:rPr/>
+      </w:pPr>
+      <w:r>
+        <w:rPr>
+          <w:b/>
+          <w:bCs/>
+          <w:sz w:val="22"/>
+          <w:szCs w:val="22"/>
+        </w:rPr>
+        <w:t xml:space="preserve">API FastAPI: </w:t>
+      </w:r>
+      <w:r>
+        <w:rPr>
+          <w:sz w:val="22"/>
+          <w:szCs w:val="22"/>
+        </w:rPr>
+        <w:t xml:space="preserve">13 rotas, com consultas (GET) e envio de dados (POST /noticias e POST /comparacoes), modelos Pydantic de entrada e resposta, tratamento de erros HTTP (400, 404, 409, 422, 503) e documentação em /docs e docs/api.md.</w:t>
+      </w:r>
+    </w:p>
+    <w:p>
+      <w:pPr>
+        <w:pStyle w:val="ListParagraph"/>
+        <w:numPr>
+          <w:ilvl w:val="0"/>
+          <w:numId w:val="1"/>
+        </w:numPr>
+        <w:spacing w:before="0" w:after="80"/>
+        <w:rPr/>
+      </w:pPr>
+      <w:r>
+        <w:rPr>
+          <w:b/>
+          <w:bCs/>
+          <w:sz w:val="22"/>
+          <w:szCs w:val="22"/>
+        </w:rPr>
+        <w:t xml:space="preserve">Camada de serviços: </w:t>
+      </w:r>
+      <w:r>
+        <w:rPr>
+          <w:sz w:val="22"/>
+          <w:szCs w:val="22"/>
+        </w:rPr>
+        <w:t xml:space="preserve">regra de negócio única, usada pelo painel e pela API, para que os números nunca divirjam.</w:t>
+      </w:r>
+    </w:p>
+    <w:p>
+      <w:pPr>
+        <w:pStyle w:val="ListParagraph"/>
+        <w:numPr>
+          <w:ilvl w:val="0"/>
+          <w:numId w:val="1"/>
+        </w:numPr>
+        <w:spacing w:before="0" w:after="80"/>
+        <w:rPr/>
+      </w:pPr>
+      <w:r>
+        <w:rPr>
+          <w:b/>
+          <w:bCs/>
+          <w:sz w:val="22"/>
+          <w:szCs w:val="22"/>
+        </w:rPr>
+        <w:t xml:space="preserve">Novas fontes: </w:t>
+      </w:r>
+      <w:r>
+        <w:rPr>
+          <w:sz w:val="22"/>
+          <w:szCs w:val="22"/>
+        </w:rPr>
+        <w:t xml:space="preserve">Agência Gov (notícias do governo federal, com licença aberta) e adesão ao Convênio ICMS 16/15 (CONFAZ).</w:t>
+      </w:r>
+    </w:p>
+    <w:p>
+      <w:pPr>
+        <w:pStyle w:val="ListParagraph"/>
+        <w:numPr>
+          <w:ilvl w:val="0"/>
+          <w:numId w:val="1"/>
+        </w:numPr>
+        <w:spacing w:before="0" w:after="80"/>
+        <w:rPr/>
+      </w:pPr>
+      <w:r>
+        <w:rPr>
+          <w:b/>
+          <w:bCs/>
+          <w:sz w:val="22"/>
+          <w:szCs w:val="22"/>
+        </w:rPr>
+        <w:t xml:space="preserve">Coleta: </w:t>
+      </w:r>
+      <w:r>
+        <w:rPr>
+          <w:sz w:val="22"/>
+          <w:szCs w:val="22"/>
+        </w:rPr>
+        <w:t xml:space="preserve">scraper de notícias reestruturado em pacote multifonte, com fontes declaradas em configuração e mescla incremental que preserva as saídas do futuro modelo de linguagem.</w:t>
+      </w:r>
+    </w:p>
+    <w:p>
+      <w:pPr>
+        <w:pStyle w:val="ListParagraph"/>
+        <w:numPr>
+          <w:ilvl w:val="0"/>
+          <w:numId w:val="1"/>
+        </w:numPr>
+        <w:spacing w:before="0" w:after="80"/>
+        <w:rPr/>
+      </w:pPr>
+      <w:r>
+        <w:rPr>
+          <w:b/>
+          <w:bCs/>
+          <w:sz w:val="22"/>
+          <w:szCs w:val="22"/>
+        </w:rPr>
+        <w:t xml:space="preserve">Qualidade: </w:t>
+      </w:r>
+      <w:r>
+        <w:rPr>
+          <w:sz w:val="22"/>
+          <w:szCs w:val="22"/>
+        </w:rPr>
+        <w:t xml:space="preserve">67 testes automatizados (serviços, API, scrapers, ICMS, Gold, upload e todas as páginas do painel).</w:t>
       </w:r>
     </w:p>
     <w:p>
@@ -860,17 +1167,79 @@
     <w:p>
       <w:pPr>
         <w:pStyle w:val="Normal"/>
-        <w:spacing w:lineRule="auto" w:line="300" w:before="0" w:after="160"/>
-        <w:rPr/>
-      </w:pPr>
-      <w:r>
-        <w:rPr>
-          <w:i w:val="false"/>
-          <w:iCs w:val="false"/>
-          <w:sz w:val="22"/>
-          <w:szCs w:val="22"/>
-        </w:rPr>
-        <w:t xml:space="preserve">A coleta da adesão estadual ao Convênio ICMS 16/2015 (CONFAZ), inicialmente considerada para o TP2, foi transferida para o TP3, etapa em que a revisão das fontes de dados faz parte do enunciado. A camada Gold já está preparada para receber essa informação sem alteração de esquema.</w:t>
+        <w:spacing w:lineRule="auto" w:line="300"/>
+        <w:rPr>
+          <w:sz w:val="22"/>
+          <w:szCs w:val="22"/>
+        </w:rPr>
+      </w:pPr>
+      <w:r>
+        <w:rPr>
+          <w:b/>
+          <w:bCs/>
+          <w:sz w:val="22"/>
+          <w:szCs w:val="22"/>
+        </w:rPr>
+        <w:t xml:space="preserve">Fontes de notícias. </w:t>
+      </w:r>
+      <w:r>
+        <w:rPr>
+          <w:sz w:val="22"/>
+          <w:szCs w:val="22"/>
+        </w:rPr>
+        <w:t xml:space="preserve">Foram avaliados g1/Globo, CNN Brasil, Portal R7, CanalEnergia, MegaWhat e eixos (antiga epbr). Nenhum foi incluído: os motivos foram termos de uso que restringem a cópia ou a coleta automatizada, modelo de assinatura ou termos não localizados. Em seu lugar entrou a Agência Gov, que autoriza a reprodução com citação. O mecanismo de coleta só de metadados (título, data e link) está implementado e desabilitado, à espera de autorização dos veículos.</w:t>
+      </w:r>
+    </w:p>
+    <w:p>
+      <w:pPr>
+        <w:pStyle w:val="Normal"/>
+        <w:spacing w:lineRule="auto" w:line="300"/>
+        <w:rPr>
+          <w:sz w:val="22"/>
+          <w:szCs w:val="22"/>
+        </w:rPr>
+      </w:pPr>
+      <w:r>
+        <w:rPr>
+          <w:b/>
+          <w:bCs/>
+          <w:sz w:val="22"/>
+          <w:szCs w:val="22"/>
+        </w:rPr>
+        <w:t xml:space="preserve">ICMS. </w:t>
+      </w:r>
+      <w:r>
+        <w:rPr>
+          <w:sz w:val="22"/>
+          <w:szCs w:val="22"/>
+        </w:rPr>
+        <w:t xml:space="preserve">A coleta prevista desde o TP2 foi concluída. O robots.txt do CONFAZ bloqueou o acesso automatizado; o coletor respeita essa regra e usa uma cópia de referência do texto oficial (ato oficial, sem proteção autoral). A tabela virou uma dimensão própria da camada Gold, em vez de uma coluna da tabela por UF.</w:t>
+      </w:r>
+    </w:p>
+    <w:p>
+      <w:pPr>
+        <w:pStyle w:val="Normal"/>
+        <w:spacing w:lineRule="auto" w:line="300"/>
+        <w:rPr>
+          <w:sz w:val="22"/>
+          <w:szCs w:val="22"/>
+        </w:rPr>
+      </w:pPr>
+      <w:r>
+        <w:rPr>
+          <w:b/>
+          <w:bCs/>
+          <w:sz w:val="22"/>
+          <w:szCs w:val="22"/>
+        </w:rPr>
+        <w:t xml:space="preserve">Selenium. </w:t>
+      </w:r>
+      <w:r>
+        <w:rPr>
+          <w:sz w:val="22"/>
+          <w:szCs w:val="22"/>
+        </w:rPr>
+        <w:t xml:space="preserve">Avaliado e não utilizado, conforme a orientação do enunciado de manter a simplicidade quando possível.</w:t>
       </w:r>
     </w:p>
     <w:p>
@@ -1242,7 +1611,7 @@
           <w:sz w:val="22"/>
           <w:szCs w:val="22"/>
         </w:rPr>
-        <w:t>Formuladores de política energética estadual (secretarias de energia e meio ambiente)</w:t>
+        <w:t xml:space="preserve">Formuladores de política energética estadual (secretarias de energia e meio ambiente)</w:t>
       </w:r>
     </w:p>
     <w:p>
@@ -1260,7 +1629,7 @@
           <w:sz w:val="22"/>
           <w:szCs w:val="22"/>
         </w:rPr>
-        <w:t>Empresas do setor solar avaliando onde expandir operação</w:t>
+        <w:t xml:space="preserve">Empresas do setor solar avaliando onde expandir operação</w:t>
       </w:r>
     </w:p>
     <w:p>
@@ -1278,7 +1647,7 @@
           <w:sz w:val="22"/>
           <w:szCs w:val="22"/>
         </w:rPr>
-        <w:t>ONGs de justiça e transição energética</w:t>
+        <w:t xml:space="preserve">ONGs de justiça e transição energética</w:t>
       </w:r>
     </w:p>
     <w:p>
@@ -1296,7 +1665,24 @@
           <w:sz w:val="22"/>
           <w:szCs w:val="22"/>
         </w:rPr>
-        <w:t>Pesquisadores e jornalistas de dados cobrindo o tema</w:t>
+        <w:t xml:space="preserve">Pesquisadores e jornalistas de dados cobrindo o tema</w:t>
+      </w:r>
+    </w:p>
+    <w:p>
+      <w:pPr>
+        <w:pStyle w:val="Normal"/>
+        <w:spacing w:lineRule="auto" w:line="300"/>
+        <w:rPr>
+          <w:sz w:val="22"/>
+          <w:szCs w:val="22"/>
+        </w:rPr>
+      </w:pPr>
+      <w:r>
+        <w:rPr>
+          <w:sz w:val="22"/>
+          <w:szCs w:val="22"/>
+        </w:rPr>
+        <w:t xml:space="preserve">No TP3, o público do setor solar ganhou um segundo canal: a API permite integrar os indicadores aos sistemas da própria empresa. Um exemplo é comparar a carteira de clientes com a adoção por estado (POST /comparacoes).</w:t>
       </w:r>
     </w:p>
     <w:p>
@@ -1362,7 +1748,7 @@
                 <w:sz w:val="21"/>
                 <w:szCs w:val="21"/>
               </w:rPr>
-              <w:t>Stakeholder</w:t>
+              <w:t xml:space="preserve">Stakeholder</w:t>
             </w:r>
           </w:p>
         </w:tc>
@@ -1391,7 +1777,7 @@
                 <w:sz w:val="21"/>
                 <w:szCs w:val="21"/>
               </w:rPr>
-              <w:t>Papel no Projeto</w:t>
+              <w:t xml:space="preserve">Papel no Projeto</w:t>
             </w:r>
           </w:p>
         </w:tc>
@@ -1425,7 +1811,7 @@
                 <w:sz w:val="21"/>
                 <w:szCs w:val="21"/>
               </w:rPr>
-              <w:t>Professor / avaliador do curso</w:t>
+              <w:t xml:space="preserve">Professor / avaliador do curso</w:t>
             </w:r>
           </w:p>
         </w:tc>
@@ -1454,7 +1840,7 @@
                 <w:sz w:val="21"/>
                 <w:szCs w:val="21"/>
               </w:rPr>
-              <w:t>Avalia entregas técnicas e documentação em cada TP</w:t>
+              <w:t xml:space="preserve">Avalia entregas técnicas e documentação em cada TP</w:t>
             </w:r>
           </w:p>
         </w:tc>
@@ -1472,22 +1858,23 @@
               <w:bottom w:val="single" w:sz="4" w:space="0" w:color="000000"/>
               <w:end w:val="single" w:sz="4" w:space="0" w:color="000000"/>
             </w:tcBorders>
-          </w:tcPr>
-          <w:p>
-            <w:pPr>
-              <w:pStyle w:val="Normal"/>
-              <w:jc w:val="start"/>
-              <w:rPr/>
-            </w:pPr>
-            <w:r>
-              <w:rPr>
-                <w:b w:val="false"/>
-                <w:bCs w:val="false"/>
-                <w:color w:val="000000"/>
-                <w:sz w:val="21"/>
-                <w:szCs w:val="21"/>
-              </w:rPr>
-              <w:t>Pâmela Lima Ziliotto</w:t>
+            <w:shd w:fill="FFFFFF" w:val="clear"/>
+          </w:tcPr>
+          <w:p>
+            <w:pPr>
+              <w:pStyle w:val="Normal"/>
+              <w:jc w:val="start"/>
+              <w:rPr/>
+            </w:pPr>
+            <w:r>
+              <w:rPr>
+                <w:b w:val="false"/>
+                <w:bCs w:val="false"/>
+                <w:color w:val="000000"/>
+                <w:sz w:val="21"/>
+                <w:szCs w:val="21"/>
+              </w:rPr>
+              <w:t xml:space="preserve">Pâmela Lima Ziliotto</w:t>
             </w:r>
           </w:p>
         </w:tc>
@@ -1500,22 +1887,23 @@
               <w:bottom w:val="single" w:sz="4" w:space="0" w:color="000000"/>
               <w:end w:val="single" w:sz="4" w:space="0" w:color="000000"/>
             </w:tcBorders>
-          </w:tcPr>
-          <w:p>
-            <w:pPr>
-              <w:pStyle w:val="Normal"/>
-              <w:jc w:val="start"/>
-              <w:rPr/>
-            </w:pPr>
-            <w:r>
-              <w:rPr>
-                <w:b w:val="false"/>
-                <w:bCs w:val="false"/>
-                <w:color w:val="000000"/>
-                <w:sz w:val="21"/>
-                <w:szCs w:val="21"/>
-              </w:rPr>
-              <w:t>Desenvolvedora e responsável pelo projeto</w:t>
+            <w:shd w:fill="FFFFFF" w:val="clear"/>
+          </w:tcPr>
+          <w:p>
+            <w:pPr>
+              <w:pStyle w:val="Normal"/>
+              <w:jc w:val="start"/>
+              <w:rPr/>
+            </w:pPr>
+            <w:r>
+              <w:rPr>
+                <w:b w:val="false"/>
+                <w:bCs w:val="false"/>
+                <w:color w:val="000000"/>
+                <w:sz w:val="21"/>
+                <w:szCs w:val="21"/>
+              </w:rPr>
+              <w:t xml:space="preserve">Desenvolvedora e responsável pelo projeto</w:t>
             </w:r>
           </w:p>
         </w:tc>
@@ -1549,7 +1937,7 @@
                 <w:sz w:val="21"/>
                 <w:szCs w:val="21"/>
               </w:rPr>
-              <w:t>Usuário final (políticas públicas / setor solar)</w:t>
+              <w:t xml:space="preserve">Usuário final (políticas públicas / setor solar)</w:t>
             </w:r>
           </w:p>
         </w:tc>
@@ -1578,12 +1966,82 @@
                 <w:sz w:val="21"/>
                 <w:szCs w:val="21"/>
               </w:rPr>
-              <w:t>Consome os insights do dashboard para decisão</w:t>
+              <w:t xml:space="preserve">Consome os insights do dashboard e da API para decisão</w:t>
+            </w:r>
+          </w:p>
+        </w:tc>
+      </w:tr>
+      <w:tr>
+        <w:trPr>
+          <w:cantSplit w:val="true"/>
+        </w:trPr>
+        <w:tc>
+          <w:tcPr>
+            <w:tcW w:w="4680" w:type="dxa"/>
+            <w:tcBorders>
+              <w:top w:val="single" w:sz="4" w:space="0" w:color="000000"/>
+              <w:start w:val="single" w:sz="4" w:space="0" w:color="000000"/>
+              <w:bottom w:val="single" w:sz="4" w:space="0" w:color="000000"/>
+              <w:end w:val="single" w:sz="4" w:space="0" w:color="000000"/>
+            </w:tcBorders>
+            <w:shd w:fill="FFFFFF" w:val="clear"/>
+          </w:tcPr>
+          <w:p>
+            <w:pPr>
+              <w:pStyle w:val="Normal"/>
+              <w:jc w:val="start"/>
+              <w:rPr/>
+            </w:pPr>
+            <w:r>
+              <w:rPr>
+                <w:b w:val="false"/>
+                <w:bCs w:val="false"/>
+                <w:color w:val="000000"/>
+                <w:sz w:val="21"/>
+                <w:szCs w:val="21"/>
+              </w:rPr>
+              <w:t xml:space="preserve">Provedores de dados (ANEEL, IBGE, EBC, CONFAZ)</w:t>
+            </w:r>
+          </w:p>
+        </w:tc>
+        <w:tc>
+          <w:tcPr>
+            <w:tcW w:w="4680" w:type="dxa"/>
+            <w:tcBorders>
+              <w:top w:val="single" w:sz="4" w:space="0" w:color="000000"/>
+              <w:start w:val="single" w:sz="4" w:space="0" w:color="000000"/>
+              <w:bottom w:val="single" w:sz="4" w:space="0" w:color="000000"/>
+              <w:end w:val="single" w:sz="4" w:space="0" w:color="000000"/>
+            </w:tcBorders>
+            <w:shd w:fill="FFFFFF" w:val="clear"/>
+          </w:tcPr>
+          <w:p>
+            <w:pPr>
+              <w:pStyle w:val="Normal"/>
+              <w:jc w:val="start"/>
+              <w:rPr/>
+            </w:pPr>
+            <w:r>
+              <w:rPr>
+                <w:b w:val="false"/>
+                <w:bCs w:val="false"/>
+                <w:color w:val="000000"/>
+                <w:sz w:val="21"/>
+                <w:szCs w:val="21"/>
+              </w:rPr>
+              <w:t xml:space="preserve">Fornecem os dados. Licenças, termos de uso e robots.txt delimitam o que o projeto pode coletar e guardar</w:t>
             </w:r>
           </w:p>
         </w:tc>
       </w:tr>
     </w:tbl>
+    <w:p>
+      <w:pPr>
+        <w:pStyle w:val="Normal"/>
+        <w:spacing w:before="0" w:after="120"/>
+        <w:rPr/>
+      </w:pPr>
+    </w:p>
     <w:p>
       <w:pPr>
         <w:pStyle w:val="Heading1"/>
@@ -1816,6 +2274,7 @@
               <w:bottom w:val="single" w:sz="4" w:space="0" w:color="000000"/>
               <w:end w:val="single" w:sz="4" w:space="0" w:color="000000"/>
             </w:tcBorders>
+            <w:shd w:fill="FFFFFF" w:val="clear"/>
           </w:tcPr>
           <w:p>
             <w:pPr>
@@ -1844,6 +2303,7 @@
               <w:bottom w:val="single" w:sz="4" w:space="0" w:color="000000"/>
               <w:end w:val="single" w:sz="4" w:space="0" w:color="000000"/>
             </w:tcBorders>
+            <w:shd w:fill="FFFFFF" w:val="clear"/>
           </w:tcPr>
           <w:p>
             <w:pPr>
@@ -1872,6 +2332,7 @@
               <w:bottom w:val="single" w:sz="4" w:space="0" w:color="000000"/>
               <w:end w:val="single" w:sz="4" w:space="0" w:color="000000"/>
             </w:tcBorders>
+            <w:shd w:fill="FFFFFF" w:val="clear"/>
           </w:tcPr>
           <w:p>
             <w:pPr>
@@ -1950,7 +2411,7 @@
                 <w:sz w:val="21"/>
                 <w:szCs w:val="21"/>
               </w:rPr>
-              <w:t xml:space="preserve">Múltiplas páginas, adesão ao ICMS (CONFAZ), scraping dinâmico se necessário (Selenium), API própria (FastAPI)</w:t>
+              <w:t xml:space="preserve">App multipáginas, API FastAPI, camada de serviços, Agência Gov e ICMS (CONFAZ), KPI de crescimento, matriz de oportunidade, testes automatizados</w:t>
             </w:r>
           </w:p>
         </w:tc>
@@ -1979,7 +2440,7 @@
                 <w:sz w:val="21"/>
                 <w:szCs w:val="21"/>
               </w:rPr>
-              <w:t xml:space="preserve">Planejado</w:t>
+              <w:t xml:space="preserve">Concluído</w:t>
             </w:r>
           </w:p>
         </w:tc>
@@ -1997,6 +2458,7 @@
               <w:bottom w:val="single" w:sz="4" w:space="0" w:color="000000"/>
               <w:end w:val="single" w:sz="4" w:space="0" w:color="000000"/>
             </w:tcBorders>
+            <w:shd w:fill="FFFFFF" w:val="clear"/>
           </w:tcPr>
           <w:p>
             <w:pPr>
@@ -2025,22 +2487,23 @@
               <w:bottom w:val="single" w:sz="4" w:space="0" w:color="000000"/>
               <w:end w:val="single" w:sz="4" w:space="0" w:color="000000"/>
             </w:tcBorders>
-          </w:tcPr>
-          <w:p>
-            <w:pPr>
-              <w:pStyle w:val="Normal"/>
-              <w:jc w:val="start"/>
-              <w:rPr/>
-            </w:pPr>
-            <w:r>
-              <w:rPr>
-                <w:b w:val="false"/>
-                <w:bCs w:val="false"/>
-                <w:color w:val="000000"/>
-                <w:sz w:val="21"/>
-                <w:szCs w:val="21"/>
-              </w:rPr>
-              <w:t xml:space="preserve">LLM local via HuggingFace/Transformers: resumo e sentimento do corpus de notícias</w:t>
+            <w:shd w:fill="FFFFFF" w:val="clear"/>
+          </w:tcPr>
+          <w:p>
+            <w:pPr>
+              <w:pStyle w:val="Normal"/>
+              <w:jc w:val="start"/>
+              <w:rPr/>
+            </w:pPr>
+            <w:r>
+              <w:rPr>
+                <w:b w:val="false"/>
+                <w:bCs w:val="false"/>
+                <w:color w:val="000000"/>
+                <w:sz w:val="21"/>
+                <w:szCs w:val="21"/>
+              </w:rPr>
+              <w:t xml:space="preserve">LLM local via HuggingFace/Transformers: resumo e sentimento do corpus; rota POST /processar_texto com modelos de resposta e erros HTTP</w:t>
             </w:r>
           </w:p>
         </w:tc>
@@ -2053,6 +2516,7 @@
               <w:bottom w:val="single" w:sz="4" w:space="0" w:color="000000"/>
               <w:end w:val="single" w:sz="4" w:space="0" w:color="000000"/>
             </w:tcBorders>
+            <w:shd w:fill="FFFFFF" w:val="clear"/>
           </w:tcPr>
           <w:p>
             <w:pPr>
@@ -2131,7 +2595,7 @@
                 <w:sz w:val="21"/>
                 <w:szCs w:val="21"/>
               </w:rPr>
-              <w:t xml:space="preserve">Agente inteligente de recomendação + dashboard final consolidado</w:t>
+              <w:t xml:space="preserve">Agente inteligente de recomendação usando a API como ferramenta + dashboard final consolidado</w:t>
             </w:r>
           </w:p>
         </w:tc>
@@ -2166,6 +2630,13 @@
         </w:tc>
       </w:tr>
     </w:tbl>
+    <w:p>
+      <w:pPr>
+        <w:pStyle w:val="Normal"/>
+        <w:spacing w:before="0" w:after="120"/>
+        <w:rPr/>
+      </w:pPr>
+    </w:p>
     <w:p>
       <w:pPr>
         <w:pStyle w:val="Heading1"/>
@@ -2179,7 +2650,553 @@
         <w:rPr>
           <w:color w:val="2E7D32"/>
         </w:rPr>
-        <w:t>8. Principais Decisões e Riscos</w:t>
+        <w:t>8. Dados, IA e Preparação para LLM</w:t>
+      </w:r>
+    </w:p>
+    <w:p>
+      <w:pPr>
+        <w:pStyle w:val="Normal"/>
+        <w:spacing w:lineRule="auto" w:line="300"/>
+        <w:rPr>
+          <w:sz w:val="22"/>
+          <w:szCs w:val="22"/>
+        </w:rPr>
+      </w:pPr>
+      <w:r>
+        <w:rPr>
+          <w:sz w:val="22"/>
+          <w:szCs w:val="22"/>
+        </w:rPr>
+        <w:t xml:space="preserve">O TP3 pede que os dados coletados sejam pensados para as tarefas com modelos de linguagem das próximas etapas. O mapeamento:</w:t>
+      </w:r>
+    </w:p>
+    <w:tbl>
+      <w:tblPr>
+        <w:tblW w:w="9360" w:type="dxa"/>
+        <w:jc w:val="start"/>
+        <w:tblInd w:w="0" w:type="dxa"/>
+        <w:tblLayout w:type="fixed"/>
+        <w:tblCellMar>
+          <w:top w:w="100" w:type="dxa"/>
+          <w:start w:w="120" w:type="dxa"/>
+          <w:bottom w:w="100" w:type="dxa"/>
+          <w:end w:w="120" w:type="dxa"/>
+        </w:tblCellMar>
+      </w:tblPr>
+      <w:tblGrid>
+        <w:gridCol w:w="2400"/>
+        <w:gridCol w:w="3480"/>
+        <w:gridCol w:w="3480"/>
+      </w:tblGrid>
+      <w:tr>
+        <w:trPr>
+          <w:tblHeader w:val="true"/>
+          <w:cantSplit w:val="true"/>
+        </w:trPr>
+        <w:tc>
+          <w:tcPr>
+            <w:tcW w:w="2400" w:type="dxa"/>
+            <w:tcBorders>
+              <w:top w:val="single" w:sz="4" w:space="0" w:color="000000"/>
+              <w:start w:val="single" w:sz="4" w:space="0" w:color="000000"/>
+              <w:bottom w:val="single" w:sz="4" w:space="0" w:color="000000"/>
+              <w:end w:val="single" w:sz="4" w:space="0" w:color="000000"/>
+            </w:tcBorders>
+            <w:shd w:fill="2E7D32" w:val="clear"/>
+          </w:tcPr>
+          <w:p>
+            <w:pPr>
+              <w:pStyle w:val="Normal"/>
+              <w:jc w:val="start"/>
+              <w:rPr/>
+            </w:pPr>
+            <w:r>
+              <w:rPr>
+                <w:b/>
+                <w:bCs/>
+                <w:color w:val="FFFFFF"/>
+                <w:sz w:val="21"/>
+                <w:szCs w:val="21"/>
+              </w:rPr>
+              <w:t xml:space="preserve">Tarefa de LLM</w:t>
+            </w:r>
+          </w:p>
+        </w:tc>
+        <w:tc>
+          <w:tcPr>
+            <w:tcW w:w="3480" w:type="dxa"/>
+            <w:tcBorders>
+              <w:top w:val="single" w:sz="4" w:space="0" w:color="000000"/>
+              <w:start w:val="single" w:sz="4" w:space="0" w:color="000000"/>
+              <w:bottom w:val="single" w:sz="4" w:space="0" w:color="000000"/>
+              <w:end w:val="single" w:sz="4" w:space="0" w:color="000000"/>
+            </w:tcBorders>
+            <w:shd w:fill="2E7D32" w:val="clear"/>
+          </w:tcPr>
+          <w:p>
+            <w:pPr>
+              <w:pStyle w:val="Normal"/>
+              <w:jc w:val="start"/>
+              <w:rPr/>
+            </w:pPr>
+            <w:r>
+              <w:rPr>
+                <w:b/>
+                <w:bCs/>
+                <w:color w:val="FFFFFF"/>
+                <w:sz w:val="21"/>
+                <w:szCs w:val="21"/>
+              </w:rPr>
+              <w:t xml:space="preserve">Dados disponíveis</w:t>
+            </w:r>
+          </w:p>
+        </w:tc>
+        <w:tc>
+          <w:tcPr>
+            <w:tcW w:w="3480" w:type="dxa"/>
+            <w:tcBorders>
+              <w:top w:val="single" w:sz="4" w:space="0" w:color="000000"/>
+              <w:start w:val="single" w:sz="4" w:space="0" w:color="000000"/>
+              <w:bottom w:val="single" w:sz="4" w:space="0" w:color="000000"/>
+              <w:end w:val="single" w:sz="4" w:space="0" w:color="000000"/>
+            </w:tcBorders>
+            <w:shd w:fill="2E7D32" w:val="clear"/>
+          </w:tcPr>
+          <w:p>
+            <w:pPr>
+              <w:pStyle w:val="Normal"/>
+              <w:jc w:val="start"/>
+              <w:rPr/>
+            </w:pPr>
+            <w:r>
+              <w:rPr>
+                <w:b/>
+                <w:bCs/>
+                <w:color w:val="FFFFFF"/>
+                <w:sz w:val="21"/>
+                <w:szCs w:val="21"/>
+              </w:rPr>
+              <w:t xml:space="preserve">Aplicação no SolarGap</w:t>
+            </w:r>
+          </w:p>
+        </w:tc>
+      </w:tr>
+      <w:tr>
+        <w:trPr>
+          <w:cantSplit w:val="true"/>
+        </w:trPr>
+        <w:tc>
+          <w:tcPr>
+            <w:tcW w:w="2400" w:type="dxa"/>
+            <w:tcBorders>
+              <w:top w:val="single" w:sz="4" w:space="0" w:color="000000"/>
+              <w:start w:val="single" w:sz="4" w:space="0" w:color="000000"/>
+              <w:bottom w:val="single" w:sz="4" w:space="0" w:color="000000"/>
+              <w:end w:val="single" w:sz="4" w:space="0" w:color="000000"/>
+            </w:tcBorders>
+            <w:shd w:fill="F2F2F2" w:val="clear"/>
+          </w:tcPr>
+          <w:p>
+            <w:pPr>
+              <w:pStyle w:val="Normal"/>
+              <w:jc w:val="start"/>
+              <w:rPr/>
+            </w:pPr>
+            <w:r>
+              <w:rPr>
+                <w:b w:val="false"/>
+                <w:bCs w:val="false"/>
+                <w:color w:val="000000"/>
+                <w:sz w:val="21"/>
+                <w:szCs w:val="21"/>
+              </w:rPr>
+              <w:t xml:space="preserve">Classificação de sentimentos</w:t>
+            </w:r>
+          </w:p>
+        </w:tc>
+        <w:tc>
+          <w:tcPr>
+            <w:tcW w:w="3480" w:type="dxa"/>
+            <w:tcBorders>
+              <w:top w:val="single" w:sz="4" w:space="0" w:color="000000"/>
+              <w:start w:val="single" w:sz="4" w:space="0" w:color="000000"/>
+              <w:bottom w:val="single" w:sz="4" w:space="0" w:color="000000"/>
+              <w:end w:val="single" w:sz="4" w:space="0" w:color="000000"/>
+            </w:tcBorders>
+            <w:shd w:fill="F2F2F2" w:val="clear"/>
+          </w:tcPr>
+          <w:p>
+            <w:pPr>
+              <w:pStyle w:val="Normal"/>
+              <w:jc w:val="start"/>
+              <w:rPr/>
+            </w:pPr>
+            <w:r>
+              <w:rPr>
+                <w:b w:val="false"/>
+                <w:bCs w:val="false"/>
+                <w:color w:val="000000"/>
+                <w:sz w:val="21"/>
+                <w:szCs w:val="21"/>
+              </w:rPr>
+              <w:t xml:space="preserve">Corpus multifonte (títulos, linhas finas e textos)</w:t>
+            </w:r>
+          </w:p>
+        </w:tc>
+        <w:tc>
+          <w:tcPr>
+            <w:tcW w:w="3480" w:type="dxa"/>
+            <w:tcBorders>
+              <w:top w:val="single" w:sz="4" w:space="0" w:color="000000"/>
+              <w:start w:val="single" w:sz="4" w:space="0" w:color="000000"/>
+              <w:bottom w:val="single" w:sz="4" w:space="0" w:color="000000"/>
+              <w:end w:val="single" w:sz="4" w:space="0" w:color="000000"/>
+            </w:tcBorders>
+            <w:shd w:fill="F2F2F2" w:val="clear"/>
+          </w:tcPr>
+          <w:p>
+            <w:pPr>
+              <w:pStyle w:val="Normal"/>
+              <w:jc w:val="start"/>
+              <w:rPr/>
+            </w:pPr>
+            <w:r>
+              <w:rPr>
+                <w:b w:val="false"/>
+                <w:bCs w:val="false"/>
+                <w:color w:val="000000"/>
+                <w:sz w:val="21"/>
+                <w:szCs w:val="21"/>
+              </w:rPr>
+              <w:t xml:space="preserve">Tom das notícias sobre geração distribuída por estado, comparado à adoção</w:t>
+            </w:r>
+          </w:p>
+        </w:tc>
+      </w:tr>
+      <w:tr>
+        <w:trPr>
+          <w:cantSplit w:val="true"/>
+        </w:trPr>
+        <w:tc>
+          <w:tcPr>
+            <w:tcW w:w="2400" w:type="dxa"/>
+            <w:tcBorders>
+              <w:top w:val="single" w:sz="4" w:space="0" w:color="000000"/>
+              <w:start w:val="single" w:sz="4" w:space="0" w:color="000000"/>
+              <w:bottom w:val="single" w:sz="4" w:space="0" w:color="000000"/>
+              <w:end w:val="single" w:sz="4" w:space="0" w:color="000000"/>
+            </w:tcBorders>
+            <w:shd w:fill="FFFFFF" w:val="clear"/>
+          </w:tcPr>
+          <w:p>
+            <w:pPr>
+              <w:pStyle w:val="Normal"/>
+              <w:jc w:val="start"/>
+              <w:rPr/>
+            </w:pPr>
+            <w:r>
+              <w:rPr>
+                <w:b w:val="false"/>
+                <w:bCs w:val="false"/>
+                <w:color w:val="000000"/>
+                <w:sz w:val="21"/>
+                <w:szCs w:val="21"/>
+              </w:rPr>
+              <w:t xml:space="preserve">Resumo de textos</w:t>
+            </w:r>
+          </w:p>
+        </w:tc>
+        <w:tc>
+          <w:tcPr>
+            <w:tcW w:w="3480" w:type="dxa"/>
+            <w:tcBorders>
+              <w:top w:val="single" w:sz="4" w:space="0" w:color="000000"/>
+              <w:start w:val="single" w:sz="4" w:space="0" w:color="000000"/>
+              <w:bottom w:val="single" w:sz="4" w:space="0" w:color="000000"/>
+              <w:end w:val="single" w:sz="4" w:space="0" w:color="000000"/>
+            </w:tcBorders>
+            <w:shd w:fill="FFFFFF" w:val="clear"/>
+          </w:tcPr>
+          <w:p>
+            <w:pPr>
+              <w:pStyle w:val="Normal"/>
+              <w:jc w:val="start"/>
+              <w:rPr/>
+            </w:pPr>
+            <w:r>
+              <w:rPr>
+                <w:b w:val="false"/>
+                <w:bCs w:val="false"/>
+                <w:color w:val="000000"/>
+                <w:sz w:val="21"/>
+                <w:szCs w:val="21"/>
+              </w:rPr>
+              <w:t xml:space="preserve">Textos integrais da Agência Brasil e da Agência Gov</w:t>
+            </w:r>
+          </w:p>
+        </w:tc>
+        <w:tc>
+          <w:tcPr>
+            <w:tcW w:w="3480" w:type="dxa"/>
+            <w:tcBorders>
+              <w:top w:val="single" w:sz="4" w:space="0" w:color="000000"/>
+              <w:start w:val="single" w:sz="4" w:space="0" w:color="000000"/>
+              <w:bottom w:val="single" w:sz="4" w:space="0" w:color="000000"/>
+              <w:end w:val="single" w:sz="4" w:space="0" w:color="000000"/>
+            </w:tcBorders>
+            <w:shd w:fill="FFFFFF" w:val="clear"/>
+          </w:tcPr>
+          <w:p>
+            <w:pPr>
+              <w:pStyle w:val="Normal"/>
+              <w:jc w:val="start"/>
+              <w:rPr/>
+            </w:pPr>
+            <w:r>
+              <w:rPr>
+                <w:b w:val="false"/>
+                <w:bCs w:val="false"/>
+                <w:color w:val="000000"/>
+                <w:sz w:val="21"/>
+                <w:szCs w:val="21"/>
+              </w:rPr>
+              <w:t xml:space="preserve">Resumo de cada notícia na página Notícias</w:t>
+            </w:r>
+          </w:p>
+        </w:tc>
+      </w:tr>
+      <w:tr>
+        <w:trPr>
+          <w:cantSplit w:val="true"/>
+        </w:trPr>
+        <w:tc>
+          <w:tcPr>
+            <w:tcW w:w="2400" w:type="dxa"/>
+            <w:tcBorders>
+              <w:top w:val="single" w:sz="4" w:space="0" w:color="000000"/>
+              <w:start w:val="single" w:sz="4" w:space="0" w:color="000000"/>
+              <w:bottom w:val="single" w:sz="4" w:space="0" w:color="000000"/>
+              <w:end w:val="single" w:sz="4" w:space="0" w:color="000000"/>
+            </w:tcBorders>
+            <w:shd w:fill="F2F2F2" w:val="clear"/>
+          </w:tcPr>
+          <w:p>
+            <w:pPr>
+              <w:pStyle w:val="Normal"/>
+              <w:jc w:val="start"/>
+              <w:rPr/>
+            </w:pPr>
+            <w:r>
+              <w:rPr>
+                <w:b w:val="false"/>
+                <w:bCs w:val="false"/>
+                <w:color w:val="000000"/>
+                <w:sz w:val="21"/>
+                <w:szCs w:val="21"/>
+              </w:rPr>
+              <w:t xml:space="preserve">Perguntas e respostas</w:t>
+            </w:r>
+          </w:p>
+        </w:tc>
+        <w:tc>
+          <w:tcPr>
+            <w:tcW w:w="3480" w:type="dxa"/>
+            <w:tcBorders>
+              <w:top w:val="single" w:sz="4" w:space="0" w:color="000000"/>
+              <w:start w:val="single" w:sz="4" w:space="0" w:color="000000"/>
+              <w:bottom w:val="single" w:sz="4" w:space="0" w:color="000000"/>
+              <w:end w:val="single" w:sz="4" w:space="0" w:color="000000"/>
+            </w:tcBorders>
+            <w:shd w:fill="F2F2F2" w:val="clear"/>
+          </w:tcPr>
+          <w:p>
+            <w:pPr>
+              <w:pStyle w:val="Normal"/>
+              <w:jc w:val="start"/>
+              <w:rPr/>
+            </w:pPr>
+            <w:r>
+              <w:rPr>
+                <w:b w:val="false"/>
+                <w:bCs w:val="false"/>
+                <w:color w:val="000000"/>
+                <w:sz w:val="21"/>
+                <w:szCs w:val="21"/>
+              </w:rPr>
+              <w:t xml:space="preserve">Gold, corpus e ICMS, expostos pela API</w:t>
+            </w:r>
+          </w:p>
+        </w:tc>
+        <w:tc>
+          <w:tcPr>
+            <w:tcW w:w="3480" w:type="dxa"/>
+            <w:tcBorders>
+              <w:top w:val="single" w:sz="4" w:space="0" w:color="000000"/>
+              <w:start w:val="single" w:sz="4" w:space="0" w:color="000000"/>
+              <w:bottom w:val="single" w:sz="4" w:space="0" w:color="000000"/>
+              <w:end w:val="single" w:sz="4" w:space="0" w:color="000000"/>
+            </w:tcBorders>
+            <w:shd w:fill="F2F2F2" w:val="clear"/>
+          </w:tcPr>
+          <w:p>
+            <w:pPr>
+              <w:pStyle w:val="Normal"/>
+              <w:jc w:val="start"/>
+              <w:rPr/>
+            </w:pPr>
+            <w:r>
+              <w:rPr>
+                <w:b w:val="false"/>
+                <w:bCs w:val="false"/>
+                <w:color w:val="000000"/>
+                <w:sz w:val="21"/>
+                <w:szCs w:val="21"/>
+              </w:rPr>
+              <w:t xml:space="preserve">Base do agente do TP5, ex.: "por que o RJ é lacuna persistente?"</w:t>
+            </w:r>
+          </w:p>
+        </w:tc>
+      </w:tr>
+      <w:tr>
+        <w:trPr>
+          <w:cantSplit w:val="true"/>
+        </w:trPr>
+        <w:tc>
+          <w:tcPr>
+            <w:tcW w:w="2400" w:type="dxa"/>
+            <w:tcBorders>
+              <w:top w:val="single" w:sz="4" w:space="0" w:color="000000"/>
+              <w:start w:val="single" w:sz="4" w:space="0" w:color="000000"/>
+              <w:bottom w:val="single" w:sz="4" w:space="0" w:color="000000"/>
+              <w:end w:val="single" w:sz="4" w:space="0" w:color="000000"/>
+            </w:tcBorders>
+            <w:shd w:fill="FFFFFF" w:val="clear"/>
+          </w:tcPr>
+          <w:p>
+            <w:pPr>
+              <w:pStyle w:val="Normal"/>
+              <w:jc w:val="start"/>
+              <w:rPr/>
+            </w:pPr>
+            <w:r>
+              <w:rPr>
+                <w:b w:val="false"/>
+                <w:bCs w:val="false"/>
+                <w:color w:val="000000"/>
+                <w:sz w:val="21"/>
+                <w:szCs w:val="21"/>
+              </w:rPr>
+              <w:t xml:space="preserve">Geração de texto</w:t>
+            </w:r>
+          </w:p>
+        </w:tc>
+        <w:tc>
+          <w:tcPr>
+            <w:tcW w:w="3480" w:type="dxa"/>
+            <w:tcBorders>
+              <w:top w:val="single" w:sz="4" w:space="0" w:color="000000"/>
+              <w:start w:val="single" w:sz="4" w:space="0" w:color="000000"/>
+              <w:bottom w:val="single" w:sz="4" w:space="0" w:color="000000"/>
+              <w:end w:val="single" w:sz="4" w:space="0" w:color="000000"/>
+            </w:tcBorders>
+            <w:shd w:fill="FFFFFF" w:val="clear"/>
+          </w:tcPr>
+          <w:p>
+            <w:pPr>
+              <w:pStyle w:val="Normal"/>
+              <w:jc w:val="start"/>
+              <w:rPr/>
+            </w:pPr>
+            <w:r>
+              <w:rPr>
+                <w:b w:val="false"/>
+                <w:bCs w:val="false"/>
+                <w:color w:val="000000"/>
+                <w:sz w:val="21"/>
+                <w:szCs w:val="21"/>
+              </w:rPr>
+              <w:t xml:space="preserve">Ficha da UF (rota /ufs/{sigla})</w:t>
+            </w:r>
+          </w:p>
+        </w:tc>
+        <w:tc>
+          <w:tcPr>
+            <w:tcW w:w="3480" w:type="dxa"/>
+            <w:tcBorders>
+              <w:top w:val="single" w:sz="4" w:space="0" w:color="000000"/>
+              <w:start w:val="single" w:sz="4" w:space="0" w:color="000000"/>
+              <w:bottom w:val="single" w:sz="4" w:space="0" w:color="000000"/>
+              <w:end w:val="single" w:sz="4" w:space="0" w:color="000000"/>
+            </w:tcBorders>
+            <w:shd w:fill="FFFFFF" w:val="clear"/>
+          </w:tcPr>
+          <w:p>
+            <w:pPr>
+              <w:pStyle w:val="Normal"/>
+              <w:jc w:val="start"/>
+              <w:rPr/>
+            </w:pPr>
+            <w:r>
+              <w:rPr>
+                <w:b w:val="false"/>
+                <w:bCs w:val="false"/>
+                <w:color w:val="000000"/>
+                <w:sz w:val="21"/>
+                <w:szCs w:val="21"/>
+              </w:rPr>
+              <w:t xml:space="preserve">Relatório descritivo automático por estado</w:t>
+            </w:r>
+          </w:p>
+        </w:tc>
+      </w:tr>
+    </w:tbl>
+    <w:p>
+      <w:pPr>
+        <w:pStyle w:val="Normal"/>
+        <w:spacing w:before="0" w:after="120"/>
+        <w:rPr/>
+      </w:pPr>
+    </w:p>
+    <w:p>
+      <w:pPr>
+        <w:pStyle w:val="Normal"/>
+        <w:spacing w:lineRule="auto" w:line="300"/>
+        <w:rPr>
+          <w:sz w:val="22"/>
+          <w:szCs w:val="22"/>
+        </w:rPr>
+      </w:pPr>
+      <w:r>
+        <w:rPr>
+          <w:b/>
+          <w:bCs/>
+          <w:sz w:val="22"/>
+          <w:szCs w:val="22"/>
+        </w:rPr>
+        <w:t xml:space="preserve">O que já está pronto. </w:t>
+      </w:r>
+      <w:r>
+        <w:rPr>
+          <w:sz w:val="22"/>
+          <w:szCs w:val="22"/>
+        </w:rPr>
+        <w:t xml:space="preserve">As colunas resumo e sentimento já existem no esquema do corpus, e uma nova coleta nunca apaga o que o modelo preencher. A entrada do modelo (texto_para_modelo) já é montada respeitando a licença de cada fonte e um limite de tamanho compatível com modelos locais. A API já segue o padrão de modelos de resposta e erros HTTP que o TP4 exige.</w:t>
+      </w:r>
+    </w:p>
+    <w:p>
+      <w:pPr>
+        <w:pStyle w:val="Heading1"/>
+        <w:pBdr>
+          <w:bottom w:val="single" w:sz="6" w:space="4" w:color="2E7D32"/>
+        </w:pBdr>
+        <w:spacing w:before="320" w:after="160"/>
+        <w:rPr/>
+      </w:pPr>
+      <w:r>
+        <w:rPr>
+          <w:color w:val="2E7D32"/>
+        </w:rPr>
+        <w:t>9. Principais Decisões e Riscos</w:t>
       </w:r>
     </w:p>
     <w:tbl>
@@ -2380,7 +3397,7 @@
                 <w:sz w:val="21"/>
                 <w:szCs w:val="21"/>
               </w:rPr>
-              <w:t xml:space="preserve">Imputados como solares, com marcação. O dashboard alterna entre a visão corrigida e o critério ANEEL (Data Summary Report, seções 3.4 e 3.6).</w:t>
+              <w:t xml:space="preserve">Imputados como solares, com marcação. Muda a classificação do MA: líder em expansão na visão corrigida, lacuna persistente no critério ANEEL. Painel e API oferecem as duas visões.</w:t>
             </w:r>
           </w:p>
         </w:tc>
@@ -2398,6 +3415,7 @@
               <w:bottom w:val="single" w:sz="4" w:space="0" w:color="000000"/>
               <w:end w:val="single" w:sz="4" w:space="0" w:color="000000"/>
             </w:tcBorders>
+            <w:shd w:fill="FFFFFF" w:val="clear"/>
           </w:tcPr>
           <w:p>
             <w:pPr>
@@ -2426,6 +3444,7 @@
               <w:bottom w:val="single" w:sz="4" w:space="0" w:color="000000"/>
               <w:end w:val="single" w:sz="4" w:space="0" w:color="000000"/>
             </w:tcBorders>
+            <w:shd w:fill="FFFFFF" w:val="clear"/>
           </w:tcPr>
           <w:p>
             <w:pPr>
@@ -2454,6 +3473,7 @@
               <w:bottom w:val="single" w:sz="4" w:space="0" w:color="000000"/>
               <w:end w:val="single" w:sz="4" w:space="0" w:color="000000"/>
             </w:tcBorders>
+            <w:shd w:fill="FFFFFF" w:val="clear"/>
           </w:tcPr>
           <w:p>
             <w:pPr>
@@ -2503,7 +3523,7 @@
                 <w:sz w:val="21"/>
                 <w:szCs w:val="21"/>
               </w:rPr>
-              <w:t xml:space="preserve">Bloqueio geográfico do portal da ANEEL</w:t>
+              <w:t xml:space="preserve">Mesmo cálculo no painel e na API</w:t>
             </w:r>
           </w:p>
         </w:tc>
@@ -2532,7 +3552,7 @@
                 <w:sz w:val="21"/>
                 <w:szCs w:val="21"/>
               </w:rPr>
-              <w:t xml:space="preserve">Risco</w:t>
+              <w:t xml:space="preserve">Decisão</w:t>
             </w:r>
           </w:p>
         </w:tc>
@@ -2561,7 +3581,7 @@
                 <w:sz w:val="21"/>
                 <w:szCs w:val="21"/>
               </w:rPr>
-              <w:t xml:space="preserve">Camada Gold versionada: o dashboard roda sem a base completa.</w:t>
+              <w:t xml:space="preserve">Camada de serviços única; testes garantem que os indicadores reproduzem a camada Gold.</w:t>
             </w:r>
           </w:p>
         </w:tc>
@@ -2579,22 +3599,23 @@
               <w:bottom w:val="single" w:sz="4" w:space="0" w:color="000000"/>
               <w:end w:val="single" w:sz="4" w:space="0" w:color="000000"/>
             </w:tcBorders>
-          </w:tcPr>
-          <w:p>
-            <w:pPr>
-              <w:pStyle w:val="Normal"/>
-              <w:jc w:val="start"/>
-              <w:rPr/>
-            </w:pPr>
-            <w:r>
-              <w:rPr>
-                <w:b w:val="false"/>
-                <w:bCs w:val="false"/>
-                <w:color w:val="000000"/>
-                <w:sz w:val="21"/>
-                <w:szCs w:val="21"/>
-              </w:rPr>
-              <w:t xml:space="preserve">Dependência de site externo no web scraping</w:t>
+            <w:shd w:fill="FFFFFF" w:val="clear"/>
+          </w:tcPr>
+          <w:p>
+            <w:pPr>
+              <w:pStyle w:val="Normal"/>
+              <w:jc w:val="start"/>
+              <w:rPr/>
+            </w:pPr>
+            <w:r>
+              <w:rPr>
+                <w:b w:val="false"/>
+                <w:bCs w:val="false"/>
+                <w:color w:val="000000"/>
+                <w:sz w:val="21"/>
+                <w:szCs w:val="21"/>
+              </w:rPr>
+              <w:t xml:space="preserve">Termos de uso de veículos privados</w:t>
             </w:r>
           </w:p>
         </w:tc>
@@ -2607,22 +3628,23 @@
               <w:bottom w:val="single" w:sz="4" w:space="0" w:color="000000"/>
               <w:end w:val="single" w:sz="4" w:space="0" w:color="000000"/>
             </w:tcBorders>
-          </w:tcPr>
-          <w:p>
-            <w:pPr>
-              <w:pStyle w:val="Normal"/>
-              <w:jc w:val="start"/>
-              <w:rPr/>
-            </w:pPr>
-            <w:r>
-              <w:rPr>
-                <w:b w:val="false"/>
-                <w:bCs w:val="false"/>
-                <w:color w:val="000000"/>
-                <w:sz w:val="21"/>
-                <w:szCs w:val="21"/>
-              </w:rPr>
-              <w:t xml:space="preserve">Risco</w:t>
+            <w:shd w:fill="FFFFFF" w:val="clear"/>
+          </w:tcPr>
+          <w:p>
+            <w:pPr>
+              <w:pStyle w:val="Normal"/>
+              <w:jc w:val="start"/>
+              <w:rPr/>
+            </w:pPr>
+            <w:r>
+              <w:rPr>
+                <w:b w:val="false"/>
+                <w:bCs w:val="false"/>
+                <w:color w:val="000000"/>
+                <w:sz w:val="21"/>
+                <w:szCs w:val="21"/>
+              </w:rPr>
+              <w:t xml:space="preserve">Governança</w:t>
             </w:r>
           </w:p>
         </w:tc>
@@ -2635,22 +3657,23 @@
               <w:bottom w:val="single" w:sz="4" w:space="0" w:color="000000"/>
               <w:end w:val="single" w:sz="4" w:space="0" w:color="000000"/>
             </w:tcBorders>
-          </w:tcPr>
-          <w:p>
-            <w:pPr>
-              <w:pStyle w:val="Normal"/>
-              <w:jc w:val="start"/>
-              <w:rPr/>
-            </w:pPr>
-            <w:r>
-              <w:rPr>
-                <w:b w:val="false"/>
-                <w:bCs w:val="false"/>
-                <w:color w:val="000000"/>
-                <w:sz w:val="21"/>
-                <w:szCs w:val="21"/>
-              </w:rPr>
-              <w:t xml:space="preserve">HTML salvo em cache local e extração independente das classes CSS do site.</w:t>
+            <w:shd w:fill="FFFFFF" w:val="clear"/>
+          </w:tcPr>
+          <w:p>
+            <w:pPr>
+              <w:pStyle w:val="Normal"/>
+              <w:jc w:val="start"/>
+              <w:rPr/>
+            </w:pPr>
+            <w:r>
+              <w:rPr>
+                <w:b w:val="false"/>
+                <w:bCs w:val="false"/>
+                <w:color w:val="000000"/>
+                <w:sz w:val="21"/>
+                <w:szCs w:val="21"/>
+              </w:rPr>
+              <w:t xml:space="preserve">Fontes sem autorização de reprodução ficam fora do corpus; nível "metadados" só mediante autorização.</w:t>
             </w:r>
           </w:p>
         </w:tc>
@@ -2684,6 +3707,282 @@
                 <w:sz w:val="21"/>
                 <w:szCs w:val="21"/>
               </w:rPr>
+              <w:t xml:space="preserve">robots.txt do CONFAZ bloqueia acesso automatizado</w:t>
+            </w:r>
+          </w:p>
+        </w:tc>
+        <w:tc>
+          <w:tcPr>
+            <w:tcW w:w="1400" w:type="dxa"/>
+            <w:tcBorders>
+              <w:top w:val="single" w:sz="4" w:space="0" w:color="000000"/>
+              <w:start w:val="single" w:sz="4" w:space="0" w:color="000000"/>
+              <w:bottom w:val="single" w:sz="4" w:space="0" w:color="000000"/>
+              <w:end w:val="single" w:sz="4" w:space="0" w:color="000000"/>
+            </w:tcBorders>
+            <w:shd w:fill="F2F2F2" w:val="clear"/>
+          </w:tcPr>
+          <w:p>
+            <w:pPr>
+              <w:pStyle w:val="Normal"/>
+              <w:jc w:val="start"/>
+              <w:rPr/>
+            </w:pPr>
+            <w:r>
+              <w:rPr>
+                <w:b w:val="false"/>
+                <w:bCs w:val="false"/>
+                <w:color w:val="000000"/>
+                <w:sz w:val="21"/>
+                <w:szCs w:val="21"/>
+              </w:rPr>
+              <w:t xml:space="preserve">Risco</w:t>
+            </w:r>
+          </w:p>
+        </w:tc>
+        <w:tc>
+          <w:tcPr>
+            <w:tcW w:w="5160" w:type="dxa"/>
+            <w:tcBorders>
+              <w:top w:val="single" w:sz="4" w:space="0" w:color="000000"/>
+              <w:start w:val="single" w:sz="4" w:space="0" w:color="000000"/>
+              <w:bottom w:val="single" w:sz="4" w:space="0" w:color="000000"/>
+              <w:end w:val="single" w:sz="4" w:space="0" w:color="000000"/>
+            </w:tcBorders>
+            <w:shd w:fill="F2F2F2" w:val="clear"/>
+          </w:tcPr>
+          <w:p>
+            <w:pPr>
+              <w:pStyle w:val="Normal"/>
+              <w:jc w:val="start"/>
+              <w:rPr/>
+            </w:pPr>
+            <w:r>
+              <w:rPr>
+                <w:b w:val="false"/>
+                <w:bCs w:val="false"/>
+                <w:color w:val="000000"/>
+                <w:sz w:val="21"/>
+                <w:szCs w:val="21"/>
+              </w:rPr>
+              <w:t xml:space="preserve">Coletor respeita a regra e usa cópia de referência do texto oficial, com a origem registrada em cada linha.</w:t>
+            </w:r>
+          </w:p>
+        </w:tc>
+      </w:tr>
+      <w:tr>
+        <w:trPr>
+          <w:cantSplit w:val="true"/>
+        </w:trPr>
+        <w:tc>
+          <w:tcPr>
+            <w:tcW w:w="2800" w:type="dxa"/>
+            <w:tcBorders>
+              <w:top w:val="single" w:sz="4" w:space="0" w:color="000000"/>
+              <w:start w:val="single" w:sz="4" w:space="0" w:color="000000"/>
+              <w:bottom w:val="single" w:sz="4" w:space="0" w:color="000000"/>
+              <w:end w:val="single" w:sz="4" w:space="0" w:color="000000"/>
+            </w:tcBorders>
+            <w:shd w:fill="FFFFFF" w:val="clear"/>
+          </w:tcPr>
+          <w:p>
+            <w:pPr>
+              <w:pStyle w:val="Normal"/>
+              <w:jc w:val="start"/>
+              <w:rPr/>
+            </w:pPr>
+            <w:r>
+              <w:rPr>
+                <w:b w:val="false"/>
+                <w:bCs w:val="false"/>
+                <w:color w:val="000000"/>
+                <w:sz w:val="21"/>
+                <w:szCs w:val="21"/>
+              </w:rPr>
+              <w:t xml:space="preserve">Inclusão inferida de PB, PI, RO e SE no Convênio 16/15</w:t>
+            </w:r>
+          </w:p>
+        </w:tc>
+        <w:tc>
+          <w:tcPr>
+            <w:tcW w:w="1400" w:type="dxa"/>
+            <w:tcBorders>
+              <w:top w:val="single" w:sz="4" w:space="0" w:color="000000"/>
+              <w:start w:val="single" w:sz="4" w:space="0" w:color="000000"/>
+              <w:bottom w:val="single" w:sz="4" w:space="0" w:color="000000"/>
+              <w:end w:val="single" w:sz="4" w:space="0" w:color="000000"/>
+            </w:tcBorders>
+            <w:shd w:fill="FFFFFF" w:val="clear"/>
+          </w:tcPr>
+          <w:p>
+            <w:pPr>
+              <w:pStyle w:val="Normal"/>
+              <w:jc w:val="start"/>
+              <w:rPr/>
+            </w:pPr>
+            <w:r>
+              <w:rPr>
+                <w:b w:val="false"/>
+                <w:bCs w:val="false"/>
+                <w:color w:val="000000"/>
+                <w:sz w:val="21"/>
+                <w:szCs w:val="21"/>
+              </w:rPr>
+              <w:t xml:space="preserve">Risco</w:t>
+            </w:r>
+          </w:p>
+        </w:tc>
+        <w:tc>
+          <w:tcPr>
+            <w:tcW w:w="5160" w:type="dxa"/>
+            <w:tcBorders>
+              <w:top w:val="single" w:sz="4" w:space="0" w:color="000000"/>
+              <w:start w:val="single" w:sz="4" w:space="0" w:color="000000"/>
+              <w:bottom w:val="single" w:sz="4" w:space="0" w:color="000000"/>
+              <w:end w:val="single" w:sz="4" w:space="0" w:color="000000"/>
+            </w:tcBorders>
+            <w:shd w:fill="FFFFFF" w:val="clear"/>
+          </w:tcPr>
+          <w:p>
+            <w:pPr>
+              <w:pStyle w:val="Normal"/>
+              <w:jc w:val="start"/>
+              <w:rPr/>
+            </w:pPr>
+            <w:r>
+              <w:rPr>
+                <w:b w:val="false"/>
+                <w:bCs w:val="false"/>
+                <w:color w:val="000000"/>
+                <w:sz w:val="21"/>
+                <w:szCs w:val="21"/>
+              </w:rPr>
+              <w:t xml:space="preserve">Sinalizada na tabela; confirmação manual no texto consolidado atual do CONFAZ.</w:t>
+            </w:r>
+          </w:p>
+        </w:tc>
+      </w:tr>
+      <w:tr>
+        <w:trPr>
+          <w:cantSplit w:val="true"/>
+        </w:trPr>
+        <w:tc>
+          <w:tcPr>
+            <w:tcW w:w="2800" w:type="dxa"/>
+            <w:tcBorders>
+              <w:top w:val="single" w:sz="4" w:space="0" w:color="000000"/>
+              <w:start w:val="single" w:sz="4" w:space="0" w:color="000000"/>
+              <w:bottom w:val="single" w:sz="4" w:space="0" w:color="000000"/>
+              <w:end w:val="single" w:sz="4" w:space="0" w:color="000000"/>
+            </w:tcBorders>
+            <w:shd w:fill="F2F2F2" w:val="clear"/>
+          </w:tcPr>
+          <w:p>
+            <w:pPr>
+              <w:pStyle w:val="Normal"/>
+              <w:jc w:val="start"/>
+              <w:rPr/>
+            </w:pPr>
+            <w:r>
+              <w:rPr>
+                <w:b w:val="false"/>
+                <w:bCs w:val="false"/>
+                <w:color w:val="000000"/>
+                <w:sz w:val="21"/>
+                <w:szCs w:val="21"/>
+              </w:rPr>
+              <w:t xml:space="preserve">Bloqueio geográfico do portal da ANEEL</w:t>
+            </w:r>
+          </w:p>
+        </w:tc>
+        <w:tc>
+          <w:tcPr>
+            <w:tcW w:w="1400" w:type="dxa"/>
+            <w:tcBorders>
+              <w:top w:val="single" w:sz="4" w:space="0" w:color="000000"/>
+              <w:start w:val="single" w:sz="4" w:space="0" w:color="000000"/>
+              <w:bottom w:val="single" w:sz="4" w:space="0" w:color="000000"/>
+              <w:end w:val="single" w:sz="4" w:space="0" w:color="000000"/>
+            </w:tcBorders>
+            <w:shd w:fill="F2F2F2" w:val="clear"/>
+          </w:tcPr>
+          <w:p>
+            <w:pPr>
+              <w:pStyle w:val="Normal"/>
+              <w:jc w:val="start"/>
+              <w:rPr/>
+            </w:pPr>
+            <w:r>
+              <w:rPr>
+                <w:b w:val="false"/>
+                <w:bCs w:val="false"/>
+                <w:color w:val="000000"/>
+                <w:sz w:val="21"/>
+                <w:szCs w:val="21"/>
+              </w:rPr>
+              <w:t xml:space="preserve">Risco</w:t>
+            </w:r>
+          </w:p>
+        </w:tc>
+        <w:tc>
+          <w:tcPr>
+            <w:tcW w:w="5160" w:type="dxa"/>
+            <w:tcBorders>
+              <w:top w:val="single" w:sz="4" w:space="0" w:color="000000"/>
+              <w:start w:val="single" w:sz="4" w:space="0" w:color="000000"/>
+              <w:bottom w:val="single" w:sz="4" w:space="0" w:color="000000"/>
+              <w:end w:val="single" w:sz="4" w:space="0" w:color="000000"/>
+            </w:tcBorders>
+            <w:shd w:fill="F2F2F2" w:val="clear"/>
+          </w:tcPr>
+          <w:p>
+            <w:pPr>
+              <w:pStyle w:val="Normal"/>
+              <w:jc w:val="start"/>
+              <w:rPr/>
+            </w:pPr>
+            <w:r>
+              <w:rPr>
+                <w:b w:val="false"/>
+                <w:bCs w:val="false"/>
+                <w:color w:val="000000"/>
+                <w:sz w:val="21"/>
+                <w:szCs w:val="21"/>
+              </w:rPr>
+              <w:t xml:space="preserve">Camada Gold versionada: painel e API rodam sem a base completa.</w:t>
+            </w:r>
+          </w:p>
+        </w:tc>
+      </w:tr>
+      <w:tr>
+        <w:trPr>
+          <w:cantSplit w:val="true"/>
+        </w:trPr>
+        <w:tc>
+          <w:tcPr>
+            <w:tcW w:w="2800" w:type="dxa"/>
+            <w:tcBorders>
+              <w:top w:val="single" w:sz="4" w:space="0" w:color="000000"/>
+              <w:start w:val="single" w:sz="4" w:space="0" w:color="000000"/>
+              <w:bottom w:val="single" w:sz="4" w:space="0" w:color="000000"/>
+              <w:end w:val="single" w:sz="4" w:space="0" w:color="000000"/>
+            </w:tcBorders>
+            <w:shd w:fill="FFFFFF" w:val="clear"/>
+          </w:tcPr>
+          <w:p>
+            <w:pPr>
+              <w:pStyle w:val="Normal"/>
+              <w:jc w:val="start"/>
+              <w:rPr/>
+            </w:pPr>
+            <w:r>
+              <w:rPr>
+                <w:b w:val="false"/>
+                <w:bCs w:val="false"/>
+                <w:color w:val="000000"/>
+                <w:sz w:val="21"/>
+                <w:szCs w:val="21"/>
+              </w:rPr>
               <w:t xml:space="preserve">Dados pessoais na base da ANEEL</w:t>
             </w:r>
           </w:p>
@@ -2697,7 +3996,7 @@
               <w:bottom w:val="single" w:sz="4" w:space="0" w:color="000000"/>
               <w:end w:val="single" w:sz="4" w:space="0" w:color="000000"/>
             </w:tcBorders>
-            <w:shd w:fill="F2F2F2" w:val="clear"/>
+            <w:shd w:fill="FFFFFF" w:val="clear"/>
           </w:tcPr>
           <w:p>
             <w:pPr>
@@ -2726,7 +4025,7 @@
               <w:bottom w:val="single" w:sz="4" w:space="0" w:color="000000"/>
               <w:end w:val="single" w:sz="4" w:space="0" w:color="000000"/>
             </w:tcBorders>
-            <w:shd w:fill="F2F2F2" w:val="clear"/>
+            <w:shd w:fill="FFFFFF" w:val="clear"/>
           </w:tcPr>
           <w:p>
             <w:pPr>
@@ -2748,6 +4047,13 @@
         </w:tc>
       </w:tr>
     </w:tbl>
+    <w:p>
+      <w:pPr>
+        <w:pStyle w:val="Normal"/>
+        <w:spacing w:before="0" w:after="120"/>
+        <w:rPr/>
+      </w:pPr>
+    </w:p>
     <w:p>
       <w:pPr>
         <w:pStyle w:val="Heading1"/>
@@ -2761,23 +4067,24 @@
         <w:rPr>
           <w:color w:val="2E7D32"/>
         </w:rPr>
-        <w:t>9. Fontes de Dados</w:t>
+        <w:t>10. Fontes de Dados</w:t>
       </w:r>
     </w:p>
     <w:p>
       <w:pPr>
         <w:pStyle w:val="Normal"/>
-        <w:spacing w:lineRule="auto" w:line="300" w:before="0" w:after="160"/>
-        <w:rPr/>
-      </w:pPr>
-      <w:r>
-        <w:rPr>
-          <w:i w:val="false"/>
-          <w:iCs w:val="false"/>
-          <w:sz w:val="22"/>
-          <w:szCs w:val="22"/>
-        </w:rPr>
-        <w:t xml:space="preserve">ANEEL — Relação de Empreendimentos de Micro e Minigeração Distribuída; IBGE — Censo Demográfico 2022 (população por UF e por município); Agência Brasil — notícias sobre energia solar e geração distribuída, coletadas por web scraping. O detalhamento de formatos, tratamentos, validações e licenças está no Data Summary Report que acompanha este documento.</w:t>
+        <w:spacing w:lineRule="auto" w:line="300"/>
+        <w:rPr>
+          <w:sz w:val="22"/>
+          <w:szCs w:val="22"/>
+        </w:rPr>
+      </w:pPr>
+      <w:r>
+        <w:rPr>
+          <w:sz w:val="22"/>
+          <w:szCs w:val="22"/>
+        </w:rPr>
+        <w:t xml:space="preserve">ANEEL — Relação de Empreendimentos de Micro e Minigeração Distribuída; IBGE — Censo Demográfico 2022 (população por UF e por município); Agência Brasil e Agência Gov (EBC) — notícias sobre energia solar e geração distribuída, coletadas por web scraping; CONFAZ — Convênio ICMS 16/15, adesão das UFs à isenção de ICMS. O detalhamento de formatos, tratamentos, validações, avaliação de fontes e licenças está no Data Summary Report que acompanha este documento.</w:t>
       </w:r>
     </w:p>
     <w:sectPr>

</xml_diff>